<commit_message>
9.Plan de Recursos (Como se dividirían)
</commit_message>
<xml_diff>
--- a/gestion de proyecto de software.docx
+++ b/gestion de proyecto de software.docx
@@ -53,8 +53,13 @@
         <w:pStyle w:val="Listaconvietas"/>
       </w:pPr>
       <w:r>
-        <w:t>Documento de Inception</w:t>
-      </w:r>
+        <w:t xml:space="preserve">Documento de </w:t>
+      </w:r>
+      <w:proofErr w:type="spellStart"/>
+      <w:r>
+        <w:t>Inception</w:t>
+      </w:r>
+      <w:proofErr w:type="spellEnd"/>
     </w:p>
     <w:p>
       <w:pPr>
@@ -183,9 +188,27 @@
       <w:pPr>
         <w:pStyle w:val="Listaconvietas"/>
       </w:pPr>
-      <w:r>
-        <w:t>Value Stream Mapping</w:t>
-      </w:r>
+      <w:proofErr w:type="spellStart"/>
+      <w:r>
+        <w:t>Value</w:t>
+      </w:r>
+      <w:proofErr w:type="spellEnd"/>
+      <w:r>
+        <w:t xml:space="preserve"> </w:t>
+      </w:r>
+      <w:proofErr w:type="spellStart"/>
+      <w:r>
+        <w:t>Stream</w:t>
+      </w:r>
+      <w:proofErr w:type="spellEnd"/>
+      <w:r>
+        <w:t xml:space="preserve"> </w:t>
+      </w:r>
+      <w:proofErr w:type="spellStart"/>
+      <w:r>
+        <w:t>Mapping</w:t>
+      </w:r>
+      <w:proofErr w:type="spellEnd"/>
     </w:p>
     <w:p>
       <w:pPr>
@@ -554,13 +577,59 @@
           <w:szCs w:val="24"/>
         </w:rPr>
       </w:pPr>
-      <w:r>
-        <w:rPr>
-          <w:rFonts w:ascii="Arial" w:hAnsi="Arial" w:cs="Arial"/>
-          <w:sz w:val="24"/>
-          <w:szCs w:val="24"/>
-        </w:rPr>
-        <w:t>Product Owner (PO): Enlace directo con el negocio y regulaciones de la Alcaldía. Define los requerimientos en forma de Historias de Usuario, mantiene ordenado el Product Backlog y valida la entrega de valor en cada cierre de iteración.</w:t>
+      <w:proofErr w:type="spellStart"/>
+      <w:r>
+        <w:rPr>
+          <w:rFonts w:ascii="Arial" w:hAnsi="Arial" w:cs="Arial"/>
+          <w:sz w:val="24"/>
+          <w:szCs w:val="24"/>
+        </w:rPr>
+        <w:t>Product</w:t>
+      </w:r>
+      <w:proofErr w:type="spellEnd"/>
+      <w:r>
+        <w:rPr>
+          <w:rFonts w:ascii="Arial" w:hAnsi="Arial" w:cs="Arial"/>
+          <w:sz w:val="24"/>
+          <w:szCs w:val="24"/>
+        </w:rPr>
+        <w:t xml:space="preserve"> </w:t>
+      </w:r>
+      <w:proofErr w:type="spellStart"/>
+      <w:r>
+        <w:rPr>
+          <w:rFonts w:ascii="Arial" w:hAnsi="Arial" w:cs="Arial"/>
+          <w:sz w:val="24"/>
+          <w:szCs w:val="24"/>
+        </w:rPr>
+        <w:t>Owner</w:t>
+      </w:r>
+      <w:proofErr w:type="spellEnd"/>
+      <w:r>
+        <w:rPr>
+          <w:rFonts w:ascii="Arial" w:hAnsi="Arial" w:cs="Arial"/>
+          <w:sz w:val="24"/>
+          <w:szCs w:val="24"/>
+        </w:rPr>
+        <w:t xml:space="preserve"> (PO): Enlace directo con el negocio y regulaciones de la Alcaldía. Define los requerimientos en forma de Historias de Usuario, mantiene ordenado el </w:t>
+      </w:r>
+      <w:proofErr w:type="spellStart"/>
+      <w:r>
+        <w:rPr>
+          <w:rFonts w:ascii="Arial" w:hAnsi="Arial" w:cs="Arial"/>
+          <w:sz w:val="24"/>
+          <w:szCs w:val="24"/>
+        </w:rPr>
+        <w:t>Product</w:t>
+      </w:r>
+      <w:proofErr w:type="spellEnd"/>
+      <w:r>
+        <w:rPr>
+          <w:rFonts w:ascii="Arial" w:hAnsi="Arial" w:cs="Arial"/>
+          <w:sz w:val="24"/>
+          <w:szCs w:val="24"/>
+        </w:rPr>
+        <w:t xml:space="preserve"> Backlog y valida la entrega de valor en cada cierre de iteración.</w:t>
       </w:r>
     </w:p>
     <w:p>
@@ -669,7 +738,29 @@
           <w:sz w:val="24"/>
           <w:szCs w:val="24"/>
         </w:rPr>
-        <w:t>El desarrollo del software se dividirá en iteraciones de tiempo fijo (Sprints) de 2 semanas de duración. Las ceremonias clave son:</w:t>
+        <w:t>El desarrollo del software se dividirá en iteraciones de tiempo fijo (</w:t>
+      </w:r>
+      <w:proofErr w:type="spellStart"/>
+      <w:r>
+        <w:rPr>
+          <w:rFonts w:ascii="Arial" w:hAnsi="Arial" w:cs="Arial"/>
+          <w:bCs/>
+          <w:color w:val="000000" w:themeColor="text1"/>
+          <w:sz w:val="24"/>
+          <w:szCs w:val="24"/>
+        </w:rPr>
+        <w:t>Sprints</w:t>
+      </w:r>
+      <w:proofErr w:type="spellEnd"/>
+      <w:r>
+        <w:rPr>
+          <w:rFonts w:ascii="Arial" w:hAnsi="Arial" w:cs="Arial"/>
+          <w:bCs/>
+          <w:color w:val="000000" w:themeColor="text1"/>
+          <w:sz w:val="24"/>
+          <w:szCs w:val="24"/>
+        </w:rPr>
+        <w:t>) de 2 semanas de duración. Las ceremonias clave son:</w:t>
       </w:r>
     </w:p>
     <w:p>
@@ -696,7 +787,43 @@
           <w:sz w:val="24"/>
           <w:szCs w:val="24"/>
         </w:rPr>
-        <w:t>Sprint Planning: Planificación conjunta al inicio de cada sprint para definir qué historias de usuario se implementarán y definir el Sprint Goal.</w:t>
+        <w:t xml:space="preserve">Sprint </w:t>
+      </w:r>
+      <w:proofErr w:type="spellStart"/>
+      <w:r>
+        <w:rPr>
+          <w:rFonts w:ascii="Arial" w:hAnsi="Arial" w:cs="Arial"/>
+          <w:sz w:val="24"/>
+          <w:szCs w:val="24"/>
+        </w:rPr>
+        <w:t>Planning</w:t>
+      </w:r>
+      <w:proofErr w:type="spellEnd"/>
+      <w:r>
+        <w:rPr>
+          <w:rFonts w:ascii="Arial" w:hAnsi="Arial" w:cs="Arial"/>
+          <w:sz w:val="24"/>
+          <w:szCs w:val="24"/>
+        </w:rPr>
+        <w:t xml:space="preserve">: Planificación conjunta al inicio de cada sprint para definir qué historias de usuario se implementarán y definir el Sprint </w:t>
+      </w:r>
+      <w:proofErr w:type="spellStart"/>
+      <w:r>
+        <w:rPr>
+          <w:rFonts w:ascii="Arial" w:hAnsi="Arial" w:cs="Arial"/>
+          <w:sz w:val="24"/>
+          <w:szCs w:val="24"/>
+        </w:rPr>
+        <w:t>Goal</w:t>
+      </w:r>
+      <w:proofErr w:type="spellEnd"/>
+      <w:r>
+        <w:rPr>
+          <w:rFonts w:ascii="Arial" w:hAnsi="Arial" w:cs="Arial"/>
+          <w:sz w:val="24"/>
+          <w:szCs w:val="24"/>
+        </w:rPr>
+        <w:t>.</w:t>
       </w:r>
     </w:p>
     <w:p>
@@ -717,13 +844,23 @@
           <w:szCs w:val="24"/>
         </w:rPr>
       </w:pPr>
-      <w:r>
-        <w:rPr>
-          <w:rFonts w:ascii="Arial" w:hAnsi="Arial" w:cs="Arial"/>
-          <w:sz w:val="24"/>
-          <w:szCs w:val="24"/>
-        </w:rPr>
-        <w:t>Daily Scrum: Reunión diaria de 15 minutos para sincronizar el trabajo del equipo técnico e identificar posibles bloqueos.</w:t>
+      <w:proofErr w:type="spellStart"/>
+      <w:r>
+        <w:rPr>
+          <w:rFonts w:ascii="Arial" w:hAnsi="Arial" w:cs="Arial"/>
+          <w:sz w:val="24"/>
+          <w:szCs w:val="24"/>
+        </w:rPr>
+        <w:t>Daily</w:t>
+      </w:r>
+      <w:proofErr w:type="spellEnd"/>
+      <w:r>
+        <w:rPr>
+          <w:rFonts w:ascii="Arial" w:hAnsi="Arial" w:cs="Arial"/>
+          <w:sz w:val="24"/>
+          <w:szCs w:val="24"/>
+        </w:rPr>
+        <w:t xml:space="preserve"> Scrum: Reunión diaria de 15 minutos para sincronizar el trabajo del equipo técnico e identificar posibles bloqueos.</w:t>
       </w:r>
     </w:p>
     <w:p>
@@ -1069,16 +1206,36 @@
           <w:sz w:val="24"/>
           <w:szCs w:val="24"/>
         </w:rPr>
-        <w:t xml:space="preserve">Se solicita el desarrollo de un sistema web responsivo (accesible desde computadoras y dispositivos móviles) que centralice y digitalice la gestión administrativa de los mercados Campesino, Central </w:t>
-      </w:r>
-      <w:r>
-        <w:rPr>
-          <w:rFonts w:ascii="Arial" w:hAnsi="Arial" w:cs="Arial"/>
-          <w:color w:val="000000" w:themeColor="text1"/>
-          <w:sz w:val="24"/>
-          <w:szCs w:val="24"/>
-        </w:rPr>
-        <w:t xml:space="preserve"> y </w:t>
+        <w:t xml:space="preserve">Se solicita el desarrollo de un sistema web responsivo (accesible desde computadoras y dispositivos móviles) que centralice y digitalice la gestión administrativa de los mercados Campesino, </w:t>
+      </w:r>
+      <w:proofErr w:type="gramStart"/>
+      <w:r>
+        <w:rPr>
+          <w:rFonts w:ascii="Arial" w:hAnsi="Arial" w:cs="Arial"/>
+          <w:color w:val="000000" w:themeColor="text1"/>
+          <w:sz w:val="24"/>
+          <w:szCs w:val="24"/>
+        </w:rPr>
+        <w:t xml:space="preserve">Central </w:t>
+      </w:r>
+      <w:r>
+        <w:rPr>
+          <w:rFonts w:ascii="Arial" w:hAnsi="Arial" w:cs="Arial"/>
+          <w:color w:val="000000" w:themeColor="text1"/>
+          <w:sz w:val="24"/>
+          <w:szCs w:val="24"/>
+        </w:rPr>
+        <w:t xml:space="preserve"> y</w:t>
+      </w:r>
+      <w:proofErr w:type="gramEnd"/>
+      <w:r>
+        <w:rPr>
+          <w:rFonts w:ascii="Arial" w:hAnsi="Arial" w:cs="Arial"/>
+          <w:color w:val="000000" w:themeColor="text1"/>
+          <w:sz w:val="24"/>
+          <w:szCs w:val="24"/>
+        </w:rPr>
+        <w:t xml:space="preserve"> </w:t>
       </w:r>
       <w:r>
         <w:rPr>
@@ -1517,7 +1674,27 @@
           <w:sz w:val="24"/>
           <w:szCs w:val="24"/>
         </w:rPr>
-        <w:t>Integración: Debe operar bajo protocolos web estándar y ser responsivo para que los cobradores del mercado puedan usarlo en tablets o celulares sin instalar aplicaciones pesadas.</w:t>
+        <w:t xml:space="preserve">Integración: Debe operar bajo protocolos web estándar y ser responsivo para que los cobradores del mercado puedan usarlo en </w:t>
+      </w:r>
+      <w:proofErr w:type="spellStart"/>
+      <w:r>
+        <w:rPr>
+          <w:rFonts w:ascii="Arial" w:hAnsi="Arial" w:cs="Arial"/>
+          <w:color w:val="000000" w:themeColor="text1"/>
+          <w:sz w:val="24"/>
+          <w:szCs w:val="24"/>
+        </w:rPr>
+        <w:t>tablets</w:t>
+      </w:r>
+      <w:proofErr w:type="spellEnd"/>
+      <w:r>
+        <w:rPr>
+          <w:rFonts w:ascii="Arial" w:hAnsi="Arial" w:cs="Arial"/>
+          <w:color w:val="000000" w:themeColor="text1"/>
+          <w:sz w:val="24"/>
+          <w:szCs w:val="24"/>
+        </w:rPr>
+        <w:t xml:space="preserve"> o celulares sin instalar aplicaciones pesadas.</w:t>
       </w:r>
     </w:p>
     <w:p>
@@ -2431,7 +2608,29 @@
           <w:sz w:val="24"/>
           <w:szCs w:val="24"/>
         </w:rPr>
-        <w:t>• RNF-1: Usabilidad (Diseño Responsivo): La interfaz de usuario debe ser completamente responsiva, adaptándose fluidamente a dispositivos móviles (tablets y smartphones) utilizados por cobradores de mercado e inspectores sanitarios en campo.</w:t>
+        <w:t>• RNF-1: Usabilidad (Diseño Responsivo): La interfaz de usuario debe ser completamente responsiva, adaptándose fluidamente a dispositivos móviles (</w:t>
+      </w:r>
+      <w:proofErr w:type="spellStart"/>
+      <w:r>
+        <w:rPr>
+          <w:rFonts w:ascii="Arial" w:hAnsi="Arial" w:cs="Arial"/>
+          <w:bCs/>
+          <w:color w:val="000000" w:themeColor="text1"/>
+          <w:sz w:val="24"/>
+          <w:szCs w:val="24"/>
+        </w:rPr>
+        <w:t>tablets</w:t>
+      </w:r>
+      <w:proofErr w:type="spellEnd"/>
+      <w:r>
+        <w:rPr>
+          <w:rFonts w:ascii="Arial" w:hAnsi="Arial" w:cs="Arial"/>
+          <w:bCs/>
+          <w:color w:val="000000" w:themeColor="text1"/>
+          <w:sz w:val="24"/>
+          <w:szCs w:val="24"/>
+        </w:rPr>
+        <w:t xml:space="preserve"> y smartphones) utilizados por cobradores de mercado e inspectores sanitarios en campo.</w:t>
       </w:r>
     </w:p>
     <w:p>
@@ -2455,7 +2654,29 @@
           <w:sz w:val="24"/>
           <w:szCs w:val="24"/>
         </w:rPr>
-        <w:t>• RNF-2: Rendimiento y Latencia: Las búsquedas de comerciantes y registros de cobros deben procesarse en menos de 2.0 segundos bajo conexiones de datos móviles móviles estándar en la ciudad de Sucre.</w:t>
+        <w:t xml:space="preserve">• RNF-2: Rendimiento y Latencia: Las búsquedas de comerciantes y registros de cobros deben procesarse en menos de 2.0 segundos bajo conexiones de datos móviles </w:t>
+      </w:r>
+      <w:proofErr w:type="spellStart"/>
+      <w:r>
+        <w:rPr>
+          <w:rFonts w:ascii="Arial" w:hAnsi="Arial" w:cs="Arial"/>
+          <w:bCs/>
+          <w:color w:val="000000" w:themeColor="text1"/>
+          <w:sz w:val="24"/>
+          <w:szCs w:val="24"/>
+        </w:rPr>
+        <w:t>móviles</w:t>
+      </w:r>
+      <w:proofErr w:type="spellEnd"/>
+      <w:r>
+        <w:rPr>
+          <w:rFonts w:ascii="Arial" w:hAnsi="Arial" w:cs="Arial"/>
+          <w:bCs/>
+          <w:color w:val="000000" w:themeColor="text1"/>
+          <w:sz w:val="24"/>
+          <w:szCs w:val="24"/>
+        </w:rPr>
+        <w:t xml:space="preserve"> estándar en la ciudad de Sucre.</w:t>
       </w:r>
     </w:p>
     <w:p>
@@ -2479,7 +2700,29 @@
           <w:sz w:val="24"/>
           <w:szCs w:val="24"/>
         </w:rPr>
-        <w:t>• RNF-3: Seguridad y Control de Acceso: El sistema utilizará control de acceso basado en roles (RBAC). Los roles son Administrador General, Cobrador Municipal, Inspector Sanitario y Director de Ingresos. Las contraseñas deben estar encriptadas y las sesiones se cerrarán tras 15 minutos de inactividad.</w:t>
+        <w:t xml:space="preserve">• RNF-3: Seguridad y Control de Acceso: El sistema utilizará control de acceso basado en roles (RBAC). Los roles son Administrador General, Cobrador Municipal, Inspector Sanitario y </w:t>
+      </w:r>
+      <w:proofErr w:type="gramStart"/>
+      <w:r>
+        <w:rPr>
+          <w:rFonts w:ascii="Arial" w:hAnsi="Arial" w:cs="Arial"/>
+          <w:bCs/>
+          <w:color w:val="000000" w:themeColor="text1"/>
+          <w:sz w:val="24"/>
+          <w:szCs w:val="24"/>
+        </w:rPr>
+        <w:t>Director</w:t>
+      </w:r>
+      <w:proofErr w:type="gramEnd"/>
+      <w:r>
+        <w:rPr>
+          <w:rFonts w:ascii="Arial" w:hAnsi="Arial" w:cs="Arial"/>
+          <w:bCs/>
+          <w:color w:val="000000" w:themeColor="text1"/>
+          <w:sz w:val="24"/>
+          <w:szCs w:val="24"/>
+        </w:rPr>
+        <w:t xml:space="preserve"> de Ingresos. Las contraseñas deben estar encriptadas y las sesiones se cerrarán tras 15 minutos de inactividad.</w:t>
       </w:r>
     </w:p>
     <w:p>
@@ -2726,7 +2969,27 @@
           <w:sz w:val="24"/>
           <w:szCs w:val="24"/>
         </w:rPr>
-        <w:t>Visión del Proyecto (Elevator Pitch)</w:t>
+        <w:t>Visión del Proyecto (</w:t>
+      </w:r>
+      <w:proofErr w:type="spellStart"/>
+      <w:r>
+        <w:rPr>
+          <w:rFonts w:ascii="Arial" w:hAnsi="Arial" w:cs="Arial"/>
+          <w:color w:val="000000" w:themeColor="text1"/>
+          <w:sz w:val="24"/>
+          <w:szCs w:val="24"/>
+        </w:rPr>
+        <w:t>Elevator</w:t>
+      </w:r>
+      <w:proofErr w:type="spellEnd"/>
+      <w:r>
+        <w:rPr>
+          <w:rFonts w:ascii="Arial" w:hAnsi="Arial" w:cs="Arial"/>
+          <w:color w:val="000000" w:themeColor="text1"/>
+          <w:sz w:val="24"/>
+          <w:szCs w:val="24"/>
+        </w:rPr>
+        <w:t xml:space="preserve"> Pitch)</w:t>
       </w:r>
     </w:p>
     <w:p>
@@ -3320,7 +3583,27 @@
           <w:sz w:val="24"/>
           <w:szCs w:val="24"/>
         </w:rPr>
-        <w:t>Matriz de Interesados (Stakeholders)</w:t>
+        <w:t>Matriz de Interesados (</w:t>
+      </w:r>
+      <w:proofErr w:type="spellStart"/>
+      <w:r>
+        <w:rPr>
+          <w:rFonts w:ascii="Arial" w:hAnsi="Arial" w:cs="Arial"/>
+          <w:color w:val="000000" w:themeColor="text1"/>
+          <w:sz w:val="24"/>
+          <w:szCs w:val="24"/>
+        </w:rPr>
+        <w:t>Stakeholders</w:t>
+      </w:r>
+      <w:proofErr w:type="spellEnd"/>
+      <w:r>
+        <w:rPr>
+          <w:rFonts w:ascii="Arial" w:hAnsi="Arial" w:cs="Arial"/>
+          <w:color w:val="000000" w:themeColor="text1"/>
+          <w:sz w:val="24"/>
+          <w:szCs w:val="24"/>
+        </w:rPr>
+        <w:t>)</w:t>
       </w:r>
     </w:p>
     <w:p>
@@ -3957,7 +4240,47 @@
           <w:szCs w:val="24"/>
         </w:rPr>
         <w:lastRenderedPageBreak/>
-        <w:t>• Arquitectura de Aplicación Web: Modelo Cliente-Servidor. Frontend desarrollado en tecnologías web estándar (HTML5, CSS3, JavaScript responsivo) y backend estructurado con API REST para la comunicación de datos.</w:t>
+        <w:t xml:space="preserve">• Arquitectura de Aplicación Web: Modelo Cliente-Servidor. </w:t>
+      </w:r>
+      <w:proofErr w:type="spellStart"/>
+      <w:r>
+        <w:rPr>
+          <w:rFonts w:ascii="Arial" w:hAnsi="Arial" w:cs="Arial"/>
+          <w:color w:val="000000" w:themeColor="text1"/>
+          <w:sz w:val="24"/>
+          <w:szCs w:val="24"/>
+        </w:rPr>
+        <w:t>Frontend</w:t>
+      </w:r>
+      <w:proofErr w:type="spellEnd"/>
+      <w:r>
+        <w:rPr>
+          <w:rFonts w:ascii="Arial" w:hAnsi="Arial" w:cs="Arial"/>
+          <w:color w:val="000000" w:themeColor="text1"/>
+          <w:sz w:val="24"/>
+          <w:szCs w:val="24"/>
+        </w:rPr>
+        <w:t xml:space="preserve"> desarrollado en tecnologías web estándar (HTML5, CSS3, JavaScript responsivo) y </w:t>
+      </w:r>
+      <w:proofErr w:type="spellStart"/>
+      <w:r>
+        <w:rPr>
+          <w:rFonts w:ascii="Arial" w:hAnsi="Arial" w:cs="Arial"/>
+          <w:color w:val="000000" w:themeColor="text1"/>
+          <w:sz w:val="24"/>
+          <w:szCs w:val="24"/>
+        </w:rPr>
+        <w:t>backend</w:t>
+      </w:r>
+      <w:proofErr w:type="spellEnd"/>
+      <w:r>
+        <w:rPr>
+          <w:rFonts w:ascii="Arial" w:hAnsi="Arial" w:cs="Arial"/>
+          <w:color w:val="000000" w:themeColor="text1"/>
+          <w:sz w:val="24"/>
+          <w:szCs w:val="24"/>
+        </w:rPr>
+        <w:t xml:space="preserve"> estructurado con API REST para la comunicación de datos.</w:t>
       </w:r>
     </w:p>
     <w:p>
@@ -4093,7 +4416,27 @@
           <w:sz w:val="24"/>
           <w:szCs w:val="24"/>
         </w:rPr>
-        <w:t>El desarrollo del MVP del Sistema de Gestión para Mercados Municipales está condicionado por restricciones de tiempo (6 meses) y presupuesto (70,000 Bs.). Para garantizar la viabilidad del proyecto ante estas restricciones, este documento clasifica y prioriza los requerimientos funcionales y no funcionales utilizando el método MoSCoW. A solicitud de la Alcaldía de Sucre, el módulo de geolocalización de puestos se incluye formalmente dentro de la planificación del MVP, definiendo una estrategia técnica optimizada para resolver la restricción presupuestaria y de recursos técnicos.</w:t>
+        <w:t xml:space="preserve">El desarrollo del MVP del Sistema de Gestión para Mercados Municipales está condicionado por restricciones de tiempo (6 meses) y presupuesto (70,000 Bs.). Para garantizar la viabilidad del proyecto ante estas restricciones, este documento clasifica y prioriza los requerimientos funcionales y no funcionales utilizando el método </w:t>
+      </w:r>
+      <w:proofErr w:type="spellStart"/>
+      <w:r>
+        <w:rPr>
+          <w:rFonts w:ascii="Arial" w:hAnsi="Arial" w:cs="Arial"/>
+          <w:color w:val="000000" w:themeColor="text1"/>
+          <w:sz w:val="24"/>
+          <w:szCs w:val="24"/>
+        </w:rPr>
+        <w:t>MoSCoW</w:t>
+      </w:r>
+      <w:proofErr w:type="spellEnd"/>
+      <w:r>
+        <w:rPr>
+          <w:rFonts w:ascii="Arial" w:hAnsi="Arial" w:cs="Arial"/>
+          <w:color w:val="000000" w:themeColor="text1"/>
+          <w:sz w:val="24"/>
+          <w:szCs w:val="24"/>
+        </w:rPr>
+        <w:t>. A solicitud de la Alcaldía de Sucre, el módulo de geolocalización de puestos se incluye formalmente dentro de la planificación del MVP, definiendo una estrategia técnica optimizada para resolver la restricción presupuestaria y de recursos técnicos.</w:t>
       </w:r>
     </w:p>
     <w:p>
@@ -4119,8 +4462,21 @@
           <w:sz w:val="24"/>
           <w:szCs w:val="24"/>
         </w:rPr>
-        <w:t>Criterios de la Metodología MoSCoW</w:t>
-      </w:r>
+        <w:t xml:space="preserve">Criterios de la Metodología </w:t>
+      </w:r>
+      <w:proofErr w:type="spellStart"/>
+      <w:r>
+        <w:rPr>
+          <w:rFonts w:ascii="Arial" w:hAnsi="Arial" w:cs="Arial"/>
+          <w:b w:val="0"/>
+          <w:bCs w:val="0"/>
+          <w:color w:val="000000" w:themeColor="text1"/>
+          <w:sz w:val="24"/>
+          <w:szCs w:val="24"/>
+        </w:rPr>
+        <w:t>MoSCoW</w:t>
+      </w:r>
+      <w:proofErr w:type="spellEnd"/>
     </w:p>
     <w:p/>
     <w:p>
@@ -4164,7 +4520,47 @@
           <w:szCs w:val="24"/>
         </w:rPr>
         <w:lastRenderedPageBreak/>
-        <w:t>• Must Have (Obligatorio): Funcionalidades indispensables para el funcionamiento mínimo del sistema (ej. registro de puestos, comerciantes y cobro de tarifas).</w:t>
+        <w:t xml:space="preserve">• </w:t>
+      </w:r>
+      <w:proofErr w:type="spellStart"/>
+      <w:r>
+        <w:rPr>
+          <w:rFonts w:ascii="Arial" w:hAnsi="Arial" w:cs="Arial"/>
+          <w:color w:val="000000" w:themeColor="text1"/>
+          <w:sz w:val="24"/>
+          <w:szCs w:val="24"/>
+        </w:rPr>
+        <w:t>Must</w:t>
+      </w:r>
+      <w:proofErr w:type="spellEnd"/>
+      <w:r>
+        <w:rPr>
+          <w:rFonts w:ascii="Arial" w:hAnsi="Arial" w:cs="Arial"/>
+          <w:color w:val="000000" w:themeColor="text1"/>
+          <w:sz w:val="24"/>
+          <w:szCs w:val="24"/>
+        </w:rPr>
+        <w:t xml:space="preserve"> </w:t>
+      </w:r>
+      <w:proofErr w:type="spellStart"/>
+      <w:r>
+        <w:rPr>
+          <w:rFonts w:ascii="Arial" w:hAnsi="Arial" w:cs="Arial"/>
+          <w:color w:val="000000" w:themeColor="text1"/>
+          <w:sz w:val="24"/>
+          <w:szCs w:val="24"/>
+        </w:rPr>
+        <w:t>Have</w:t>
+      </w:r>
+      <w:proofErr w:type="spellEnd"/>
+      <w:r>
+        <w:rPr>
+          <w:rFonts w:ascii="Arial" w:hAnsi="Arial" w:cs="Arial"/>
+          <w:color w:val="000000" w:themeColor="text1"/>
+          <w:sz w:val="24"/>
+          <w:szCs w:val="24"/>
+        </w:rPr>
+        <w:t xml:space="preserve"> (Obligatorio): Funcionalidades indispensables para el funcionamiento mínimo del sistema (ej. registro de puestos, comerciantes y cobro de tarifas).</w:t>
       </w:r>
     </w:p>
     <w:p>
@@ -4186,7 +4582,47 @@
           <w:sz w:val="24"/>
           <w:szCs w:val="24"/>
         </w:rPr>
-        <w:t>• Should Have (Debería tener): Funcionalidades de alto valor para el cliente que deben incluirse en el MVP mediante soluciones optimizadas de desarrollo (ej. geolocalización de puestos, alertas de morosidad).</w:t>
+        <w:t xml:space="preserve">• </w:t>
+      </w:r>
+      <w:proofErr w:type="spellStart"/>
+      <w:r>
+        <w:rPr>
+          <w:rFonts w:ascii="Arial" w:hAnsi="Arial" w:cs="Arial"/>
+          <w:color w:val="000000" w:themeColor="text1"/>
+          <w:sz w:val="24"/>
+          <w:szCs w:val="24"/>
+        </w:rPr>
+        <w:t>Should</w:t>
+      </w:r>
+      <w:proofErr w:type="spellEnd"/>
+      <w:r>
+        <w:rPr>
+          <w:rFonts w:ascii="Arial" w:hAnsi="Arial" w:cs="Arial"/>
+          <w:color w:val="000000" w:themeColor="text1"/>
+          <w:sz w:val="24"/>
+          <w:szCs w:val="24"/>
+        </w:rPr>
+        <w:t xml:space="preserve"> </w:t>
+      </w:r>
+      <w:proofErr w:type="spellStart"/>
+      <w:r>
+        <w:rPr>
+          <w:rFonts w:ascii="Arial" w:hAnsi="Arial" w:cs="Arial"/>
+          <w:color w:val="000000" w:themeColor="text1"/>
+          <w:sz w:val="24"/>
+          <w:szCs w:val="24"/>
+        </w:rPr>
+        <w:t>Have</w:t>
+      </w:r>
+      <w:proofErr w:type="spellEnd"/>
+      <w:r>
+        <w:rPr>
+          <w:rFonts w:ascii="Arial" w:hAnsi="Arial" w:cs="Arial"/>
+          <w:color w:val="000000" w:themeColor="text1"/>
+          <w:sz w:val="24"/>
+          <w:szCs w:val="24"/>
+        </w:rPr>
+        <w:t xml:space="preserve"> (Debería tener): Funcionalidades de alto valor para el cliente que deben incluirse en el MVP mediante soluciones optimizadas de desarrollo (ej. geolocalización de puestos, alertas de morosidad).</w:t>
       </w:r>
     </w:p>
     <w:p>
@@ -4208,7 +4644,47 @@
           <w:sz w:val="24"/>
           <w:szCs w:val="24"/>
         </w:rPr>
-        <w:t>• Could Have (Podría tener): Requerimientos deseables de bajo impacto que se implementarán si hay disponibilidad de tiempo y recursos (ej. reportes sanitarios avanzados).</w:t>
+        <w:t xml:space="preserve">• </w:t>
+      </w:r>
+      <w:proofErr w:type="spellStart"/>
+      <w:r>
+        <w:rPr>
+          <w:rFonts w:ascii="Arial" w:hAnsi="Arial" w:cs="Arial"/>
+          <w:color w:val="000000" w:themeColor="text1"/>
+          <w:sz w:val="24"/>
+          <w:szCs w:val="24"/>
+        </w:rPr>
+        <w:t>Could</w:t>
+      </w:r>
+      <w:proofErr w:type="spellEnd"/>
+      <w:r>
+        <w:rPr>
+          <w:rFonts w:ascii="Arial" w:hAnsi="Arial" w:cs="Arial"/>
+          <w:color w:val="000000" w:themeColor="text1"/>
+          <w:sz w:val="24"/>
+          <w:szCs w:val="24"/>
+        </w:rPr>
+        <w:t xml:space="preserve"> </w:t>
+      </w:r>
+      <w:proofErr w:type="spellStart"/>
+      <w:r>
+        <w:rPr>
+          <w:rFonts w:ascii="Arial" w:hAnsi="Arial" w:cs="Arial"/>
+          <w:color w:val="000000" w:themeColor="text1"/>
+          <w:sz w:val="24"/>
+          <w:szCs w:val="24"/>
+        </w:rPr>
+        <w:t>Have</w:t>
+      </w:r>
+      <w:proofErr w:type="spellEnd"/>
+      <w:r>
+        <w:rPr>
+          <w:rFonts w:ascii="Arial" w:hAnsi="Arial" w:cs="Arial"/>
+          <w:color w:val="000000" w:themeColor="text1"/>
+          <w:sz w:val="24"/>
+          <w:szCs w:val="24"/>
+        </w:rPr>
+        <w:t xml:space="preserve"> (Podría tener): Requerimientos deseables de bajo impacto que se implementarán si hay disponibilidad de tiempo y recursos (ej. reportes sanitarios avanzados).</w:t>
       </w:r>
     </w:p>
     <w:p>
@@ -4230,7 +4706,47 @@
           <w:sz w:val="24"/>
           <w:szCs w:val="24"/>
         </w:rPr>
-        <w:t>• Won't Have (No se tendrá por ahora): Requerimientos excluidos del MVP por no ser viables o no ser prioritarios para la Dirección de Ingresos (ej. pagos automáticos en línea).</w:t>
+        <w:t xml:space="preserve">• </w:t>
+      </w:r>
+      <w:proofErr w:type="spellStart"/>
+      <w:r>
+        <w:rPr>
+          <w:rFonts w:ascii="Arial" w:hAnsi="Arial" w:cs="Arial"/>
+          <w:color w:val="000000" w:themeColor="text1"/>
+          <w:sz w:val="24"/>
+          <w:szCs w:val="24"/>
+        </w:rPr>
+        <w:t>Won't</w:t>
+      </w:r>
+      <w:proofErr w:type="spellEnd"/>
+      <w:r>
+        <w:rPr>
+          <w:rFonts w:ascii="Arial" w:hAnsi="Arial" w:cs="Arial"/>
+          <w:color w:val="000000" w:themeColor="text1"/>
+          <w:sz w:val="24"/>
+          <w:szCs w:val="24"/>
+        </w:rPr>
+        <w:t xml:space="preserve"> </w:t>
+      </w:r>
+      <w:proofErr w:type="spellStart"/>
+      <w:r>
+        <w:rPr>
+          <w:rFonts w:ascii="Arial" w:hAnsi="Arial" w:cs="Arial"/>
+          <w:color w:val="000000" w:themeColor="text1"/>
+          <w:sz w:val="24"/>
+          <w:szCs w:val="24"/>
+        </w:rPr>
+        <w:t>Have</w:t>
+      </w:r>
+      <w:proofErr w:type="spellEnd"/>
+      <w:r>
+        <w:rPr>
+          <w:rFonts w:ascii="Arial" w:hAnsi="Arial" w:cs="Arial"/>
+          <w:color w:val="000000" w:themeColor="text1"/>
+          <w:sz w:val="24"/>
+          <w:szCs w:val="24"/>
+        </w:rPr>
+        <w:t xml:space="preserve"> (No se tendrá por ahora): Requerimientos excluidos del MVP por no ser viables o no ser prioritarios para la Dirección de Ingresos (ej. pagos automáticos en línea).</w:t>
       </w:r>
     </w:p>
     <w:p>
@@ -4591,15 +5107,37 @@
                 <w:szCs w:val="24"/>
               </w:rPr>
             </w:pPr>
-            <w:r>
-              <w:rPr>
-                <w:rFonts w:ascii="Arial" w:hAnsi="Arial" w:cs="Arial"/>
-                <w:color w:val="000000" w:themeColor="text1"/>
-                <w:sz w:val="24"/>
-                <w:szCs w:val="24"/>
-              </w:rPr>
-              <w:t>Must Have</w:t>
-            </w:r>
+            <w:proofErr w:type="spellStart"/>
+            <w:r>
+              <w:rPr>
+                <w:rFonts w:ascii="Arial" w:hAnsi="Arial" w:cs="Arial"/>
+                <w:color w:val="000000" w:themeColor="text1"/>
+                <w:sz w:val="24"/>
+                <w:szCs w:val="24"/>
+              </w:rPr>
+              <w:t>Must</w:t>
+            </w:r>
+            <w:proofErr w:type="spellEnd"/>
+            <w:r>
+              <w:rPr>
+                <w:rFonts w:ascii="Arial" w:hAnsi="Arial" w:cs="Arial"/>
+                <w:color w:val="000000" w:themeColor="text1"/>
+                <w:sz w:val="24"/>
+                <w:szCs w:val="24"/>
+              </w:rPr>
+              <w:t xml:space="preserve"> </w:t>
+            </w:r>
+            <w:proofErr w:type="spellStart"/>
+            <w:r>
+              <w:rPr>
+                <w:rFonts w:ascii="Arial" w:hAnsi="Arial" w:cs="Arial"/>
+                <w:color w:val="000000" w:themeColor="text1"/>
+                <w:sz w:val="24"/>
+                <w:szCs w:val="24"/>
+              </w:rPr>
+              <w:t>Have</w:t>
+            </w:r>
+            <w:proofErr w:type="spellEnd"/>
           </w:p>
         </w:tc>
         <w:tc>
@@ -4749,15 +5287,37 @@
                 <w:szCs w:val="24"/>
               </w:rPr>
             </w:pPr>
-            <w:r>
-              <w:rPr>
-                <w:rFonts w:ascii="Arial" w:hAnsi="Arial" w:cs="Arial"/>
-                <w:color w:val="000000" w:themeColor="text1"/>
-                <w:sz w:val="24"/>
-                <w:szCs w:val="24"/>
-              </w:rPr>
-              <w:t>Must Have</w:t>
-            </w:r>
+            <w:proofErr w:type="spellStart"/>
+            <w:r>
+              <w:rPr>
+                <w:rFonts w:ascii="Arial" w:hAnsi="Arial" w:cs="Arial"/>
+                <w:color w:val="000000" w:themeColor="text1"/>
+                <w:sz w:val="24"/>
+                <w:szCs w:val="24"/>
+              </w:rPr>
+              <w:t>Must</w:t>
+            </w:r>
+            <w:proofErr w:type="spellEnd"/>
+            <w:r>
+              <w:rPr>
+                <w:rFonts w:ascii="Arial" w:hAnsi="Arial" w:cs="Arial"/>
+                <w:color w:val="000000" w:themeColor="text1"/>
+                <w:sz w:val="24"/>
+                <w:szCs w:val="24"/>
+              </w:rPr>
+              <w:t xml:space="preserve"> </w:t>
+            </w:r>
+            <w:proofErr w:type="spellStart"/>
+            <w:r>
+              <w:rPr>
+                <w:rFonts w:ascii="Arial" w:hAnsi="Arial" w:cs="Arial"/>
+                <w:color w:val="000000" w:themeColor="text1"/>
+                <w:sz w:val="24"/>
+                <w:szCs w:val="24"/>
+              </w:rPr>
+              <w:t>Have</w:t>
+            </w:r>
+            <w:proofErr w:type="spellEnd"/>
           </w:p>
         </w:tc>
         <w:tc>
@@ -4907,15 +5467,37 @@
                 <w:szCs w:val="24"/>
               </w:rPr>
             </w:pPr>
-            <w:r>
-              <w:rPr>
-                <w:rFonts w:ascii="Arial" w:hAnsi="Arial" w:cs="Arial"/>
-                <w:color w:val="000000" w:themeColor="text1"/>
-                <w:sz w:val="24"/>
-                <w:szCs w:val="24"/>
-              </w:rPr>
-              <w:t>Should Have</w:t>
-            </w:r>
+            <w:proofErr w:type="spellStart"/>
+            <w:r>
+              <w:rPr>
+                <w:rFonts w:ascii="Arial" w:hAnsi="Arial" w:cs="Arial"/>
+                <w:color w:val="000000" w:themeColor="text1"/>
+                <w:sz w:val="24"/>
+                <w:szCs w:val="24"/>
+              </w:rPr>
+              <w:t>Should</w:t>
+            </w:r>
+            <w:proofErr w:type="spellEnd"/>
+            <w:r>
+              <w:rPr>
+                <w:rFonts w:ascii="Arial" w:hAnsi="Arial" w:cs="Arial"/>
+                <w:color w:val="000000" w:themeColor="text1"/>
+                <w:sz w:val="24"/>
+                <w:szCs w:val="24"/>
+              </w:rPr>
+              <w:t xml:space="preserve"> </w:t>
+            </w:r>
+            <w:proofErr w:type="spellStart"/>
+            <w:r>
+              <w:rPr>
+                <w:rFonts w:ascii="Arial" w:hAnsi="Arial" w:cs="Arial"/>
+                <w:color w:val="000000" w:themeColor="text1"/>
+                <w:sz w:val="24"/>
+                <w:szCs w:val="24"/>
+              </w:rPr>
+              <w:t>Have</w:t>
+            </w:r>
+            <w:proofErr w:type="spellEnd"/>
           </w:p>
         </w:tc>
         <w:tc>
@@ -5066,15 +5648,37 @@
                 <w:szCs w:val="24"/>
               </w:rPr>
             </w:pPr>
-            <w:r>
-              <w:rPr>
-                <w:rFonts w:ascii="Arial" w:hAnsi="Arial" w:cs="Arial"/>
-                <w:color w:val="000000" w:themeColor="text1"/>
-                <w:sz w:val="24"/>
-                <w:szCs w:val="24"/>
-              </w:rPr>
-              <w:t>Must Have</w:t>
-            </w:r>
+            <w:proofErr w:type="spellStart"/>
+            <w:r>
+              <w:rPr>
+                <w:rFonts w:ascii="Arial" w:hAnsi="Arial" w:cs="Arial"/>
+                <w:color w:val="000000" w:themeColor="text1"/>
+                <w:sz w:val="24"/>
+                <w:szCs w:val="24"/>
+              </w:rPr>
+              <w:t>Must</w:t>
+            </w:r>
+            <w:proofErr w:type="spellEnd"/>
+            <w:r>
+              <w:rPr>
+                <w:rFonts w:ascii="Arial" w:hAnsi="Arial" w:cs="Arial"/>
+                <w:color w:val="000000" w:themeColor="text1"/>
+                <w:sz w:val="24"/>
+                <w:szCs w:val="24"/>
+              </w:rPr>
+              <w:t xml:space="preserve"> </w:t>
+            </w:r>
+            <w:proofErr w:type="spellStart"/>
+            <w:r>
+              <w:rPr>
+                <w:rFonts w:ascii="Arial" w:hAnsi="Arial" w:cs="Arial"/>
+                <w:color w:val="000000" w:themeColor="text1"/>
+                <w:sz w:val="24"/>
+                <w:szCs w:val="24"/>
+              </w:rPr>
+              <w:t>Have</w:t>
+            </w:r>
+            <w:proofErr w:type="spellEnd"/>
           </w:p>
         </w:tc>
         <w:tc>
@@ -5224,15 +5828,37 @@
                 <w:szCs w:val="24"/>
               </w:rPr>
             </w:pPr>
-            <w:r>
-              <w:rPr>
-                <w:rFonts w:ascii="Arial" w:hAnsi="Arial" w:cs="Arial"/>
-                <w:color w:val="000000" w:themeColor="text1"/>
-                <w:sz w:val="24"/>
-                <w:szCs w:val="24"/>
-              </w:rPr>
-              <w:t>Must Have</w:t>
-            </w:r>
+            <w:proofErr w:type="spellStart"/>
+            <w:r>
+              <w:rPr>
+                <w:rFonts w:ascii="Arial" w:hAnsi="Arial" w:cs="Arial"/>
+                <w:color w:val="000000" w:themeColor="text1"/>
+                <w:sz w:val="24"/>
+                <w:szCs w:val="24"/>
+              </w:rPr>
+              <w:t>Must</w:t>
+            </w:r>
+            <w:proofErr w:type="spellEnd"/>
+            <w:r>
+              <w:rPr>
+                <w:rFonts w:ascii="Arial" w:hAnsi="Arial" w:cs="Arial"/>
+                <w:color w:val="000000" w:themeColor="text1"/>
+                <w:sz w:val="24"/>
+                <w:szCs w:val="24"/>
+              </w:rPr>
+              <w:t xml:space="preserve"> </w:t>
+            </w:r>
+            <w:proofErr w:type="spellStart"/>
+            <w:r>
+              <w:rPr>
+                <w:rFonts w:ascii="Arial" w:hAnsi="Arial" w:cs="Arial"/>
+                <w:color w:val="000000" w:themeColor="text1"/>
+                <w:sz w:val="24"/>
+                <w:szCs w:val="24"/>
+              </w:rPr>
+              <w:t>Have</w:t>
+            </w:r>
+            <w:proofErr w:type="spellEnd"/>
           </w:p>
         </w:tc>
         <w:tc>
@@ -5382,15 +6008,37 @@
                 <w:szCs w:val="24"/>
               </w:rPr>
             </w:pPr>
-            <w:r>
-              <w:rPr>
-                <w:rFonts w:ascii="Arial" w:hAnsi="Arial" w:cs="Arial"/>
-                <w:color w:val="000000" w:themeColor="text1"/>
-                <w:sz w:val="24"/>
-                <w:szCs w:val="24"/>
-              </w:rPr>
-              <w:t>Must Have</w:t>
-            </w:r>
+            <w:proofErr w:type="spellStart"/>
+            <w:r>
+              <w:rPr>
+                <w:rFonts w:ascii="Arial" w:hAnsi="Arial" w:cs="Arial"/>
+                <w:color w:val="000000" w:themeColor="text1"/>
+                <w:sz w:val="24"/>
+                <w:szCs w:val="24"/>
+              </w:rPr>
+              <w:t>Must</w:t>
+            </w:r>
+            <w:proofErr w:type="spellEnd"/>
+            <w:r>
+              <w:rPr>
+                <w:rFonts w:ascii="Arial" w:hAnsi="Arial" w:cs="Arial"/>
+                <w:color w:val="000000" w:themeColor="text1"/>
+                <w:sz w:val="24"/>
+                <w:szCs w:val="24"/>
+              </w:rPr>
+              <w:t xml:space="preserve"> </w:t>
+            </w:r>
+            <w:proofErr w:type="spellStart"/>
+            <w:r>
+              <w:rPr>
+                <w:rFonts w:ascii="Arial" w:hAnsi="Arial" w:cs="Arial"/>
+                <w:color w:val="000000" w:themeColor="text1"/>
+                <w:sz w:val="24"/>
+                <w:szCs w:val="24"/>
+              </w:rPr>
+              <w:t>Have</w:t>
+            </w:r>
+            <w:proofErr w:type="spellEnd"/>
           </w:p>
         </w:tc>
         <w:tc>
@@ -5540,15 +6188,37 @@
                 <w:szCs w:val="24"/>
               </w:rPr>
             </w:pPr>
-            <w:r>
-              <w:rPr>
-                <w:rFonts w:ascii="Arial" w:hAnsi="Arial" w:cs="Arial"/>
-                <w:color w:val="000000" w:themeColor="text1"/>
-                <w:sz w:val="24"/>
-                <w:szCs w:val="24"/>
-              </w:rPr>
-              <w:t>Must Have</w:t>
-            </w:r>
+            <w:proofErr w:type="spellStart"/>
+            <w:r>
+              <w:rPr>
+                <w:rFonts w:ascii="Arial" w:hAnsi="Arial" w:cs="Arial"/>
+                <w:color w:val="000000" w:themeColor="text1"/>
+                <w:sz w:val="24"/>
+                <w:szCs w:val="24"/>
+              </w:rPr>
+              <w:t>Must</w:t>
+            </w:r>
+            <w:proofErr w:type="spellEnd"/>
+            <w:r>
+              <w:rPr>
+                <w:rFonts w:ascii="Arial" w:hAnsi="Arial" w:cs="Arial"/>
+                <w:color w:val="000000" w:themeColor="text1"/>
+                <w:sz w:val="24"/>
+                <w:szCs w:val="24"/>
+              </w:rPr>
+              <w:t xml:space="preserve"> </w:t>
+            </w:r>
+            <w:proofErr w:type="spellStart"/>
+            <w:r>
+              <w:rPr>
+                <w:rFonts w:ascii="Arial" w:hAnsi="Arial" w:cs="Arial"/>
+                <w:color w:val="000000" w:themeColor="text1"/>
+                <w:sz w:val="24"/>
+                <w:szCs w:val="24"/>
+              </w:rPr>
+              <w:t>Have</w:t>
+            </w:r>
+            <w:proofErr w:type="spellEnd"/>
           </w:p>
         </w:tc>
         <w:tc>
@@ -5698,15 +6368,37 @@
                 <w:szCs w:val="24"/>
               </w:rPr>
             </w:pPr>
-            <w:r>
-              <w:rPr>
-                <w:rFonts w:ascii="Arial" w:hAnsi="Arial" w:cs="Arial"/>
-                <w:color w:val="000000" w:themeColor="text1"/>
-                <w:sz w:val="24"/>
-                <w:szCs w:val="24"/>
-              </w:rPr>
-              <w:t>Must Have</w:t>
-            </w:r>
+            <w:proofErr w:type="spellStart"/>
+            <w:r>
+              <w:rPr>
+                <w:rFonts w:ascii="Arial" w:hAnsi="Arial" w:cs="Arial"/>
+                <w:color w:val="000000" w:themeColor="text1"/>
+                <w:sz w:val="24"/>
+                <w:szCs w:val="24"/>
+              </w:rPr>
+              <w:t>Must</w:t>
+            </w:r>
+            <w:proofErr w:type="spellEnd"/>
+            <w:r>
+              <w:rPr>
+                <w:rFonts w:ascii="Arial" w:hAnsi="Arial" w:cs="Arial"/>
+                <w:color w:val="000000" w:themeColor="text1"/>
+                <w:sz w:val="24"/>
+                <w:szCs w:val="24"/>
+              </w:rPr>
+              <w:t xml:space="preserve"> </w:t>
+            </w:r>
+            <w:proofErr w:type="spellStart"/>
+            <w:r>
+              <w:rPr>
+                <w:rFonts w:ascii="Arial" w:hAnsi="Arial" w:cs="Arial"/>
+                <w:color w:val="000000" w:themeColor="text1"/>
+                <w:sz w:val="24"/>
+                <w:szCs w:val="24"/>
+              </w:rPr>
+              <w:t>Have</w:t>
+            </w:r>
+            <w:proofErr w:type="spellEnd"/>
           </w:p>
         </w:tc>
         <w:tc>
@@ -5856,15 +6548,37 @@
                 <w:szCs w:val="24"/>
               </w:rPr>
             </w:pPr>
-            <w:r>
-              <w:rPr>
-                <w:rFonts w:ascii="Arial" w:hAnsi="Arial" w:cs="Arial"/>
-                <w:color w:val="000000" w:themeColor="text1"/>
-                <w:sz w:val="24"/>
-                <w:szCs w:val="24"/>
-              </w:rPr>
-              <w:t>Should Have</w:t>
-            </w:r>
+            <w:proofErr w:type="spellStart"/>
+            <w:r>
+              <w:rPr>
+                <w:rFonts w:ascii="Arial" w:hAnsi="Arial" w:cs="Arial"/>
+                <w:color w:val="000000" w:themeColor="text1"/>
+                <w:sz w:val="24"/>
+                <w:szCs w:val="24"/>
+              </w:rPr>
+              <w:t>Should</w:t>
+            </w:r>
+            <w:proofErr w:type="spellEnd"/>
+            <w:r>
+              <w:rPr>
+                <w:rFonts w:ascii="Arial" w:hAnsi="Arial" w:cs="Arial"/>
+                <w:color w:val="000000" w:themeColor="text1"/>
+                <w:sz w:val="24"/>
+                <w:szCs w:val="24"/>
+              </w:rPr>
+              <w:t xml:space="preserve"> </w:t>
+            </w:r>
+            <w:proofErr w:type="spellStart"/>
+            <w:r>
+              <w:rPr>
+                <w:rFonts w:ascii="Arial" w:hAnsi="Arial" w:cs="Arial"/>
+                <w:color w:val="000000" w:themeColor="text1"/>
+                <w:sz w:val="24"/>
+                <w:szCs w:val="24"/>
+              </w:rPr>
+              <w:t>Have</w:t>
+            </w:r>
+            <w:proofErr w:type="spellEnd"/>
           </w:p>
         </w:tc>
         <w:tc>
@@ -6014,15 +6728,37 @@
                 <w:szCs w:val="24"/>
               </w:rPr>
             </w:pPr>
-            <w:r>
-              <w:rPr>
-                <w:rFonts w:ascii="Arial" w:hAnsi="Arial" w:cs="Arial"/>
-                <w:color w:val="000000" w:themeColor="text1"/>
-                <w:sz w:val="24"/>
-                <w:szCs w:val="24"/>
-              </w:rPr>
-              <w:t>Must Have</w:t>
-            </w:r>
+            <w:proofErr w:type="spellStart"/>
+            <w:r>
+              <w:rPr>
+                <w:rFonts w:ascii="Arial" w:hAnsi="Arial" w:cs="Arial"/>
+                <w:color w:val="000000" w:themeColor="text1"/>
+                <w:sz w:val="24"/>
+                <w:szCs w:val="24"/>
+              </w:rPr>
+              <w:t>Must</w:t>
+            </w:r>
+            <w:proofErr w:type="spellEnd"/>
+            <w:r>
+              <w:rPr>
+                <w:rFonts w:ascii="Arial" w:hAnsi="Arial" w:cs="Arial"/>
+                <w:color w:val="000000" w:themeColor="text1"/>
+                <w:sz w:val="24"/>
+                <w:szCs w:val="24"/>
+              </w:rPr>
+              <w:t xml:space="preserve"> </w:t>
+            </w:r>
+            <w:proofErr w:type="spellStart"/>
+            <w:r>
+              <w:rPr>
+                <w:rFonts w:ascii="Arial" w:hAnsi="Arial" w:cs="Arial"/>
+                <w:color w:val="000000" w:themeColor="text1"/>
+                <w:sz w:val="24"/>
+                <w:szCs w:val="24"/>
+              </w:rPr>
+              <w:t>Have</w:t>
+            </w:r>
+            <w:proofErr w:type="spellEnd"/>
           </w:p>
         </w:tc>
         <w:tc>
@@ -6172,15 +6908,37 @@
                 <w:szCs w:val="24"/>
               </w:rPr>
             </w:pPr>
-            <w:r>
-              <w:rPr>
-                <w:rFonts w:ascii="Arial" w:hAnsi="Arial" w:cs="Arial"/>
-                <w:color w:val="000000" w:themeColor="text1"/>
-                <w:sz w:val="24"/>
-                <w:szCs w:val="24"/>
-              </w:rPr>
-              <w:t>Should Have</w:t>
-            </w:r>
+            <w:proofErr w:type="spellStart"/>
+            <w:r>
+              <w:rPr>
+                <w:rFonts w:ascii="Arial" w:hAnsi="Arial" w:cs="Arial"/>
+                <w:color w:val="000000" w:themeColor="text1"/>
+                <w:sz w:val="24"/>
+                <w:szCs w:val="24"/>
+              </w:rPr>
+              <w:t>Should</w:t>
+            </w:r>
+            <w:proofErr w:type="spellEnd"/>
+            <w:r>
+              <w:rPr>
+                <w:rFonts w:ascii="Arial" w:hAnsi="Arial" w:cs="Arial"/>
+                <w:color w:val="000000" w:themeColor="text1"/>
+                <w:sz w:val="24"/>
+                <w:szCs w:val="24"/>
+              </w:rPr>
+              <w:t xml:space="preserve"> </w:t>
+            </w:r>
+            <w:proofErr w:type="spellStart"/>
+            <w:r>
+              <w:rPr>
+                <w:rFonts w:ascii="Arial" w:hAnsi="Arial" w:cs="Arial"/>
+                <w:color w:val="000000" w:themeColor="text1"/>
+                <w:sz w:val="24"/>
+                <w:szCs w:val="24"/>
+              </w:rPr>
+              <w:t>Have</w:t>
+            </w:r>
+            <w:proofErr w:type="spellEnd"/>
           </w:p>
         </w:tc>
         <w:tc>
@@ -6330,15 +7088,37 @@
                 <w:szCs w:val="24"/>
               </w:rPr>
             </w:pPr>
-            <w:r>
-              <w:rPr>
-                <w:rFonts w:ascii="Arial" w:hAnsi="Arial" w:cs="Arial"/>
-                <w:color w:val="000000" w:themeColor="text1"/>
-                <w:sz w:val="24"/>
-                <w:szCs w:val="24"/>
-              </w:rPr>
-              <w:t>Should Have</w:t>
-            </w:r>
+            <w:proofErr w:type="spellStart"/>
+            <w:r>
+              <w:rPr>
+                <w:rFonts w:ascii="Arial" w:hAnsi="Arial" w:cs="Arial"/>
+                <w:color w:val="000000" w:themeColor="text1"/>
+                <w:sz w:val="24"/>
+                <w:szCs w:val="24"/>
+              </w:rPr>
+              <w:t>Should</w:t>
+            </w:r>
+            <w:proofErr w:type="spellEnd"/>
+            <w:r>
+              <w:rPr>
+                <w:rFonts w:ascii="Arial" w:hAnsi="Arial" w:cs="Arial"/>
+                <w:color w:val="000000" w:themeColor="text1"/>
+                <w:sz w:val="24"/>
+                <w:szCs w:val="24"/>
+              </w:rPr>
+              <w:t xml:space="preserve"> </w:t>
+            </w:r>
+            <w:proofErr w:type="spellStart"/>
+            <w:r>
+              <w:rPr>
+                <w:rFonts w:ascii="Arial" w:hAnsi="Arial" w:cs="Arial"/>
+                <w:color w:val="000000" w:themeColor="text1"/>
+                <w:sz w:val="24"/>
+                <w:szCs w:val="24"/>
+              </w:rPr>
+              <w:t>Have</w:t>
+            </w:r>
+            <w:proofErr w:type="spellEnd"/>
           </w:p>
         </w:tc>
         <w:tc>
@@ -6499,15 +7279,37 @@
                 <w:szCs w:val="24"/>
               </w:rPr>
             </w:pPr>
-            <w:r>
-              <w:rPr>
-                <w:rFonts w:ascii="Arial" w:hAnsi="Arial" w:cs="Arial"/>
-                <w:color w:val="000000" w:themeColor="text1"/>
-                <w:sz w:val="24"/>
-                <w:szCs w:val="24"/>
-              </w:rPr>
-              <w:t>Should Have</w:t>
-            </w:r>
+            <w:proofErr w:type="spellStart"/>
+            <w:r>
+              <w:rPr>
+                <w:rFonts w:ascii="Arial" w:hAnsi="Arial" w:cs="Arial"/>
+                <w:color w:val="000000" w:themeColor="text1"/>
+                <w:sz w:val="24"/>
+                <w:szCs w:val="24"/>
+              </w:rPr>
+              <w:t>Should</w:t>
+            </w:r>
+            <w:proofErr w:type="spellEnd"/>
+            <w:r>
+              <w:rPr>
+                <w:rFonts w:ascii="Arial" w:hAnsi="Arial" w:cs="Arial"/>
+                <w:color w:val="000000" w:themeColor="text1"/>
+                <w:sz w:val="24"/>
+                <w:szCs w:val="24"/>
+              </w:rPr>
+              <w:t xml:space="preserve"> </w:t>
+            </w:r>
+            <w:proofErr w:type="spellStart"/>
+            <w:r>
+              <w:rPr>
+                <w:rFonts w:ascii="Arial" w:hAnsi="Arial" w:cs="Arial"/>
+                <w:color w:val="000000" w:themeColor="text1"/>
+                <w:sz w:val="24"/>
+                <w:szCs w:val="24"/>
+              </w:rPr>
+              <w:t>Have</w:t>
+            </w:r>
+            <w:proofErr w:type="spellEnd"/>
           </w:p>
         </w:tc>
         <w:tc>
@@ -6657,15 +7459,37 @@
                 <w:szCs w:val="24"/>
               </w:rPr>
             </w:pPr>
-            <w:r>
-              <w:rPr>
-                <w:rFonts w:ascii="Arial" w:hAnsi="Arial" w:cs="Arial"/>
-                <w:color w:val="000000" w:themeColor="text1"/>
-                <w:sz w:val="24"/>
-                <w:szCs w:val="24"/>
-              </w:rPr>
-              <w:t>Must Have</w:t>
-            </w:r>
+            <w:proofErr w:type="spellStart"/>
+            <w:r>
+              <w:rPr>
+                <w:rFonts w:ascii="Arial" w:hAnsi="Arial" w:cs="Arial"/>
+                <w:color w:val="000000" w:themeColor="text1"/>
+                <w:sz w:val="24"/>
+                <w:szCs w:val="24"/>
+              </w:rPr>
+              <w:t>Must</w:t>
+            </w:r>
+            <w:proofErr w:type="spellEnd"/>
+            <w:r>
+              <w:rPr>
+                <w:rFonts w:ascii="Arial" w:hAnsi="Arial" w:cs="Arial"/>
+                <w:color w:val="000000" w:themeColor="text1"/>
+                <w:sz w:val="24"/>
+                <w:szCs w:val="24"/>
+              </w:rPr>
+              <w:t xml:space="preserve"> </w:t>
+            </w:r>
+            <w:proofErr w:type="spellStart"/>
+            <w:r>
+              <w:rPr>
+                <w:rFonts w:ascii="Arial" w:hAnsi="Arial" w:cs="Arial"/>
+                <w:color w:val="000000" w:themeColor="text1"/>
+                <w:sz w:val="24"/>
+                <w:szCs w:val="24"/>
+              </w:rPr>
+              <w:t>Have</w:t>
+            </w:r>
+            <w:proofErr w:type="spellEnd"/>
           </w:p>
         </w:tc>
         <w:tc>
@@ -6815,15 +7639,37 @@
                 <w:szCs w:val="24"/>
               </w:rPr>
             </w:pPr>
-            <w:r>
-              <w:rPr>
-                <w:rFonts w:ascii="Arial" w:hAnsi="Arial" w:cs="Arial"/>
-                <w:color w:val="000000" w:themeColor="text1"/>
-                <w:sz w:val="24"/>
-                <w:szCs w:val="24"/>
-              </w:rPr>
-              <w:t>Should Have</w:t>
-            </w:r>
+            <w:proofErr w:type="spellStart"/>
+            <w:r>
+              <w:rPr>
+                <w:rFonts w:ascii="Arial" w:hAnsi="Arial" w:cs="Arial"/>
+                <w:color w:val="000000" w:themeColor="text1"/>
+                <w:sz w:val="24"/>
+                <w:szCs w:val="24"/>
+              </w:rPr>
+              <w:t>Should</w:t>
+            </w:r>
+            <w:proofErr w:type="spellEnd"/>
+            <w:r>
+              <w:rPr>
+                <w:rFonts w:ascii="Arial" w:hAnsi="Arial" w:cs="Arial"/>
+                <w:color w:val="000000" w:themeColor="text1"/>
+                <w:sz w:val="24"/>
+                <w:szCs w:val="24"/>
+              </w:rPr>
+              <w:t xml:space="preserve"> </w:t>
+            </w:r>
+            <w:proofErr w:type="spellStart"/>
+            <w:r>
+              <w:rPr>
+                <w:rFonts w:ascii="Arial" w:hAnsi="Arial" w:cs="Arial"/>
+                <w:color w:val="000000" w:themeColor="text1"/>
+                <w:sz w:val="24"/>
+                <w:szCs w:val="24"/>
+              </w:rPr>
+              <w:t>Have</w:t>
+            </w:r>
+            <w:proofErr w:type="spellEnd"/>
           </w:p>
         </w:tc>
         <w:tc>
@@ -6973,15 +7819,37 @@
                 <w:szCs w:val="24"/>
               </w:rPr>
             </w:pPr>
-            <w:r>
-              <w:rPr>
-                <w:rFonts w:ascii="Arial" w:hAnsi="Arial" w:cs="Arial"/>
-                <w:color w:val="000000" w:themeColor="text1"/>
-                <w:sz w:val="24"/>
-                <w:szCs w:val="24"/>
-              </w:rPr>
-              <w:t>Could Have</w:t>
-            </w:r>
+            <w:proofErr w:type="spellStart"/>
+            <w:r>
+              <w:rPr>
+                <w:rFonts w:ascii="Arial" w:hAnsi="Arial" w:cs="Arial"/>
+                <w:color w:val="000000" w:themeColor="text1"/>
+                <w:sz w:val="24"/>
+                <w:szCs w:val="24"/>
+              </w:rPr>
+              <w:t>Could</w:t>
+            </w:r>
+            <w:proofErr w:type="spellEnd"/>
+            <w:r>
+              <w:rPr>
+                <w:rFonts w:ascii="Arial" w:hAnsi="Arial" w:cs="Arial"/>
+                <w:color w:val="000000" w:themeColor="text1"/>
+                <w:sz w:val="24"/>
+                <w:szCs w:val="24"/>
+              </w:rPr>
+              <w:t xml:space="preserve"> </w:t>
+            </w:r>
+            <w:proofErr w:type="spellStart"/>
+            <w:r>
+              <w:rPr>
+                <w:rFonts w:ascii="Arial" w:hAnsi="Arial" w:cs="Arial"/>
+                <w:color w:val="000000" w:themeColor="text1"/>
+                <w:sz w:val="24"/>
+                <w:szCs w:val="24"/>
+              </w:rPr>
+              <w:t>Have</w:t>
+            </w:r>
+            <w:proofErr w:type="spellEnd"/>
           </w:p>
         </w:tc>
         <w:tc>
@@ -7109,7 +7977,61 @@
           <w:sz w:val="24"/>
           <w:szCs w:val="24"/>
         </w:rPr>
-        <w:t>Uso de Leaflet.js y OpenStreetMap: Se descarta el uso de Google Maps API para evitar costos recurrentes de licenciamiento. Leaflet.js es una biblioteca de JavaScript extremadamente ligera y gratuita que se integrará en el frontend del sistema web.</w:t>
+        <w:t xml:space="preserve">Uso de Leaflet.js y </w:t>
+      </w:r>
+      <w:proofErr w:type="spellStart"/>
+      <w:r>
+        <w:rPr>
+          <w:rFonts w:ascii="Arial" w:hAnsi="Arial" w:cs="Arial"/>
+          <w:sz w:val="24"/>
+          <w:szCs w:val="24"/>
+        </w:rPr>
+        <w:t>OpenStreetMap</w:t>
+      </w:r>
+      <w:proofErr w:type="spellEnd"/>
+      <w:r>
+        <w:rPr>
+          <w:rFonts w:ascii="Arial" w:hAnsi="Arial" w:cs="Arial"/>
+          <w:sz w:val="24"/>
+          <w:szCs w:val="24"/>
+        </w:rPr>
+        <w:t xml:space="preserve">: Se descarta el uso de Google </w:t>
+      </w:r>
+      <w:proofErr w:type="spellStart"/>
+      <w:r>
+        <w:rPr>
+          <w:rFonts w:ascii="Arial" w:hAnsi="Arial" w:cs="Arial"/>
+          <w:sz w:val="24"/>
+          <w:szCs w:val="24"/>
+        </w:rPr>
+        <w:t>Maps</w:t>
+      </w:r>
+      <w:proofErr w:type="spellEnd"/>
+      <w:r>
+        <w:rPr>
+          <w:rFonts w:ascii="Arial" w:hAnsi="Arial" w:cs="Arial"/>
+          <w:sz w:val="24"/>
+          <w:szCs w:val="24"/>
+        </w:rPr>
+        <w:t xml:space="preserve"> API para evitar costos recurrentes de licenciamiento. Leaflet.js es una biblioteca de JavaScript extremadamente ligera y gratuita que se integrará en el </w:t>
+      </w:r>
+      <w:proofErr w:type="spellStart"/>
+      <w:r>
+        <w:rPr>
+          <w:rFonts w:ascii="Arial" w:hAnsi="Arial" w:cs="Arial"/>
+          <w:sz w:val="24"/>
+          <w:szCs w:val="24"/>
+        </w:rPr>
+        <w:t>frontend</w:t>
+      </w:r>
+      <w:proofErr w:type="spellEnd"/>
+      <w:r>
+        <w:rPr>
+          <w:rFonts w:ascii="Arial" w:hAnsi="Arial" w:cs="Arial"/>
+          <w:sz w:val="24"/>
+          <w:szCs w:val="24"/>
+        </w:rPr>
+        <w:t xml:space="preserve"> del sistema web.</w:t>
       </w:r>
     </w:p>
     <w:p>
@@ -7190,7 +8112,47 @@
           <w:sz w:val="24"/>
           <w:szCs w:val="24"/>
         </w:rPr>
-        <w:t>Esta estrategia permite clasificar RF-GEO como Should Have, programando su desarrollo técnico para el Sprint 5 y garantizando su entrega en el MVP.</w:t>
+        <w:t xml:space="preserve">Esta estrategia permite clasificar RF-GEO como </w:t>
+      </w:r>
+      <w:proofErr w:type="spellStart"/>
+      <w:r>
+        <w:rPr>
+          <w:rFonts w:ascii="Arial" w:hAnsi="Arial" w:cs="Arial"/>
+          <w:color w:val="000000" w:themeColor="text1"/>
+          <w:sz w:val="24"/>
+          <w:szCs w:val="24"/>
+        </w:rPr>
+        <w:t>Should</w:t>
+      </w:r>
+      <w:proofErr w:type="spellEnd"/>
+      <w:r>
+        <w:rPr>
+          <w:rFonts w:ascii="Arial" w:hAnsi="Arial" w:cs="Arial"/>
+          <w:color w:val="000000" w:themeColor="text1"/>
+          <w:sz w:val="24"/>
+          <w:szCs w:val="24"/>
+        </w:rPr>
+        <w:t xml:space="preserve"> </w:t>
+      </w:r>
+      <w:proofErr w:type="spellStart"/>
+      <w:r>
+        <w:rPr>
+          <w:rFonts w:ascii="Arial" w:hAnsi="Arial" w:cs="Arial"/>
+          <w:color w:val="000000" w:themeColor="text1"/>
+          <w:sz w:val="24"/>
+          <w:szCs w:val="24"/>
+        </w:rPr>
+        <w:t>Have</w:t>
+      </w:r>
+      <w:proofErr w:type="spellEnd"/>
+      <w:r>
+        <w:rPr>
+          <w:rFonts w:ascii="Arial" w:hAnsi="Arial" w:cs="Arial"/>
+          <w:color w:val="000000" w:themeColor="text1"/>
+          <w:sz w:val="24"/>
+          <w:szCs w:val="24"/>
+        </w:rPr>
+        <w:t>, programando su desarrollo técnico para el Sprint 5 y garantizando su entrega en el MVP.</w:t>
       </w:r>
     </w:p>
     <w:p>
@@ -7291,7 +8253,27 @@
           <w:sz w:val="24"/>
           <w:szCs w:val="24"/>
         </w:rPr>
-        <w:t>Este documento establece la línea base del cronograma del proyecto para un ciclo total de 6 meses (24 semanas), estructurado en 12 Sprints de 2 semanas de duración cada uno. El cronograma integra el desarrollo técnico incremental de Scrum con los hitos de control tradicionales, e incorpora de manera coherente los eventos críticos del proyecto (solicitud de geolocalización, renuncia de desarrolladores y cambios regulatorios).</w:t>
+        <w:t xml:space="preserve">Este documento establece la línea base del cronograma del proyecto para un ciclo total de 6 meses (24 semanas), estructurado en 12 </w:t>
+      </w:r>
+      <w:proofErr w:type="spellStart"/>
+      <w:r>
+        <w:rPr>
+          <w:rFonts w:ascii="Arial" w:hAnsi="Arial" w:cs="Arial"/>
+          <w:color w:val="000000" w:themeColor="text1"/>
+          <w:sz w:val="24"/>
+          <w:szCs w:val="24"/>
+        </w:rPr>
+        <w:t>Sprints</w:t>
+      </w:r>
+      <w:proofErr w:type="spellEnd"/>
+      <w:r>
+        <w:rPr>
+          <w:rFonts w:ascii="Arial" w:hAnsi="Arial" w:cs="Arial"/>
+          <w:color w:val="000000" w:themeColor="text1"/>
+          <w:sz w:val="24"/>
+          <w:szCs w:val="24"/>
+        </w:rPr>
+        <w:t xml:space="preserve"> de 2 semanas de duración cada uno. El cronograma integra el desarrollo técnico incremental de Scrum con los hitos de control tradicionales, e incorpora de manera coherente los eventos críticos del proyecto (solicitud de geolocalización, renuncia de desarrolladores y cambios regulatorios).</w:t>
       </w:r>
     </w:p>
     <w:p>
@@ -7325,7 +8307,27 @@
           <w:sz w:val="24"/>
           <w:szCs w:val="24"/>
         </w:rPr>
-        <w:t>Calendario de Sprints y Entregas</w:t>
+        <w:t xml:space="preserve">Calendario de </w:t>
+      </w:r>
+      <w:proofErr w:type="spellStart"/>
+      <w:r>
+        <w:rPr>
+          <w:rFonts w:ascii="Arial" w:hAnsi="Arial" w:cs="Arial"/>
+          <w:color w:val="000000" w:themeColor="text1"/>
+          <w:sz w:val="24"/>
+          <w:szCs w:val="24"/>
+        </w:rPr>
+        <w:t>Sprints</w:t>
+      </w:r>
+      <w:proofErr w:type="spellEnd"/>
+      <w:r>
+        <w:rPr>
+          <w:rFonts w:ascii="Arial" w:hAnsi="Arial" w:cs="Arial"/>
+          <w:color w:val="000000" w:themeColor="text1"/>
+          <w:sz w:val="24"/>
+          <w:szCs w:val="24"/>
+        </w:rPr>
+        <w:t xml:space="preserve"> y Entregas</w:t>
       </w:r>
     </w:p>
     <w:p>
@@ -7503,7 +8505,27 @@
                 <w:szCs w:val="24"/>
               </w:rPr>
               <w:lastRenderedPageBreak/>
-              <w:t>Sprint 1 (Sem. 1-2)</w:t>
+              <w:t>Sprint 1 (</w:t>
+            </w:r>
+            <w:proofErr w:type="spellStart"/>
+            <w:r>
+              <w:rPr>
+                <w:rFonts w:ascii="Arial" w:hAnsi="Arial" w:cs="Arial"/>
+                <w:color w:val="000000" w:themeColor="text1"/>
+                <w:sz w:val="24"/>
+                <w:szCs w:val="24"/>
+              </w:rPr>
+              <w:t>Sem</w:t>
+            </w:r>
+            <w:proofErr w:type="spellEnd"/>
+            <w:r>
+              <w:rPr>
+                <w:rFonts w:ascii="Arial" w:hAnsi="Arial" w:cs="Arial"/>
+                <w:color w:val="000000" w:themeColor="text1"/>
+                <w:sz w:val="24"/>
+                <w:szCs w:val="24"/>
+              </w:rPr>
+              <w:t>. 1-2)</w:t>
             </w:r>
           </w:p>
         </w:tc>
@@ -7555,7 +8577,27 @@
                 <w:sz w:val="24"/>
                 <w:szCs w:val="24"/>
               </w:rPr>
-              <w:t>Metodología, Solicitud, Inception y Matriz de Priorización.</w:t>
+              <w:t xml:space="preserve">Metodología, Solicitud, </w:t>
+            </w:r>
+            <w:proofErr w:type="spellStart"/>
+            <w:r>
+              <w:rPr>
+                <w:rFonts w:ascii="Arial" w:hAnsi="Arial" w:cs="Arial"/>
+                <w:color w:val="000000" w:themeColor="text1"/>
+                <w:sz w:val="24"/>
+                <w:szCs w:val="24"/>
+              </w:rPr>
+              <w:t>Inception</w:t>
+            </w:r>
+            <w:proofErr w:type="spellEnd"/>
+            <w:r>
+              <w:rPr>
+                <w:rFonts w:ascii="Arial" w:hAnsi="Arial" w:cs="Arial"/>
+                <w:color w:val="000000" w:themeColor="text1"/>
+                <w:sz w:val="24"/>
+                <w:szCs w:val="24"/>
+              </w:rPr>
+              <w:t xml:space="preserve"> y Matriz de Priorización.</w:t>
             </w:r>
           </w:p>
         </w:tc>
@@ -7581,7 +8623,27 @@
                 <w:sz w:val="24"/>
                 <w:szCs w:val="24"/>
               </w:rPr>
-              <w:t>Reunión de kickoff con la Alcaldía.</w:t>
+              <w:t xml:space="preserve">Reunión de </w:t>
+            </w:r>
+            <w:proofErr w:type="spellStart"/>
+            <w:r>
+              <w:rPr>
+                <w:rFonts w:ascii="Arial" w:hAnsi="Arial" w:cs="Arial"/>
+                <w:color w:val="000000" w:themeColor="text1"/>
+                <w:sz w:val="24"/>
+                <w:szCs w:val="24"/>
+              </w:rPr>
+              <w:t>kickoff</w:t>
+            </w:r>
+            <w:proofErr w:type="spellEnd"/>
+            <w:r>
+              <w:rPr>
+                <w:rFonts w:ascii="Arial" w:hAnsi="Arial" w:cs="Arial"/>
+                <w:color w:val="000000" w:themeColor="text1"/>
+                <w:sz w:val="24"/>
+                <w:szCs w:val="24"/>
+              </w:rPr>
+              <w:t xml:space="preserve"> con la Alcaldía.</w:t>
             </w:r>
           </w:p>
         </w:tc>
@@ -7609,7 +8671,27 @@
                 <w:sz w:val="24"/>
                 <w:szCs w:val="24"/>
               </w:rPr>
-              <w:t>Sprint 2 (Sem. 3-4)</w:t>
+              <w:t>Sprint 2 (</w:t>
+            </w:r>
+            <w:proofErr w:type="spellStart"/>
+            <w:r>
+              <w:rPr>
+                <w:rFonts w:ascii="Arial" w:hAnsi="Arial" w:cs="Arial"/>
+                <w:color w:val="000000" w:themeColor="text1"/>
+                <w:sz w:val="24"/>
+                <w:szCs w:val="24"/>
+              </w:rPr>
+              <w:t>Sem</w:t>
+            </w:r>
+            <w:proofErr w:type="spellEnd"/>
+            <w:r>
+              <w:rPr>
+                <w:rFonts w:ascii="Arial" w:hAnsi="Arial" w:cs="Arial"/>
+                <w:color w:val="000000" w:themeColor="text1"/>
+                <w:sz w:val="24"/>
+                <w:szCs w:val="24"/>
+              </w:rPr>
+              <w:t>. 3-4)</w:t>
             </w:r>
           </w:p>
         </w:tc>
@@ -7715,7 +8797,27 @@
                 <w:sz w:val="24"/>
                 <w:szCs w:val="24"/>
               </w:rPr>
-              <w:t>Sprint 3 (Sem. 5-6)</w:t>
+              <w:t>Sprint 3 (</w:t>
+            </w:r>
+            <w:proofErr w:type="spellStart"/>
+            <w:r>
+              <w:rPr>
+                <w:rFonts w:ascii="Arial" w:hAnsi="Arial" w:cs="Arial"/>
+                <w:color w:val="000000" w:themeColor="text1"/>
+                <w:sz w:val="24"/>
+                <w:szCs w:val="24"/>
+              </w:rPr>
+              <w:t>Sem</w:t>
+            </w:r>
+            <w:proofErr w:type="spellEnd"/>
+            <w:r>
+              <w:rPr>
+                <w:rFonts w:ascii="Arial" w:hAnsi="Arial" w:cs="Arial"/>
+                <w:color w:val="000000" w:themeColor="text1"/>
+                <w:sz w:val="24"/>
+                <w:szCs w:val="24"/>
+              </w:rPr>
+              <w:t>. 5-6)</w:t>
             </w:r>
           </w:p>
         </w:tc>
@@ -7821,7 +8923,27 @@
                 <w:sz w:val="24"/>
                 <w:szCs w:val="24"/>
               </w:rPr>
-              <w:t>Sprint 4 (Sem. 7-8)</w:t>
+              <w:t>Sprint 4 (</w:t>
+            </w:r>
+            <w:proofErr w:type="spellStart"/>
+            <w:r>
+              <w:rPr>
+                <w:rFonts w:ascii="Arial" w:hAnsi="Arial" w:cs="Arial"/>
+                <w:color w:val="000000" w:themeColor="text1"/>
+                <w:sz w:val="24"/>
+                <w:szCs w:val="24"/>
+              </w:rPr>
+              <w:t>Sem</w:t>
+            </w:r>
+            <w:proofErr w:type="spellEnd"/>
+            <w:r>
+              <w:rPr>
+                <w:rFonts w:ascii="Arial" w:hAnsi="Arial" w:cs="Arial"/>
+                <w:color w:val="000000" w:themeColor="text1"/>
+                <w:sz w:val="24"/>
+                <w:szCs w:val="24"/>
+              </w:rPr>
+              <w:t>. 7-8)</w:t>
             </w:r>
           </w:p>
         </w:tc>
@@ -7927,7 +9049,27 @@
                 <w:sz w:val="24"/>
                 <w:szCs w:val="24"/>
               </w:rPr>
-              <w:t>Sprint 5 (Sem. 9-10)</w:t>
+              <w:t>Sprint 5 (</w:t>
+            </w:r>
+            <w:proofErr w:type="spellStart"/>
+            <w:r>
+              <w:rPr>
+                <w:rFonts w:ascii="Arial" w:hAnsi="Arial" w:cs="Arial"/>
+                <w:color w:val="000000" w:themeColor="text1"/>
+                <w:sz w:val="24"/>
+                <w:szCs w:val="24"/>
+              </w:rPr>
+              <w:t>Sem</w:t>
+            </w:r>
+            <w:proofErr w:type="spellEnd"/>
+            <w:r>
+              <w:rPr>
+                <w:rFonts w:ascii="Arial" w:hAnsi="Arial" w:cs="Arial"/>
+                <w:color w:val="000000" w:themeColor="text1"/>
+                <w:sz w:val="24"/>
+                <w:szCs w:val="24"/>
+              </w:rPr>
+              <w:t>. 9-10)</w:t>
             </w:r>
           </w:p>
         </w:tc>
@@ -8033,7 +9175,27 @@
                 <w:sz w:val="24"/>
                 <w:szCs w:val="24"/>
               </w:rPr>
-              <w:t>Sprint 6 (Sem. 11-12)</w:t>
+              <w:t>Sprint 6 (</w:t>
+            </w:r>
+            <w:proofErr w:type="spellStart"/>
+            <w:r>
+              <w:rPr>
+                <w:rFonts w:ascii="Arial" w:hAnsi="Arial" w:cs="Arial"/>
+                <w:color w:val="000000" w:themeColor="text1"/>
+                <w:sz w:val="24"/>
+                <w:szCs w:val="24"/>
+              </w:rPr>
+              <w:t>Sem</w:t>
+            </w:r>
+            <w:proofErr w:type="spellEnd"/>
+            <w:r>
+              <w:rPr>
+                <w:rFonts w:ascii="Arial" w:hAnsi="Arial" w:cs="Arial"/>
+                <w:color w:val="000000" w:themeColor="text1"/>
+                <w:sz w:val="24"/>
+                <w:szCs w:val="24"/>
+              </w:rPr>
+              <w:t>. 11-12)</w:t>
             </w:r>
           </w:p>
         </w:tc>
@@ -8140,7 +9302,27 @@
                 <w:szCs w:val="24"/>
               </w:rPr>
               <w:lastRenderedPageBreak/>
-              <w:t>Sprint 7 (Sem. 13-14)</w:t>
+              <w:t>Sprint 7 (</w:t>
+            </w:r>
+            <w:proofErr w:type="spellStart"/>
+            <w:r>
+              <w:rPr>
+                <w:rFonts w:ascii="Arial" w:hAnsi="Arial" w:cs="Arial"/>
+                <w:color w:val="000000" w:themeColor="text1"/>
+                <w:sz w:val="24"/>
+                <w:szCs w:val="24"/>
+              </w:rPr>
+              <w:t>Sem</w:t>
+            </w:r>
+            <w:proofErr w:type="spellEnd"/>
+            <w:r>
+              <w:rPr>
+                <w:rFonts w:ascii="Arial" w:hAnsi="Arial" w:cs="Arial"/>
+                <w:color w:val="000000" w:themeColor="text1"/>
+                <w:sz w:val="24"/>
+                <w:szCs w:val="24"/>
+              </w:rPr>
+              <w:t>. 13-14)</w:t>
             </w:r>
           </w:p>
         </w:tc>
@@ -8246,7 +9428,27 @@
                 <w:sz w:val="24"/>
                 <w:szCs w:val="24"/>
               </w:rPr>
-              <w:t>Sprint 8 (Sem. 15-16)</w:t>
+              <w:t>Sprint 8 (</w:t>
+            </w:r>
+            <w:proofErr w:type="spellStart"/>
+            <w:r>
+              <w:rPr>
+                <w:rFonts w:ascii="Arial" w:hAnsi="Arial" w:cs="Arial"/>
+                <w:color w:val="000000" w:themeColor="text1"/>
+                <w:sz w:val="24"/>
+                <w:szCs w:val="24"/>
+              </w:rPr>
+              <w:t>Sem</w:t>
+            </w:r>
+            <w:proofErr w:type="spellEnd"/>
+            <w:r>
+              <w:rPr>
+                <w:rFonts w:ascii="Arial" w:hAnsi="Arial" w:cs="Arial"/>
+                <w:color w:val="000000" w:themeColor="text1"/>
+                <w:sz w:val="24"/>
+                <w:szCs w:val="24"/>
+              </w:rPr>
+              <w:t>. 15-16)</w:t>
             </w:r>
           </w:p>
         </w:tc>
@@ -8352,7 +9554,27 @@
                 <w:sz w:val="24"/>
                 <w:szCs w:val="24"/>
               </w:rPr>
-              <w:t>Sprint 9 (Sem. 17-18)</w:t>
+              <w:t>Sprint 9 (</w:t>
+            </w:r>
+            <w:proofErr w:type="spellStart"/>
+            <w:r>
+              <w:rPr>
+                <w:rFonts w:ascii="Arial" w:hAnsi="Arial" w:cs="Arial"/>
+                <w:color w:val="000000" w:themeColor="text1"/>
+                <w:sz w:val="24"/>
+                <w:szCs w:val="24"/>
+              </w:rPr>
+              <w:t>Sem</w:t>
+            </w:r>
+            <w:proofErr w:type="spellEnd"/>
+            <w:r>
+              <w:rPr>
+                <w:rFonts w:ascii="Arial" w:hAnsi="Arial" w:cs="Arial"/>
+                <w:color w:val="000000" w:themeColor="text1"/>
+                <w:sz w:val="24"/>
+                <w:szCs w:val="24"/>
+              </w:rPr>
+              <w:t>. 17-18)</w:t>
             </w:r>
           </w:p>
         </w:tc>
@@ -8404,7 +9626,27 @@
                 <w:sz w:val="24"/>
                 <w:szCs w:val="24"/>
               </w:rPr>
-              <w:t>Integración técnica de Leaflet.js y OpenStreetMap en la plataforma.</w:t>
+              <w:t xml:space="preserve">Integración técnica de Leaflet.js y </w:t>
+            </w:r>
+            <w:proofErr w:type="spellStart"/>
+            <w:r>
+              <w:rPr>
+                <w:rFonts w:ascii="Arial" w:hAnsi="Arial" w:cs="Arial"/>
+                <w:color w:val="000000" w:themeColor="text1"/>
+                <w:sz w:val="24"/>
+                <w:szCs w:val="24"/>
+              </w:rPr>
+              <w:t>OpenStreetMap</w:t>
+            </w:r>
+            <w:proofErr w:type="spellEnd"/>
+            <w:r>
+              <w:rPr>
+                <w:rFonts w:ascii="Arial" w:hAnsi="Arial" w:cs="Arial"/>
+                <w:color w:val="000000" w:themeColor="text1"/>
+                <w:sz w:val="24"/>
+                <w:szCs w:val="24"/>
+              </w:rPr>
+              <w:t xml:space="preserve"> en la plataforma.</w:t>
             </w:r>
           </w:p>
         </w:tc>
@@ -8458,7 +9700,27 @@
                 <w:sz w:val="24"/>
                 <w:szCs w:val="24"/>
               </w:rPr>
-              <w:t>Sprint 10 (Sem. 19-20)</w:t>
+              <w:t>Sprint 10 (</w:t>
+            </w:r>
+            <w:proofErr w:type="spellStart"/>
+            <w:r>
+              <w:rPr>
+                <w:rFonts w:ascii="Arial" w:hAnsi="Arial" w:cs="Arial"/>
+                <w:color w:val="000000" w:themeColor="text1"/>
+                <w:sz w:val="24"/>
+                <w:szCs w:val="24"/>
+              </w:rPr>
+              <w:t>Sem</w:t>
+            </w:r>
+            <w:proofErr w:type="spellEnd"/>
+            <w:r>
+              <w:rPr>
+                <w:rFonts w:ascii="Arial" w:hAnsi="Arial" w:cs="Arial"/>
+                <w:color w:val="000000" w:themeColor="text1"/>
+                <w:sz w:val="24"/>
+                <w:szCs w:val="24"/>
+              </w:rPr>
+              <w:t>. 19-20)</w:t>
             </w:r>
           </w:p>
         </w:tc>
@@ -8564,7 +9826,27 @@
                 <w:sz w:val="24"/>
                 <w:szCs w:val="24"/>
               </w:rPr>
-              <w:t>Sprint 11 (Sem. 21-22)</w:t>
+              <w:t>Sprint 11 (</w:t>
+            </w:r>
+            <w:proofErr w:type="spellStart"/>
+            <w:r>
+              <w:rPr>
+                <w:rFonts w:ascii="Arial" w:hAnsi="Arial" w:cs="Arial"/>
+                <w:color w:val="000000" w:themeColor="text1"/>
+                <w:sz w:val="24"/>
+                <w:szCs w:val="24"/>
+              </w:rPr>
+              <w:t>Sem</w:t>
+            </w:r>
+            <w:proofErr w:type="spellEnd"/>
+            <w:r>
+              <w:rPr>
+                <w:rFonts w:ascii="Arial" w:hAnsi="Arial" w:cs="Arial"/>
+                <w:color w:val="000000" w:themeColor="text1"/>
+                <w:sz w:val="24"/>
+                <w:szCs w:val="24"/>
+              </w:rPr>
+              <w:t>. 21-22)</w:t>
             </w:r>
           </w:p>
         </w:tc>
@@ -8670,7 +9952,27 @@
                 <w:sz w:val="24"/>
                 <w:szCs w:val="24"/>
               </w:rPr>
-              <w:t>Sprint 12 (Sem. 23-24)</w:t>
+              <w:t>Sprint 12 (</w:t>
+            </w:r>
+            <w:proofErr w:type="spellStart"/>
+            <w:r>
+              <w:rPr>
+                <w:rFonts w:ascii="Arial" w:hAnsi="Arial" w:cs="Arial"/>
+                <w:color w:val="000000" w:themeColor="text1"/>
+                <w:sz w:val="24"/>
+                <w:szCs w:val="24"/>
+              </w:rPr>
+              <w:t>Sem</w:t>
+            </w:r>
+            <w:proofErr w:type="spellEnd"/>
+            <w:r>
+              <w:rPr>
+                <w:rFonts w:ascii="Arial" w:hAnsi="Arial" w:cs="Arial"/>
+                <w:color w:val="000000" w:themeColor="text1"/>
+                <w:sz w:val="24"/>
+                <w:szCs w:val="24"/>
+              </w:rPr>
+              <w:t>. 23-24)</w:t>
             </w:r>
           </w:p>
         </w:tc>
@@ -8841,7 +10143,47 @@
           <w:szCs w:val="24"/>
         </w:rPr>
         <w:br/>
-        <w:t>La Alcaldía de Sucre solicita formalmente agregar la geolocalización de puestos. El equipo inicia el proceso formal de gestión del cambio (solicitud, análisis de impacto y costo-beneficio). Para evitar desvíos en el plazo de 6 meses y presupuesto de 70,000 Bs., se aprueba una solución optimizada (Leaflet.js + OpenStreetMap sin costo de licenciamiento, geolocalización nativa HTML5 y planos SVG) que reduce el esfuerzo y programa su desarrollo formal en los Sprints 9 y 10.</w:t>
+        <w:t xml:space="preserve">La Alcaldía de Sucre solicita formalmente agregar la geolocalización de puestos. El equipo inicia el proceso formal de gestión del cambio (solicitud, análisis de impacto y costo-beneficio). Para evitar desvíos en el plazo de 6 meses y presupuesto de 70,000 Bs., se aprueba una solución optimizada (Leaflet.js + </w:t>
+      </w:r>
+      <w:proofErr w:type="spellStart"/>
+      <w:r>
+        <w:rPr>
+          <w:rFonts w:ascii="Arial" w:hAnsi="Arial" w:cs="Arial"/>
+          <w:color w:val="000000" w:themeColor="text1"/>
+          <w:sz w:val="24"/>
+          <w:szCs w:val="24"/>
+        </w:rPr>
+        <w:t>OpenStreetMap</w:t>
+      </w:r>
+      <w:proofErr w:type="spellEnd"/>
+      <w:r>
+        <w:rPr>
+          <w:rFonts w:ascii="Arial" w:hAnsi="Arial" w:cs="Arial"/>
+          <w:color w:val="000000" w:themeColor="text1"/>
+          <w:sz w:val="24"/>
+          <w:szCs w:val="24"/>
+        </w:rPr>
+        <w:t xml:space="preserve"> sin costo de licenciamiento, geolocalización nativa HTML5 y planos SVG) que reduce el esfuerzo y programa su desarrollo formal en los </w:t>
+      </w:r>
+      <w:proofErr w:type="spellStart"/>
+      <w:r>
+        <w:rPr>
+          <w:rFonts w:ascii="Arial" w:hAnsi="Arial" w:cs="Arial"/>
+          <w:color w:val="000000" w:themeColor="text1"/>
+          <w:sz w:val="24"/>
+          <w:szCs w:val="24"/>
+        </w:rPr>
+        <w:t>Sprints</w:t>
+      </w:r>
+      <w:proofErr w:type="spellEnd"/>
+      <w:r>
+        <w:rPr>
+          <w:rFonts w:ascii="Arial" w:hAnsi="Arial" w:cs="Arial"/>
+          <w:color w:val="000000" w:themeColor="text1"/>
+          <w:sz w:val="24"/>
+          <w:szCs w:val="24"/>
+        </w:rPr>
+        <w:t xml:space="preserve"> 9 y 10.</w:t>
       </w:r>
       <w:r>
         <w:rPr>
@@ -8870,7 +10212,27 @@
           <w:szCs w:val="24"/>
         </w:rPr>
         <w:br/>
-        <w:t>La renuncia de dos desarrolladores se materializa al final del Sprint 6. Se activa el plan de contingencia de riesgos: reestimación de la velocidad del equipo (se reduce la capacidad en un 30%), redistribución de tareas críticas de base de datos a los desarrolladores restantes, y priorización de requerimientos. El uso de la solución de geolocalización de bajo esfuerzo (Leaflet.js) en los Sprints 9 y 10 mitiga la pérdida de capacidad, manteniendo viable la fecha de entrega del MVP en la semana 24.</w:t>
+        <w:t xml:space="preserve">La renuncia de dos desarrolladores se materializa al final del Sprint 6. Se activa el plan de contingencia de riesgos: reestimación de la velocidad del equipo (se reduce la capacidad en un 30%), redistribución de tareas críticas de base de datos a los desarrolladores restantes, y priorización de requerimientos. El uso de la solución de geolocalización de bajo esfuerzo (Leaflet.js) en los </w:t>
+      </w:r>
+      <w:proofErr w:type="spellStart"/>
+      <w:r>
+        <w:rPr>
+          <w:rFonts w:ascii="Arial" w:hAnsi="Arial" w:cs="Arial"/>
+          <w:color w:val="000000" w:themeColor="text1"/>
+          <w:sz w:val="24"/>
+          <w:szCs w:val="24"/>
+        </w:rPr>
+        <w:t>Sprints</w:t>
+      </w:r>
+      <w:proofErr w:type="spellEnd"/>
+      <w:r>
+        <w:rPr>
+          <w:rFonts w:ascii="Arial" w:hAnsi="Arial" w:cs="Arial"/>
+          <w:color w:val="000000" w:themeColor="text1"/>
+          <w:sz w:val="24"/>
+          <w:szCs w:val="24"/>
+        </w:rPr>
+        <w:t xml:space="preserve"> 9 y 10 mitiga la pérdida de capacidad, manteniendo viable la fecha de entrega del MVP en la semana 24.</w:t>
       </w:r>
       <w:r>
         <w:rPr>
@@ -8899,7 +10261,87 @@
           <w:szCs w:val="24"/>
         </w:rPr>
         <w:br/>
-        <w:t>Al inicio del Sprint 7, entra en vigencia una nueva normativa municipal sobre licencias de salubridad. Se realiza una sesión de Backlog Refinement con el Product Owner para ajustar las reglas de negocio en la base de datos (RF-4.1) sin alterar el cronograma, ya que el módulo de licencias sanitarias inicia su desarrollo precisamente en este sprint (Sprints 7 y 8).</w:t>
+        <w:t xml:space="preserve">Al inicio del Sprint 7, entra en vigencia una nueva normativa municipal sobre licencias de salubridad. Se realiza una sesión de Backlog </w:t>
+      </w:r>
+      <w:proofErr w:type="spellStart"/>
+      <w:r>
+        <w:rPr>
+          <w:rFonts w:ascii="Arial" w:hAnsi="Arial" w:cs="Arial"/>
+          <w:color w:val="000000" w:themeColor="text1"/>
+          <w:sz w:val="24"/>
+          <w:szCs w:val="24"/>
+        </w:rPr>
+        <w:t>Refinement</w:t>
+      </w:r>
+      <w:proofErr w:type="spellEnd"/>
+      <w:r>
+        <w:rPr>
+          <w:rFonts w:ascii="Arial" w:hAnsi="Arial" w:cs="Arial"/>
+          <w:color w:val="000000" w:themeColor="text1"/>
+          <w:sz w:val="24"/>
+          <w:szCs w:val="24"/>
+        </w:rPr>
+        <w:t xml:space="preserve"> con el </w:t>
+      </w:r>
+      <w:proofErr w:type="spellStart"/>
+      <w:r>
+        <w:rPr>
+          <w:rFonts w:ascii="Arial" w:hAnsi="Arial" w:cs="Arial"/>
+          <w:color w:val="000000" w:themeColor="text1"/>
+          <w:sz w:val="24"/>
+          <w:szCs w:val="24"/>
+        </w:rPr>
+        <w:t>Product</w:t>
+      </w:r>
+      <w:proofErr w:type="spellEnd"/>
+      <w:r>
+        <w:rPr>
+          <w:rFonts w:ascii="Arial" w:hAnsi="Arial" w:cs="Arial"/>
+          <w:color w:val="000000" w:themeColor="text1"/>
+          <w:sz w:val="24"/>
+          <w:szCs w:val="24"/>
+        </w:rPr>
+        <w:t xml:space="preserve"> </w:t>
+      </w:r>
+      <w:proofErr w:type="spellStart"/>
+      <w:r>
+        <w:rPr>
+          <w:rFonts w:ascii="Arial" w:hAnsi="Arial" w:cs="Arial"/>
+          <w:color w:val="000000" w:themeColor="text1"/>
+          <w:sz w:val="24"/>
+          <w:szCs w:val="24"/>
+        </w:rPr>
+        <w:t>Owner</w:t>
+      </w:r>
+      <w:proofErr w:type="spellEnd"/>
+      <w:r>
+        <w:rPr>
+          <w:rFonts w:ascii="Arial" w:hAnsi="Arial" w:cs="Arial"/>
+          <w:color w:val="000000" w:themeColor="text1"/>
+          <w:sz w:val="24"/>
+          <w:szCs w:val="24"/>
+        </w:rPr>
+        <w:t xml:space="preserve"> para ajustar las reglas de negocio en la base de datos (RF-4.1) sin alterar el cronograma, ya que el módulo de licencias sanitarias inicia su desarrollo precisamente en este sprint (</w:t>
+      </w:r>
+      <w:proofErr w:type="spellStart"/>
+      <w:r>
+        <w:rPr>
+          <w:rFonts w:ascii="Arial" w:hAnsi="Arial" w:cs="Arial"/>
+          <w:color w:val="000000" w:themeColor="text1"/>
+          <w:sz w:val="24"/>
+          <w:szCs w:val="24"/>
+        </w:rPr>
+        <w:t>Sprints</w:t>
+      </w:r>
+      <w:proofErr w:type="spellEnd"/>
+      <w:r>
+        <w:rPr>
+          <w:rFonts w:ascii="Arial" w:hAnsi="Arial" w:cs="Arial"/>
+          <w:color w:val="000000" w:themeColor="text1"/>
+          <w:sz w:val="24"/>
+          <w:szCs w:val="24"/>
+        </w:rPr>
+        <w:t xml:space="preserve"> 7 y 8).</w:t>
       </w:r>
     </w:p>
     <w:p>
@@ -9142,7 +10584,47 @@
                 <w:sz w:val="24"/>
                 <w:szCs w:val="24"/>
               </w:rPr>
-              <w:t>Jefe de Proyecto, Scrum Master/Frontend, Desarrollador Backend, Analista QA.</w:t>
+              <w:t>Jefe de Proyecto, Scrum Master/</w:t>
+            </w:r>
+            <w:proofErr w:type="spellStart"/>
+            <w:r>
+              <w:rPr>
+                <w:rFonts w:ascii="Arial" w:hAnsi="Arial" w:cs="Arial"/>
+                <w:color w:val="000000" w:themeColor="text1"/>
+                <w:sz w:val="24"/>
+                <w:szCs w:val="24"/>
+              </w:rPr>
+              <w:t>Frontend</w:t>
+            </w:r>
+            <w:proofErr w:type="spellEnd"/>
+            <w:r>
+              <w:rPr>
+                <w:rFonts w:ascii="Arial" w:hAnsi="Arial" w:cs="Arial"/>
+                <w:color w:val="000000" w:themeColor="text1"/>
+                <w:sz w:val="24"/>
+                <w:szCs w:val="24"/>
+              </w:rPr>
+              <w:t xml:space="preserve">, Desarrollador </w:t>
+            </w:r>
+            <w:proofErr w:type="spellStart"/>
+            <w:r>
+              <w:rPr>
+                <w:rFonts w:ascii="Arial" w:hAnsi="Arial" w:cs="Arial"/>
+                <w:color w:val="000000" w:themeColor="text1"/>
+                <w:sz w:val="24"/>
+                <w:szCs w:val="24"/>
+              </w:rPr>
+              <w:t>Backend</w:t>
+            </w:r>
+            <w:proofErr w:type="spellEnd"/>
+            <w:r>
+              <w:rPr>
+                <w:rFonts w:ascii="Arial" w:hAnsi="Arial" w:cs="Arial"/>
+                <w:color w:val="000000" w:themeColor="text1"/>
+                <w:sz w:val="24"/>
+                <w:szCs w:val="24"/>
+              </w:rPr>
+              <w:t>, Analista QA.</w:t>
             </w:r>
           </w:p>
         </w:tc>
@@ -9640,14 +11122,25 @@
                 <w:szCs w:val="24"/>
               </w:rPr>
             </w:pPr>
-            <w:r>
-              <w:rPr>
-                <w:rFonts w:ascii="Arial" w:hAnsi="Arial" w:cs="Arial"/>
-                <w:color w:val="000000" w:themeColor="text1"/>
-                <w:sz w:val="24"/>
-                <w:szCs w:val="24"/>
-              </w:rPr>
-              <w:t>TOTAL PRESUPUESTO</w:t>
+            <w:proofErr w:type="gramStart"/>
+            <w:r>
+              <w:rPr>
+                <w:rFonts w:ascii="Arial" w:hAnsi="Arial" w:cs="Arial"/>
+                <w:color w:val="000000" w:themeColor="text1"/>
+                <w:sz w:val="24"/>
+                <w:szCs w:val="24"/>
+              </w:rPr>
+              <w:t>TOTAL</w:t>
+            </w:r>
+            <w:proofErr w:type="gramEnd"/>
+            <w:r>
+              <w:rPr>
+                <w:rFonts w:ascii="Arial" w:hAnsi="Arial" w:cs="Arial"/>
+                <w:color w:val="000000" w:themeColor="text1"/>
+                <w:sz w:val="24"/>
+                <w:szCs w:val="24"/>
+              </w:rPr>
+              <w:t xml:space="preserve"> PRESUPUESTO</w:t>
             </w:r>
           </w:p>
         </w:tc>
@@ -9938,14 +11431,45 @@
                 <w:szCs w:val="24"/>
               </w:rPr>
             </w:pPr>
-            <w:r>
-              <w:rPr>
-                <w:rFonts w:ascii="Arial" w:hAnsi="Arial" w:cs="Arial"/>
-                <w:color w:val="000000" w:themeColor="text1"/>
-                <w:sz w:val="24"/>
-                <w:szCs w:val="24"/>
-              </w:rPr>
-              <w:t>Kickoff, Inception, SRS, Prototipos responsivos y Plan de Proyecto.</w:t>
+            <w:proofErr w:type="spellStart"/>
+            <w:r>
+              <w:rPr>
+                <w:rFonts w:ascii="Arial" w:hAnsi="Arial" w:cs="Arial"/>
+                <w:color w:val="000000" w:themeColor="text1"/>
+                <w:sz w:val="24"/>
+                <w:szCs w:val="24"/>
+              </w:rPr>
+              <w:t>Kickoff</w:t>
+            </w:r>
+            <w:proofErr w:type="spellEnd"/>
+            <w:r>
+              <w:rPr>
+                <w:rFonts w:ascii="Arial" w:hAnsi="Arial" w:cs="Arial"/>
+                <w:color w:val="000000" w:themeColor="text1"/>
+                <w:sz w:val="24"/>
+                <w:szCs w:val="24"/>
+              </w:rPr>
+              <w:t xml:space="preserve">, </w:t>
+            </w:r>
+            <w:proofErr w:type="spellStart"/>
+            <w:r>
+              <w:rPr>
+                <w:rFonts w:ascii="Arial" w:hAnsi="Arial" w:cs="Arial"/>
+                <w:color w:val="000000" w:themeColor="text1"/>
+                <w:sz w:val="24"/>
+                <w:szCs w:val="24"/>
+              </w:rPr>
+              <w:t>Inception</w:t>
+            </w:r>
+            <w:proofErr w:type="spellEnd"/>
+            <w:r>
+              <w:rPr>
+                <w:rFonts w:ascii="Arial" w:hAnsi="Arial" w:cs="Arial"/>
+                <w:color w:val="000000" w:themeColor="text1"/>
+                <w:sz w:val="24"/>
+                <w:szCs w:val="24"/>
+              </w:rPr>
+              <w:t>, SRS, Prototipos responsivos y Plan de Proyecto.</w:t>
             </w:r>
           </w:p>
         </w:tc>
@@ -10393,14 +11917,25 @@
                 <w:szCs w:val="24"/>
               </w:rPr>
             </w:pPr>
-            <w:r>
-              <w:rPr>
-                <w:rFonts w:ascii="Arial" w:hAnsi="Arial" w:cs="Arial"/>
-                <w:color w:val="000000" w:themeColor="text1"/>
-                <w:sz w:val="24"/>
-                <w:szCs w:val="24"/>
-              </w:rPr>
-              <w:t>TOTAL ACUMULADO</w:t>
+            <w:proofErr w:type="gramStart"/>
+            <w:r>
+              <w:rPr>
+                <w:rFonts w:ascii="Arial" w:hAnsi="Arial" w:cs="Arial"/>
+                <w:color w:val="000000" w:themeColor="text1"/>
+                <w:sz w:val="24"/>
+                <w:szCs w:val="24"/>
+              </w:rPr>
+              <w:t>TOTAL</w:t>
+            </w:r>
+            <w:proofErr w:type="gramEnd"/>
+            <w:r>
+              <w:rPr>
+                <w:rFonts w:ascii="Arial" w:hAnsi="Arial" w:cs="Arial"/>
+                <w:color w:val="000000" w:themeColor="text1"/>
+                <w:sz w:val="24"/>
+                <w:szCs w:val="24"/>
+              </w:rPr>
+              <w:t xml:space="preserve"> ACUMULADO</w:t>
             </w:r>
           </w:p>
         </w:tc>
@@ -10520,7 +12055,27 @@
           <w:sz w:val="24"/>
           <w:szCs w:val="24"/>
         </w:rPr>
-        <w:t>La incorporación de geolocalización se financió utilizando la Reserva de Contingencia (7,000 Bs.) para cubrir las horas extra de desarrollo del equipo restante. Gracias al uso de tecnologías gratuitas (Leaflet.js y OpenStreetMap), no se incurrió en costos extras por licenciamiento de software, manteniendo la línea base financiera en 70,000 Bs.</w:t>
+        <w:t xml:space="preserve">La incorporación de geolocalización se financió utilizando la Reserva de Contingencia (7,000 Bs.) para cubrir las horas extra de desarrollo del equipo restante. Gracias al uso de tecnologías gratuitas (Leaflet.js y </w:t>
+      </w:r>
+      <w:proofErr w:type="spellStart"/>
+      <w:r>
+        <w:rPr>
+          <w:rFonts w:ascii="Arial" w:hAnsi="Arial" w:cs="Arial"/>
+          <w:color w:val="000000" w:themeColor="text1"/>
+          <w:sz w:val="24"/>
+          <w:szCs w:val="24"/>
+        </w:rPr>
+        <w:t>OpenStreetMap</w:t>
+      </w:r>
+      <w:proofErr w:type="spellEnd"/>
+      <w:r>
+        <w:rPr>
+          <w:rFonts w:ascii="Arial" w:hAnsi="Arial" w:cs="Arial"/>
+          <w:color w:val="000000" w:themeColor="text1"/>
+          <w:sz w:val="24"/>
+          <w:szCs w:val="24"/>
+        </w:rPr>
+        <w:t>), no se incurrió en costos extras por licenciamiento de software, manteniendo la línea base financiera en 70,000 Bs.</w:t>
       </w:r>
     </w:p>
     <w:p>
@@ -10574,7 +12129,27 @@
           <w:sz w:val="24"/>
           <w:szCs w:val="24"/>
         </w:rPr>
-        <w:t xml:space="preserve">Tras la renuncia del desarrollador backend y el analista de pruebas (QA), los saldos de presupuesto mensual correspondientes a sus honorarios no devengados para los meses 4, 5 y 6 fueron reasignados. Se destinó una parte para cubrir incentivos por sobreesfuerzo al SM y PM (quienes absorbieron parte de la carga técnica) y el resto se utilizó para contratar soporte temporal de QA </w:t>
+        <w:t xml:space="preserve">Tras la renuncia del desarrollador </w:t>
+      </w:r>
+      <w:proofErr w:type="spellStart"/>
+      <w:r>
+        <w:rPr>
+          <w:rFonts w:ascii="Arial" w:hAnsi="Arial" w:cs="Arial"/>
+          <w:color w:val="000000" w:themeColor="text1"/>
+          <w:sz w:val="24"/>
+          <w:szCs w:val="24"/>
+        </w:rPr>
+        <w:t>backend</w:t>
+      </w:r>
+      <w:proofErr w:type="spellEnd"/>
+      <w:r>
+        <w:rPr>
+          <w:rFonts w:ascii="Arial" w:hAnsi="Arial" w:cs="Arial"/>
+          <w:color w:val="000000" w:themeColor="text1"/>
+          <w:sz w:val="24"/>
+          <w:szCs w:val="24"/>
+        </w:rPr>
+        <w:t xml:space="preserve"> y el analista de pruebas (QA), los saldos de presupuesto mensual correspondientes a sus honorarios no devengados para los meses 4, 5 y 6 fueron reasignados. Se destinó una parte para cubrir incentivos por sobreesfuerzo al SM y PM (quienes absorbieron parte de la carga técnica) y el resto se utilizó para contratar soporte temporal de QA </w:t>
       </w:r>
       <w:r>
         <w:rPr>
@@ -10586,6 +12161,2056 @@
         <w:lastRenderedPageBreak/>
         <w:t>externo por horas durante la fase final de pruebas del Sprint 11, garantizando que el costo de recursos humanos no excediera los 52,500 Bs. presupuestados.</w:t>
       </w:r>
+    </w:p>
+    <w:p>
+      <w:pPr>
+        <w:spacing w:line="360" w:lineRule="auto"/>
+        <w:jc w:val="both"/>
+        <w:rPr>
+          <w:rFonts w:ascii="Arial" w:hAnsi="Arial" w:cs="Arial"/>
+          <w:color w:val="000000" w:themeColor="text1"/>
+          <w:sz w:val="24"/>
+          <w:szCs w:val="24"/>
+        </w:rPr>
+      </w:pPr>
+    </w:p>
+    <w:p>
+      <w:pPr>
+        <w:pStyle w:val="Ttulo1"/>
+        <w:rPr>
+          <w:color w:val="000000" w:themeColor="text1"/>
+        </w:rPr>
+      </w:pPr>
+      <w:r>
+        <w:rPr>
+          <w:color w:val="000000" w:themeColor="text1"/>
+        </w:rPr>
+        <w:t>PLAN DE RECURSOS DEL PROYECTO</w:t>
+      </w:r>
+    </w:p>
+    <w:p>
+      <w:pPr>
+        <w:spacing w:after="240" w:line="360" w:lineRule="auto"/>
+        <w:rPr>
+          <w:rFonts w:ascii="Arial" w:hAnsi="Arial" w:cs="Arial"/>
+          <w:color w:val="000000" w:themeColor="text1"/>
+        </w:rPr>
+      </w:pPr>
+    </w:p>
+    <w:p>
+      <w:pPr>
+        <w:pStyle w:val="Ttulo2"/>
+        <w:spacing w:line="360" w:lineRule="auto"/>
+        <w:rPr>
+          <w:rFonts w:ascii="Arial" w:hAnsi="Arial" w:cs="Arial"/>
+          <w:color w:val="000000" w:themeColor="text1"/>
+        </w:rPr>
+      </w:pPr>
+      <w:r>
+        <w:rPr>
+          <w:rFonts w:ascii="Arial" w:hAnsi="Arial" w:cs="Arial"/>
+          <w:color w:val="000000" w:themeColor="text1"/>
+        </w:rPr>
+        <w:t>Introducción</w:t>
+      </w:r>
+    </w:p>
+    <w:p/>
+    <w:p>
+      <w:pPr>
+        <w:spacing w:line="360" w:lineRule="auto"/>
+        <w:rPr>
+          <w:rFonts w:ascii="Arial" w:hAnsi="Arial" w:cs="Arial"/>
+          <w:color w:val="000000" w:themeColor="text1"/>
+        </w:rPr>
+      </w:pPr>
+      <w:r>
+        <w:rPr>
+          <w:rFonts w:ascii="Arial" w:hAnsi="Arial" w:cs="Arial"/>
+          <w:color w:val="000000" w:themeColor="text1"/>
+        </w:rPr>
+        <w:t>Este documento define la estructura y asignación de recursos humanos y físicos del proyecto para el desarrollo del MVP. El plan original contempla un equipo de 4 personas. Adicionalmente, se incluye el plan de reestructuración de recursos diseñado para afrontar la contingencia del personal técnico a partir de la semana 12.</w:t>
+      </w:r>
+    </w:p>
+    <w:p>
+      <w:pPr>
+        <w:pStyle w:val="Ttulo2"/>
+        <w:spacing w:line="360" w:lineRule="auto"/>
+        <w:rPr>
+          <w:rFonts w:ascii="Arial" w:hAnsi="Arial" w:cs="Arial"/>
+          <w:color w:val="000000" w:themeColor="text1"/>
+        </w:rPr>
+      </w:pPr>
+      <w:r>
+        <w:rPr>
+          <w:rFonts w:ascii="Arial" w:hAnsi="Arial" w:cs="Arial"/>
+          <w:color w:val="000000" w:themeColor="text1"/>
+        </w:rPr>
+        <w:t>Asignación de Recursos Humanos Inicial</w:t>
+      </w:r>
+    </w:p>
+    <w:p/>
+    <w:p>
+      <w:pPr>
+        <w:spacing w:line="360" w:lineRule="auto"/>
+        <w:rPr>
+          <w:rFonts w:ascii="Arial" w:hAnsi="Arial" w:cs="Arial"/>
+          <w:color w:val="000000" w:themeColor="text1"/>
+        </w:rPr>
+      </w:pPr>
+      <w:r>
+        <w:rPr>
+          <w:rFonts w:ascii="Arial" w:hAnsi="Arial" w:cs="Arial"/>
+          <w:color w:val="000000" w:themeColor="text1"/>
+        </w:rPr>
+        <w:t>Distribución original de responsabilidades, dedicación horaria y costos del personal técnico:</w:t>
+      </w:r>
+    </w:p>
+    <w:tbl>
+      <w:tblPr>
+        <w:tblStyle w:val="Tablaconcuadrcula"/>
+        <w:tblW w:w="0" w:type="auto"/>
+        <w:tblLook w:val="04A0" w:firstRow="1" w:lastRow="0" w:firstColumn="1" w:lastColumn="0" w:noHBand="0" w:noVBand="1"/>
+      </w:tblPr>
+      <w:tblGrid>
+        <w:gridCol w:w="1756"/>
+        <w:gridCol w:w="2076"/>
+        <w:gridCol w:w="1677"/>
+        <w:gridCol w:w="1588"/>
+        <w:gridCol w:w="1533"/>
+      </w:tblGrid>
+      <w:tr>
+        <w:tc>
+          <w:tcPr>
+            <w:tcW w:w="1872" w:type="dxa"/>
+          </w:tcPr>
+          <w:p>
+            <w:pPr>
+              <w:spacing w:line="360" w:lineRule="auto"/>
+              <w:rPr>
+                <w:rFonts w:ascii="Arial" w:hAnsi="Arial" w:cs="Arial"/>
+                <w:color w:val="000000" w:themeColor="text1"/>
+              </w:rPr>
+            </w:pPr>
+            <w:r>
+              <w:rPr>
+                <w:rFonts w:ascii="Arial" w:hAnsi="Arial" w:cs="Arial"/>
+                <w:color w:val="000000" w:themeColor="text1"/>
+              </w:rPr>
+              <w:t>Rol</w:t>
+            </w:r>
+          </w:p>
+        </w:tc>
+        <w:tc>
+          <w:tcPr>
+            <w:tcW w:w="1872" w:type="dxa"/>
+          </w:tcPr>
+          <w:p>
+            <w:pPr>
+              <w:spacing w:line="360" w:lineRule="auto"/>
+              <w:rPr>
+                <w:rFonts w:ascii="Arial" w:hAnsi="Arial" w:cs="Arial"/>
+                <w:color w:val="000000" w:themeColor="text1"/>
+              </w:rPr>
+            </w:pPr>
+            <w:r>
+              <w:rPr>
+                <w:rFonts w:ascii="Arial" w:hAnsi="Arial" w:cs="Arial"/>
+                <w:color w:val="000000" w:themeColor="text1"/>
+              </w:rPr>
+              <w:t>Responsabilidades Clave</w:t>
+            </w:r>
+          </w:p>
+        </w:tc>
+        <w:tc>
+          <w:tcPr>
+            <w:tcW w:w="1872" w:type="dxa"/>
+          </w:tcPr>
+          <w:p>
+            <w:pPr>
+              <w:spacing w:line="360" w:lineRule="auto"/>
+              <w:rPr>
+                <w:rFonts w:ascii="Arial" w:hAnsi="Arial" w:cs="Arial"/>
+                <w:color w:val="000000" w:themeColor="text1"/>
+              </w:rPr>
+            </w:pPr>
+            <w:r>
+              <w:rPr>
+                <w:rFonts w:ascii="Arial" w:hAnsi="Arial" w:cs="Arial"/>
+                <w:color w:val="000000" w:themeColor="text1"/>
+              </w:rPr>
+              <w:t>Dedicación</w:t>
+            </w:r>
+          </w:p>
+        </w:tc>
+        <w:tc>
+          <w:tcPr>
+            <w:tcW w:w="1872" w:type="dxa"/>
+          </w:tcPr>
+          <w:p>
+            <w:pPr>
+              <w:spacing w:line="360" w:lineRule="auto"/>
+              <w:rPr>
+                <w:rFonts w:ascii="Arial" w:hAnsi="Arial" w:cs="Arial"/>
+                <w:color w:val="000000" w:themeColor="text1"/>
+              </w:rPr>
+            </w:pPr>
+            <w:r>
+              <w:rPr>
+                <w:rFonts w:ascii="Arial" w:hAnsi="Arial" w:cs="Arial"/>
+                <w:color w:val="000000" w:themeColor="text1"/>
+              </w:rPr>
+              <w:t>Costo Mensual</w:t>
+            </w:r>
+          </w:p>
+        </w:tc>
+        <w:tc>
+          <w:tcPr>
+            <w:tcW w:w="1872" w:type="dxa"/>
+          </w:tcPr>
+          <w:p>
+            <w:pPr>
+              <w:spacing w:line="360" w:lineRule="auto"/>
+              <w:rPr>
+                <w:rFonts w:ascii="Arial" w:hAnsi="Arial" w:cs="Arial"/>
+                <w:color w:val="000000" w:themeColor="text1"/>
+              </w:rPr>
+            </w:pPr>
+            <w:r>
+              <w:rPr>
+                <w:rFonts w:ascii="Arial" w:hAnsi="Arial" w:cs="Arial"/>
+                <w:color w:val="000000" w:themeColor="text1"/>
+              </w:rPr>
+              <w:t xml:space="preserve">Total (12 </w:t>
+            </w:r>
+            <w:proofErr w:type="spellStart"/>
+            <w:r>
+              <w:rPr>
+                <w:rFonts w:ascii="Arial" w:hAnsi="Arial" w:cs="Arial"/>
+                <w:color w:val="000000" w:themeColor="text1"/>
+              </w:rPr>
+              <w:t>sem</w:t>
+            </w:r>
+            <w:proofErr w:type="spellEnd"/>
+            <w:r>
+              <w:rPr>
+                <w:rFonts w:ascii="Arial" w:hAnsi="Arial" w:cs="Arial"/>
+                <w:color w:val="000000" w:themeColor="text1"/>
+              </w:rPr>
+              <w:t>)</w:t>
+            </w:r>
+          </w:p>
+        </w:tc>
+      </w:tr>
+      <w:tr>
+        <w:tc>
+          <w:tcPr>
+            <w:tcW w:w="1872" w:type="dxa"/>
+          </w:tcPr>
+          <w:p>
+            <w:pPr>
+              <w:spacing w:line="360" w:lineRule="auto"/>
+              <w:rPr>
+                <w:rFonts w:ascii="Arial" w:hAnsi="Arial" w:cs="Arial"/>
+                <w:color w:val="000000" w:themeColor="text1"/>
+              </w:rPr>
+            </w:pPr>
+            <w:r>
+              <w:rPr>
+                <w:rFonts w:ascii="Arial" w:hAnsi="Arial" w:cs="Arial"/>
+                <w:color w:val="000000" w:themeColor="text1"/>
+              </w:rPr>
+              <w:t>Jefe de Proyecto</w:t>
+            </w:r>
+          </w:p>
+        </w:tc>
+        <w:tc>
+          <w:tcPr>
+            <w:tcW w:w="1872" w:type="dxa"/>
+          </w:tcPr>
+          <w:p>
+            <w:pPr>
+              <w:spacing w:line="360" w:lineRule="auto"/>
+              <w:rPr>
+                <w:rFonts w:ascii="Arial" w:hAnsi="Arial" w:cs="Arial"/>
+                <w:color w:val="000000" w:themeColor="text1"/>
+              </w:rPr>
+            </w:pPr>
+            <w:r>
+              <w:rPr>
+                <w:rFonts w:ascii="Arial" w:hAnsi="Arial" w:cs="Arial"/>
+                <w:color w:val="000000" w:themeColor="text1"/>
+              </w:rPr>
+              <w:t>Gobernanza tradicional, reportes, riesgos y control de cambios.</w:t>
+            </w:r>
+          </w:p>
+        </w:tc>
+        <w:tc>
+          <w:tcPr>
+            <w:tcW w:w="1872" w:type="dxa"/>
+          </w:tcPr>
+          <w:p>
+            <w:pPr>
+              <w:spacing w:line="360" w:lineRule="auto"/>
+              <w:rPr>
+                <w:rFonts w:ascii="Arial" w:hAnsi="Arial" w:cs="Arial"/>
+                <w:color w:val="000000" w:themeColor="text1"/>
+              </w:rPr>
+            </w:pPr>
+            <w:r>
+              <w:rPr>
+                <w:rFonts w:ascii="Arial" w:hAnsi="Arial" w:cs="Arial"/>
+                <w:color w:val="000000" w:themeColor="text1"/>
+              </w:rPr>
+              <w:t xml:space="preserve">10 </w:t>
+            </w:r>
+            <w:proofErr w:type="spellStart"/>
+            <w:r>
+              <w:rPr>
+                <w:rFonts w:ascii="Arial" w:hAnsi="Arial" w:cs="Arial"/>
+                <w:color w:val="000000" w:themeColor="text1"/>
+              </w:rPr>
+              <w:t>hrs</w:t>
+            </w:r>
+            <w:proofErr w:type="spellEnd"/>
+            <w:r>
+              <w:rPr>
+                <w:rFonts w:ascii="Arial" w:hAnsi="Arial" w:cs="Arial"/>
+                <w:color w:val="000000" w:themeColor="text1"/>
+              </w:rPr>
+              <w:t>/</w:t>
+            </w:r>
+            <w:proofErr w:type="spellStart"/>
+            <w:r>
+              <w:rPr>
+                <w:rFonts w:ascii="Arial" w:hAnsi="Arial" w:cs="Arial"/>
+                <w:color w:val="000000" w:themeColor="text1"/>
+              </w:rPr>
+              <w:t>sem</w:t>
+            </w:r>
+            <w:proofErr w:type="spellEnd"/>
+          </w:p>
+        </w:tc>
+        <w:tc>
+          <w:tcPr>
+            <w:tcW w:w="1872" w:type="dxa"/>
+          </w:tcPr>
+          <w:p>
+            <w:pPr>
+              <w:spacing w:line="360" w:lineRule="auto"/>
+              <w:rPr>
+                <w:rFonts w:ascii="Arial" w:hAnsi="Arial" w:cs="Arial"/>
+                <w:color w:val="000000" w:themeColor="text1"/>
+              </w:rPr>
+            </w:pPr>
+            <w:r>
+              <w:rPr>
+                <w:rFonts w:ascii="Arial" w:hAnsi="Arial" w:cs="Arial"/>
+                <w:color w:val="000000" w:themeColor="text1"/>
+              </w:rPr>
+              <w:t>1,750 Bs.</w:t>
+            </w:r>
+          </w:p>
+        </w:tc>
+        <w:tc>
+          <w:tcPr>
+            <w:tcW w:w="1872" w:type="dxa"/>
+          </w:tcPr>
+          <w:p>
+            <w:pPr>
+              <w:spacing w:line="360" w:lineRule="auto"/>
+              <w:rPr>
+                <w:rFonts w:ascii="Arial" w:hAnsi="Arial" w:cs="Arial"/>
+                <w:color w:val="000000" w:themeColor="text1"/>
+              </w:rPr>
+            </w:pPr>
+            <w:r>
+              <w:rPr>
+                <w:rFonts w:ascii="Arial" w:hAnsi="Arial" w:cs="Arial"/>
+                <w:color w:val="000000" w:themeColor="text1"/>
+              </w:rPr>
+              <w:t>5,250 Bs.</w:t>
+            </w:r>
+          </w:p>
+        </w:tc>
+      </w:tr>
+      <w:tr>
+        <w:tc>
+          <w:tcPr>
+            <w:tcW w:w="1872" w:type="dxa"/>
+          </w:tcPr>
+          <w:p>
+            <w:pPr>
+              <w:spacing w:line="360" w:lineRule="auto"/>
+              <w:rPr>
+                <w:rFonts w:ascii="Arial" w:hAnsi="Arial" w:cs="Arial"/>
+                <w:color w:val="000000" w:themeColor="text1"/>
+              </w:rPr>
+            </w:pPr>
+            <w:r>
+              <w:rPr>
+                <w:rFonts w:ascii="Arial" w:hAnsi="Arial" w:cs="Arial"/>
+                <w:color w:val="000000" w:themeColor="text1"/>
+              </w:rPr>
+              <w:t xml:space="preserve">Scrum Master / </w:t>
+            </w:r>
+            <w:proofErr w:type="spellStart"/>
+            <w:r>
+              <w:rPr>
+                <w:rFonts w:ascii="Arial" w:hAnsi="Arial" w:cs="Arial"/>
+                <w:color w:val="000000" w:themeColor="text1"/>
+              </w:rPr>
+              <w:t>Frontend</w:t>
+            </w:r>
+            <w:proofErr w:type="spellEnd"/>
+          </w:p>
+        </w:tc>
+        <w:tc>
+          <w:tcPr>
+            <w:tcW w:w="1872" w:type="dxa"/>
+          </w:tcPr>
+          <w:p>
+            <w:pPr>
+              <w:spacing w:line="360" w:lineRule="auto"/>
+              <w:rPr>
+                <w:rFonts w:ascii="Arial" w:hAnsi="Arial" w:cs="Arial"/>
+                <w:color w:val="000000" w:themeColor="text1"/>
+              </w:rPr>
+            </w:pPr>
+            <w:r>
+              <w:rPr>
+                <w:rFonts w:ascii="Arial" w:hAnsi="Arial" w:cs="Arial"/>
+                <w:color w:val="000000" w:themeColor="text1"/>
+              </w:rPr>
+              <w:t>Facilitación de Scrum, desarrollo de interfaz responsiva móvil.</w:t>
+            </w:r>
+          </w:p>
+        </w:tc>
+        <w:tc>
+          <w:tcPr>
+            <w:tcW w:w="1872" w:type="dxa"/>
+          </w:tcPr>
+          <w:p>
+            <w:pPr>
+              <w:spacing w:line="360" w:lineRule="auto"/>
+              <w:rPr>
+                <w:rFonts w:ascii="Arial" w:hAnsi="Arial" w:cs="Arial"/>
+                <w:color w:val="000000" w:themeColor="text1"/>
+              </w:rPr>
+            </w:pPr>
+            <w:r>
+              <w:rPr>
+                <w:rFonts w:ascii="Arial" w:hAnsi="Arial" w:cs="Arial"/>
+                <w:color w:val="000000" w:themeColor="text1"/>
+              </w:rPr>
+              <w:t xml:space="preserve">20 </w:t>
+            </w:r>
+            <w:proofErr w:type="spellStart"/>
+            <w:r>
+              <w:rPr>
+                <w:rFonts w:ascii="Arial" w:hAnsi="Arial" w:cs="Arial"/>
+                <w:color w:val="000000" w:themeColor="text1"/>
+              </w:rPr>
+              <w:t>hrs</w:t>
+            </w:r>
+            <w:proofErr w:type="spellEnd"/>
+            <w:r>
+              <w:rPr>
+                <w:rFonts w:ascii="Arial" w:hAnsi="Arial" w:cs="Arial"/>
+                <w:color w:val="000000" w:themeColor="text1"/>
+              </w:rPr>
+              <w:t>/</w:t>
+            </w:r>
+            <w:proofErr w:type="spellStart"/>
+            <w:r>
+              <w:rPr>
+                <w:rFonts w:ascii="Arial" w:hAnsi="Arial" w:cs="Arial"/>
+                <w:color w:val="000000" w:themeColor="text1"/>
+              </w:rPr>
+              <w:t>sem</w:t>
+            </w:r>
+            <w:proofErr w:type="spellEnd"/>
+          </w:p>
+        </w:tc>
+        <w:tc>
+          <w:tcPr>
+            <w:tcW w:w="1872" w:type="dxa"/>
+          </w:tcPr>
+          <w:p>
+            <w:pPr>
+              <w:spacing w:line="360" w:lineRule="auto"/>
+              <w:rPr>
+                <w:rFonts w:ascii="Arial" w:hAnsi="Arial" w:cs="Arial"/>
+                <w:color w:val="000000" w:themeColor="text1"/>
+              </w:rPr>
+            </w:pPr>
+            <w:r>
+              <w:rPr>
+                <w:rFonts w:ascii="Arial" w:hAnsi="Arial" w:cs="Arial"/>
+                <w:color w:val="000000" w:themeColor="text1"/>
+              </w:rPr>
+              <w:t>2,916 Bs.</w:t>
+            </w:r>
+          </w:p>
+        </w:tc>
+        <w:tc>
+          <w:tcPr>
+            <w:tcW w:w="1872" w:type="dxa"/>
+          </w:tcPr>
+          <w:p>
+            <w:pPr>
+              <w:spacing w:line="360" w:lineRule="auto"/>
+              <w:rPr>
+                <w:rFonts w:ascii="Arial" w:hAnsi="Arial" w:cs="Arial"/>
+                <w:color w:val="000000" w:themeColor="text1"/>
+              </w:rPr>
+            </w:pPr>
+            <w:r>
+              <w:rPr>
+                <w:rFonts w:ascii="Arial" w:hAnsi="Arial" w:cs="Arial"/>
+                <w:color w:val="000000" w:themeColor="text1"/>
+              </w:rPr>
+              <w:t>8,750 Bs.</w:t>
+            </w:r>
+          </w:p>
+        </w:tc>
+      </w:tr>
+      <w:tr>
+        <w:tc>
+          <w:tcPr>
+            <w:tcW w:w="1872" w:type="dxa"/>
+          </w:tcPr>
+          <w:p>
+            <w:pPr>
+              <w:spacing w:line="360" w:lineRule="auto"/>
+              <w:rPr>
+                <w:rFonts w:ascii="Arial" w:hAnsi="Arial" w:cs="Arial"/>
+                <w:color w:val="000000" w:themeColor="text1"/>
+              </w:rPr>
+            </w:pPr>
+            <w:r>
+              <w:rPr>
+                <w:rFonts w:ascii="Arial" w:hAnsi="Arial" w:cs="Arial"/>
+                <w:color w:val="000000" w:themeColor="text1"/>
+              </w:rPr>
+              <w:t xml:space="preserve">Desarrollador </w:t>
+            </w:r>
+            <w:proofErr w:type="spellStart"/>
+            <w:r>
+              <w:rPr>
+                <w:rFonts w:ascii="Arial" w:hAnsi="Arial" w:cs="Arial"/>
+                <w:color w:val="000000" w:themeColor="text1"/>
+              </w:rPr>
+              <w:t>Backend</w:t>
+            </w:r>
+            <w:proofErr w:type="spellEnd"/>
+          </w:p>
+        </w:tc>
+        <w:tc>
+          <w:tcPr>
+            <w:tcW w:w="1872" w:type="dxa"/>
+          </w:tcPr>
+          <w:p>
+            <w:pPr>
+              <w:spacing w:line="360" w:lineRule="auto"/>
+              <w:rPr>
+                <w:rFonts w:ascii="Arial" w:hAnsi="Arial" w:cs="Arial"/>
+                <w:color w:val="000000" w:themeColor="text1"/>
+              </w:rPr>
+            </w:pPr>
+            <w:r>
+              <w:rPr>
+                <w:rFonts w:ascii="Arial" w:hAnsi="Arial" w:cs="Arial"/>
+                <w:color w:val="000000" w:themeColor="text1"/>
+              </w:rPr>
+              <w:t xml:space="preserve">Desarrollo de API REST, base de </w:t>
+            </w:r>
+            <w:r>
+              <w:rPr>
+                <w:rFonts w:ascii="Arial" w:hAnsi="Arial" w:cs="Arial"/>
+                <w:color w:val="000000" w:themeColor="text1"/>
+              </w:rPr>
+              <w:lastRenderedPageBreak/>
+              <w:t>datos relacional y lógica de cobros.</w:t>
+            </w:r>
+          </w:p>
+        </w:tc>
+        <w:tc>
+          <w:tcPr>
+            <w:tcW w:w="1872" w:type="dxa"/>
+          </w:tcPr>
+          <w:p>
+            <w:pPr>
+              <w:spacing w:line="360" w:lineRule="auto"/>
+              <w:rPr>
+                <w:rFonts w:ascii="Arial" w:hAnsi="Arial" w:cs="Arial"/>
+                <w:color w:val="000000" w:themeColor="text1"/>
+              </w:rPr>
+            </w:pPr>
+            <w:r>
+              <w:rPr>
+                <w:rFonts w:ascii="Arial" w:hAnsi="Arial" w:cs="Arial"/>
+                <w:color w:val="000000" w:themeColor="text1"/>
+              </w:rPr>
+              <w:lastRenderedPageBreak/>
+              <w:t xml:space="preserve">30 </w:t>
+            </w:r>
+            <w:proofErr w:type="spellStart"/>
+            <w:r>
+              <w:rPr>
+                <w:rFonts w:ascii="Arial" w:hAnsi="Arial" w:cs="Arial"/>
+                <w:color w:val="000000" w:themeColor="text1"/>
+              </w:rPr>
+              <w:t>hrs</w:t>
+            </w:r>
+            <w:proofErr w:type="spellEnd"/>
+            <w:r>
+              <w:rPr>
+                <w:rFonts w:ascii="Arial" w:hAnsi="Arial" w:cs="Arial"/>
+                <w:color w:val="000000" w:themeColor="text1"/>
+              </w:rPr>
+              <w:t>/</w:t>
+            </w:r>
+            <w:proofErr w:type="spellStart"/>
+            <w:r>
+              <w:rPr>
+                <w:rFonts w:ascii="Arial" w:hAnsi="Arial" w:cs="Arial"/>
+                <w:color w:val="000000" w:themeColor="text1"/>
+              </w:rPr>
+              <w:t>sem</w:t>
+            </w:r>
+            <w:proofErr w:type="spellEnd"/>
+          </w:p>
+        </w:tc>
+        <w:tc>
+          <w:tcPr>
+            <w:tcW w:w="1872" w:type="dxa"/>
+          </w:tcPr>
+          <w:p>
+            <w:pPr>
+              <w:spacing w:line="360" w:lineRule="auto"/>
+              <w:rPr>
+                <w:rFonts w:ascii="Arial" w:hAnsi="Arial" w:cs="Arial"/>
+                <w:color w:val="000000" w:themeColor="text1"/>
+              </w:rPr>
+            </w:pPr>
+            <w:r>
+              <w:rPr>
+                <w:rFonts w:ascii="Arial" w:hAnsi="Arial" w:cs="Arial"/>
+                <w:color w:val="000000" w:themeColor="text1"/>
+              </w:rPr>
+              <w:t>3,500 Bs.</w:t>
+            </w:r>
+          </w:p>
+        </w:tc>
+        <w:tc>
+          <w:tcPr>
+            <w:tcW w:w="1872" w:type="dxa"/>
+          </w:tcPr>
+          <w:p>
+            <w:pPr>
+              <w:spacing w:line="360" w:lineRule="auto"/>
+              <w:rPr>
+                <w:rFonts w:ascii="Arial" w:hAnsi="Arial" w:cs="Arial"/>
+                <w:color w:val="000000" w:themeColor="text1"/>
+              </w:rPr>
+            </w:pPr>
+            <w:r>
+              <w:rPr>
+                <w:rFonts w:ascii="Arial" w:hAnsi="Arial" w:cs="Arial"/>
+                <w:color w:val="000000" w:themeColor="text1"/>
+              </w:rPr>
+              <w:t>10,500 Bs.</w:t>
+            </w:r>
+          </w:p>
+        </w:tc>
+      </w:tr>
+      <w:tr>
+        <w:tc>
+          <w:tcPr>
+            <w:tcW w:w="1872" w:type="dxa"/>
+          </w:tcPr>
+          <w:p>
+            <w:pPr>
+              <w:spacing w:line="360" w:lineRule="auto"/>
+              <w:rPr>
+                <w:rFonts w:ascii="Arial" w:hAnsi="Arial" w:cs="Arial"/>
+                <w:color w:val="000000" w:themeColor="text1"/>
+              </w:rPr>
+            </w:pPr>
+            <w:r>
+              <w:rPr>
+                <w:rFonts w:ascii="Arial" w:hAnsi="Arial" w:cs="Arial"/>
+                <w:color w:val="000000" w:themeColor="text1"/>
+              </w:rPr>
+              <w:t>Analista QA</w:t>
+            </w:r>
+          </w:p>
+        </w:tc>
+        <w:tc>
+          <w:tcPr>
+            <w:tcW w:w="1872" w:type="dxa"/>
+          </w:tcPr>
+          <w:p>
+            <w:pPr>
+              <w:spacing w:line="360" w:lineRule="auto"/>
+              <w:rPr>
+                <w:rFonts w:ascii="Arial" w:hAnsi="Arial" w:cs="Arial"/>
+                <w:color w:val="000000" w:themeColor="text1"/>
+              </w:rPr>
+            </w:pPr>
+            <w:r>
+              <w:rPr>
+                <w:rFonts w:ascii="Arial" w:hAnsi="Arial" w:cs="Arial"/>
+                <w:color w:val="000000" w:themeColor="text1"/>
+              </w:rPr>
+              <w:t>Pruebas funcionales, control de calidad y casos de prueba sanitarios.</w:t>
+            </w:r>
+          </w:p>
+        </w:tc>
+        <w:tc>
+          <w:tcPr>
+            <w:tcW w:w="1872" w:type="dxa"/>
+          </w:tcPr>
+          <w:p>
+            <w:pPr>
+              <w:spacing w:line="360" w:lineRule="auto"/>
+              <w:rPr>
+                <w:rFonts w:ascii="Arial" w:hAnsi="Arial" w:cs="Arial"/>
+                <w:color w:val="000000" w:themeColor="text1"/>
+              </w:rPr>
+            </w:pPr>
+            <w:r>
+              <w:rPr>
+                <w:rFonts w:ascii="Arial" w:hAnsi="Arial" w:cs="Arial"/>
+                <w:color w:val="000000" w:themeColor="text1"/>
+              </w:rPr>
+              <w:t xml:space="preserve">15 </w:t>
+            </w:r>
+            <w:proofErr w:type="spellStart"/>
+            <w:r>
+              <w:rPr>
+                <w:rFonts w:ascii="Arial" w:hAnsi="Arial" w:cs="Arial"/>
+                <w:color w:val="000000" w:themeColor="text1"/>
+              </w:rPr>
+              <w:t>hrs</w:t>
+            </w:r>
+            <w:proofErr w:type="spellEnd"/>
+            <w:r>
+              <w:rPr>
+                <w:rFonts w:ascii="Arial" w:hAnsi="Arial" w:cs="Arial"/>
+                <w:color w:val="000000" w:themeColor="text1"/>
+              </w:rPr>
+              <w:t>/</w:t>
+            </w:r>
+            <w:proofErr w:type="spellStart"/>
+            <w:r>
+              <w:rPr>
+                <w:rFonts w:ascii="Arial" w:hAnsi="Arial" w:cs="Arial"/>
+                <w:color w:val="000000" w:themeColor="text1"/>
+              </w:rPr>
+              <w:t>sem</w:t>
+            </w:r>
+            <w:proofErr w:type="spellEnd"/>
+          </w:p>
+        </w:tc>
+        <w:tc>
+          <w:tcPr>
+            <w:tcW w:w="1872" w:type="dxa"/>
+          </w:tcPr>
+          <w:p>
+            <w:pPr>
+              <w:spacing w:line="360" w:lineRule="auto"/>
+              <w:rPr>
+                <w:rFonts w:ascii="Arial" w:hAnsi="Arial" w:cs="Arial"/>
+                <w:color w:val="000000" w:themeColor="text1"/>
+              </w:rPr>
+            </w:pPr>
+            <w:r>
+              <w:rPr>
+                <w:rFonts w:ascii="Arial" w:hAnsi="Arial" w:cs="Arial"/>
+                <w:color w:val="000000" w:themeColor="text1"/>
+              </w:rPr>
+              <w:t>1,166 Bs.</w:t>
+            </w:r>
+          </w:p>
+        </w:tc>
+        <w:tc>
+          <w:tcPr>
+            <w:tcW w:w="1872" w:type="dxa"/>
+          </w:tcPr>
+          <w:p>
+            <w:pPr>
+              <w:spacing w:line="360" w:lineRule="auto"/>
+              <w:rPr>
+                <w:rFonts w:ascii="Arial" w:hAnsi="Arial" w:cs="Arial"/>
+                <w:color w:val="000000" w:themeColor="text1"/>
+              </w:rPr>
+            </w:pPr>
+            <w:r>
+              <w:rPr>
+                <w:rFonts w:ascii="Arial" w:hAnsi="Arial" w:cs="Arial"/>
+                <w:color w:val="000000" w:themeColor="text1"/>
+              </w:rPr>
+              <w:t>3,500 Bs.</w:t>
+            </w:r>
+          </w:p>
+        </w:tc>
+      </w:tr>
+      <w:tr>
+        <w:tc>
+          <w:tcPr>
+            <w:tcW w:w="1872" w:type="dxa"/>
+          </w:tcPr>
+          <w:p>
+            <w:pPr>
+              <w:spacing w:line="360" w:lineRule="auto"/>
+              <w:rPr>
+                <w:rFonts w:ascii="Arial" w:hAnsi="Arial" w:cs="Arial"/>
+                <w:color w:val="000000" w:themeColor="text1"/>
+              </w:rPr>
+            </w:pPr>
+            <w:r>
+              <w:rPr>
+                <w:rFonts w:ascii="Arial" w:hAnsi="Arial" w:cs="Arial"/>
+                <w:color w:val="000000" w:themeColor="text1"/>
+              </w:rPr>
+              <w:t>TOTAL</w:t>
+            </w:r>
+          </w:p>
+        </w:tc>
+        <w:tc>
+          <w:tcPr>
+            <w:tcW w:w="1872" w:type="dxa"/>
+          </w:tcPr>
+          <w:p>
+            <w:pPr>
+              <w:spacing w:line="360" w:lineRule="auto"/>
+              <w:rPr>
+                <w:rFonts w:ascii="Arial" w:hAnsi="Arial" w:cs="Arial"/>
+                <w:color w:val="000000" w:themeColor="text1"/>
+              </w:rPr>
+            </w:pPr>
+            <w:proofErr w:type="gramStart"/>
+            <w:r>
+              <w:rPr>
+                <w:rFonts w:ascii="Arial" w:hAnsi="Arial" w:cs="Arial"/>
+                <w:color w:val="000000" w:themeColor="text1"/>
+              </w:rPr>
+              <w:t>Total</w:t>
+            </w:r>
+            <w:proofErr w:type="gramEnd"/>
+            <w:r>
+              <w:rPr>
+                <w:rFonts w:ascii="Arial" w:hAnsi="Arial" w:cs="Arial"/>
+                <w:color w:val="000000" w:themeColor="text1"/>
+              </w:rPr>
+              <w:t xml:space="preserve"> de recursos humanos para la primera mitad del proyecto.</w:t>
+            </w:r>
+          </w:p>
+        </w:tc>
+        <w:tc>
+          <w:tcPr>
+            <w:tcW w:w="1872" w:type="dxa"/>
+          </w:tcPr>
+          <w:p>
+            <w:pPr>
+              <w:spacing w:line="360" w:lineRule="auto"/>
+              <w:rPr>
+                <w:rFonts w:ascii="Arial" w:hAnsi="Arial" w:cs="Arial"/>
+                <w:color w:val="000000" w:themeColor="text1"/>
+              </w:rPr>
+            </w:pPr>
+            <w:r>
+              <w:rPr>
+                <w:rFonts w:ascii="Arial" w:hAnsi="Arial" w:cs="Arial"/>
+                <w:color w:val="000000" w:themeColor="text1"/>
+              </w:rPr>
+              <w:t xml:space="preserve">75 </w:t>
+            </w:r>
+            <w:proofErr w:type="spellStart"/>
+            <w:r>
+              <w:rPr>
+                <w:rFonts w:ascii="Arial" w:hAnsi="Arial" w:cs="Arial"/>
+                <w:color w:val="000000" w:themeColor="text1"/>
+              </w:rPr>
+              <w:t>hrs</w:t>
+            </w:r>
+            <w:proofErr w:type="spellEnd"/>
+            <w:r>
+              <w:rPr>
+                <w:rFonts w:ascii="Arial" w:hAnsi="Arial" w:cs="Arial"/>
+                <w:color w:val="000000" w:themeColor="text1"/>
+              </w:rPr>
+              <w:t>/</w:t>
+            </w:r>
+            <w:proofErr w:type="spellStart"/>
+            <w:r>
+              <w:rPr>
+                <w:rFonts w:ascii="Arial" w:hAnsi="Arial" w:cs="Arial"/>
+                <w:color w:val="000000" w:themeColor="text1"/>
+              </w:rPr>
+              <w:t>sem</w:t>
+            </w:r>
+            <w:proofErr w:type="spellEnd"/>
+          </w:p>
+        </w:tc>
+        <w:tc>
+          <w:tcPr>
+            <w:tcW w:w="1872" w:type="dxa"/>
+          </w:tcPr>
+          <w:p>
+            <w:pPr>
+              <w:spacing w:line="360" w:lineRule="auto"/>
+              <w:rPr>
+                <w:rFonts w:ascii="Arial" w:hAnsi="Arial" w:cs="Arial"/>
+                <w:color w:val="000000" w:themeColor="text1"/>
+              </w:rPr>
+            </w:pPr>
+            <w:r>
+              <w:rPr>
+                <w:rFonts w:ascii="Arial" w:hAnsi="Arial" w:cs="Arial"/>
+                <w:color w:val="000000" w:themeColor="text1"/>
+              </w:rPr>
+              <w:t>9,332 Bs.</w:t>
+            </w:r>
+          </w:p>
+        </w:tc>
+        <w:tc>
+          <w:tcPr>
+            <w:tcW w:w="1872" w:type="dxa"/>
+          </w:tcPr>
+          <w:p>
+            <w:pPr>
+              <w:spacing w:line="360" w:lineRule="auto"/>
+              <w:rPr>
+                <w:rFonts w:ascii="Arial" w:hAnsi="Arial" w:cs="Arial"/>
+                <w:color w:val="000000" w:themeColor="text1"/>
+              </w:rPr>
+            </w:pPr>
+            <w:r>
+              <w:rPr>
+                <w:rFonts w:ascii="Arial" w:hAnsi="Arial" w:cs="Arial"/>
+                <w:color w:val="000000" w:themeColor="text1"/>
+              </w:rPr>
+              <w:t>28,000 Bs.</w:t>
+            </w:r>
+          </w:p>
+        </w:tc>
+      </w:tr>
+    </w:tbl>
+    <w:p>
+      <w:pPr>
+        <w:pStyle w:val="Ttulo2"/>
+        <w:numPr>
+          <w:ilvl w:val="0"/>
+          <w:numId w:val="0"/>
+        </w:numPr>
+        <w:spacing w:line="360" w:lineRule="auto"/>
+        <w:ind w:left="576" w:hanging="576"/>
+        <w:rPr>
+          <w:rFonts w:ascii="Arial" w:hAnsi="Arial" w:cs="Arial"/>
+          <w:color w:val="000000" w:themeColor="text1"/>
+        </w:rPr>
+      </w:pPr>
+    </w:p>
+    <w:p>
+      <w:pPr>
+        <w:pStyle w:val="Ttulo2"/>
+        <w:spacing w:line="360" w:lineRule="auto"/>
+        <w:rPr>
+          <w:rFonts w:ascii="Arial" w:hAnsi="Arial" w:cs="Arial"/>
+          <w:color w:val="000000" w:themeColor="text1"/>
+        </w:rPr>
+      </w:pPr>
+      <w:r>
+        <w:rPr>
+          <w:rFonts w:ascii="Arial" w:hAnsi="Arial" w:cs="Arial"/>
+          <w:color w:val="000000" w:themeColor="text1"/>
+        </w:rPr>
+        <w:t>Plan de Reestructuración por Renuncia de Personal</w:t>
+      </w:r>
+    </w:p>
+    <w:p/>
+    <w:p>
+      <w:pPr>
+        <w:spacing w:line="360" w:lineRule="auto"/>
+        <w:rPr>
+          <w:rFonts w:ascii="Arial" w:hAnsi="Arial" w:cs="Arial"/>
+          <w:color w:val="000000" w:themeColor="text1"/>
+        </w:rPr>
+      </w:pPr>
+      <w:r>
+        <w:rPr>
+          <w:rFonts w:ascii="Arial" w:hAnsi="Arial" w:cs="Arial"/>
+          <w:color w:val="000000" w:themeColor="text1"/>
+        </w:rPr>
+        <w:t xml:space="preserve">A mitad del proyecto (semana 12), se materializa la renuncia del Desarrollador </w:t>
+      </w:r>
+      <w:proofErr w:type="spellStart"/>
+      <w:r>
+        <w:rPr>
+          <w:rFonts w:ascii="Arial" w:hAnsi="Arial" w:cs="Arial"/>
+          <w:color w:val="000000" w:themeColor="text1"/>
+        </w:rPr>
+        <w:t>Backend</w:t>
+      </w:r>
+      <w:proofErr w:type="spellEnd"/>
+      <w:r>
+        <w:rPr>
+          <w:rFonts w:ascii="Arial" w:hAnsi="Arial" w:cs="Arial"/>
+          <w:color w:val="000000" w:themeColor="text1"/>
+        </w:rPr>
+        <w:t xml:space="preserve"> y del Analista QA. Para mantener la viabilidad del MVP de 6 meses y cumplir con la geolocalización, se activa el siguiente plan de reestructuración:</w:t>
+      </w:r>
+    </w:p>
+    <w:p>
+      <w:pPr>
+        <w:pStyle w:val="Listaconvietas"/>
+        <w:spacing w:line="360" w:lineRule="auto"/>
+        <w:rPr>
+          <w:rFonts w:ascii="Arial" w:hAnsi="Arial" w:cs="Arial"/>
+          <w:color w:val="000000" w:themeColor="text1"/>
+        </w:rPr>
+      </w:pPr>
+      <w:r>
+        <w:rPr>
+          <w:rFonts w:ascii="Arial" w:hAnsi="Arial" w:cs="Arial"/>
+          <w:color w:val="000000" w:themeColor="text1"/>
+        </w:rPr>
+        <w:t xml:space="preserve">•Redistribución del Desarrollo Técnico: El Scrum Master/Desarrollador </w:t>
+      </w:r>
+      <w:proofErr w:type="spellStart"/>
+      <w:r>
+        <w:rPr>
+          <w:rFonts w:ascii="Arial" w:hAnsi="Arial" w:cs="Arial"/>
+          <w:color w:val="000000" w:themeColor="text1"/>
+        </w:rPr>
+        <w:t>Frontend</w:t>
+      </w:r>
+      <w:proofErr w:type="spellEnd"/>
+      <w:r>
+        <w:rPr>
+          <w:rFonts w:ascii="Arial" w:hAnsi="Arial" w:cs="Arial"/>
+          <w:color w:val="000000" w:themeColor="text1"/>
+        </w:rPr>
+        <w:t xml:space="preserve"> absorbe el desarrollo </w:t>
+      </w:r>
+      <w:proofErr w:type="spellStart"/>
+      <w:r>
+        <w:rPr>
+          <w:rFonts w:ascii="Arial" w:hAnsi="Arial" w:cs="Arial"/>
+          <w:color w:val="000000" w:themeColor="text1"/>
+        </w:rPr>
+        <w:t>backend</w:t>
+      </w:r>
+      <w:proofErr w:type="spellEnd"/>
+      <w:r>
+        <w:rPr>
+          <w:rFonts w:ascii="Arial" w:hAnsi="Arial" w:cs="Arial"/>
+          <w:color w:val="000000" w:themeColor="text1"/>
+        </w:rPr>
+        <w:t xml:space="preserve"> y la integración de geolocalización. El uso de Leaflet.js y la API nativa de geolocalización de HTML5 (que requiere muy poco código) permite absorber la carga sin retrasar el desarrollo.</w:t>
+      </w:r>
+    </w:p>
+    <w:p>
+      <w:pPr>
+        <w:pStyle w:val="Listaconvietas"/>
+        <w:spacing w:line="360" w:lineRule="auto"/>
+        <w:rPr>
+          <w:rFonts w:ascii="Arial" w:hAnsi="Arial" w:cs="Arial"/>
+          <w:color w:val="000000" w:themeColor="text1"/>
+        </w:rPr>
+      </w:pPr>
+      <w:r>
+        <w:rPr>
+          <w:rFonts w:ascii="Arial" w:hAnsi="Arial" w:cs="Arial"/>
+          <w:color w:val="000000" w:themeColor="text1"/>
+        </w:rPr>
+        <w:t xml:space="preserve">Redistribución de Pruebas (QA): El </w:t>
+      </w:r>
+      <w:proofErr w:type="gramStart"/>
+      <w:r>
+        <w:rPr>
+          <w:rFonts w:ascii="Arial" w:hAnsi="Arial" w:cs="Arial"/>
+          <w:color w:val="000000" w:themeColor="text1"/>
+        </w:rPr>
+        <w:t>Jefe</w:t>
+      </w:r>
+      <w:proofErr w:type="gramEnd"/>
+      <w:r>
+        <w:rPr>
+          <w:rFonts w:ascii="Arial" w:hAnsi="Arial" w:cs="Arial"/>
+          <w:color w:val="000000" w:themeColor="text1"/>
+        </w:rPr>
+        <w:t xml:space="preserve"> de Proyecto asume la coordinación de las pruebas funcionales preliminares y el soporte al </w:t>
+      </w:r>
+      <w:proofErr w:type="spellStart"/>
+      <w:r>
+        <w:rPr>
+          <w:rFonts w:ascii="Arial" w:hAnsi="Arial" w:cs="Arial"/>
+          <w:color w:val="000000" w:themeColor="text1"/>
+        </w:rPr>
+        <w:t>Product</w:t>
+      </w:r>
+      <w:proofErr w:type="spellEnd"/>
+      <w:r>
+        <w:rPr>
+          <w:rFonts w:ascii="Arial" w:hAnsi="Arial" w:cs="Arial"/>
+          <w:color w:val="000000" w:themeColor="text1"/>
+        </w:rPr>
+        <w:t xml:space="preserve"> </w:t>
+      </w:r>
+      <w:proofErr w:type="spellStart"/>
+      <w:r>
+        <w:rPr>
+          <w:rFonts w:ascii="Arial" w:hAnsi="Arial" w:cs="Arial"/>
+          <w:color w:val="000000" w:themeColor="text1"/>
+        </w:rPr>
+        <w:t>Owner</w:t>
+      </w:r>
+      <w:proofErr w:type="spellEnd"/>
+      <w:r>
+        <w:rPr>
+          <w:rFonts w:ascii="Arial" w:hAnsi="Arial" w:cs="Arial"/>
+          <w:color w:val="000000" w:themeColor="text1"/>
+        </w:rPr>
+        <w:t xml:space="preserve"> en la validación de requerimientos.</w:t>
+      </w:r>
+    </w:p>
+    <w:p>
+      <w:pPr>
+        <w:pStyle w:val="Listaconvietas"/>
+        <w:spacing w:line="360" w:lineRule="auto"/>
+        <w:rPr>
+          <w:rFonts w:ascii="Arial" w:hAnsi="Arial" w:cs="Arial"/>
+          <w:color w:val="000000" w:themeColor="text1"/>
+        </w:rPr>
+      </w:pPr>
+      <w:r>
+        <w:rPr>
+          <w:rFonts w:ascii="Arial" w:hAnsi="Arial" w:cs="Arial"/>
+          <w:color w:val="000000" w:themeColor="text1"/>
+        </w:rPr>
+        <w:t>Soporte QA Freelance Externo: Se reasigna parte del presupuesto de los desarrolladores salientes para contratar un analista QA freelance por horas durante las fases críticas del Sprint 11 y 12 (pruebas de integración final y aceptación del cliente).</w:t>
+      </w:r>
+    </w:p>
+    <w:p>
+      <w:pPr>
+        <w:pStyle w:val="Listaconvietas"/>
+        <w:spacing w:line="360" w:lineRule="auto"/>
+        <w:rPr>
+          <w:rFonts w:ascii="Arial" w:hAnsi="Arial" w:cs="Arial"/>
+          <w:color w:val="000000" w:themeColor="text1"/>
+        </w:rPr>
+      </w:pPr>
+      <w:r>
+        <w:rPr>
+          <w:rFonts w:ascii="Arial" w:hAnsi="Arial" w:cs="Arial"/>
+          <w:color w:val="000000" w:themeColor="text1"/>
+        </w:rPr>
+        <w:t>Compensación de Esfuerzo: Los fondos restantes de los sueldos no devengados se destinan a bonificaciones por sobreesfuerzo para el equipo remanente (</w:t>
+      </w:r>
+      <w:proofErr w:type="gramStart"/>
+      <w:r>
+        <w:rPr>
+          <w:rFonts w:ascii="Arial" w:hAnsi="Arial" w:cs="Arial"/>
+          <w:color w:val="000000" w:themeColor="text1"/>
+        </w:rPr>
+        <w:t>Jefe</w:t>
+      </w:r>
+      <w:proofErr w:type="gramEnd"/>
+      <w:r>
+        <w:rPr>
+          <w:rFonts w:ascii="Arial" w:hAnsi="Arial" w:cs="Arial"/>
+          <w:color w:val="000000" w:themeColor="text1"/>
+        </w:rPr>
+        <w:t xml:space="preserve"> de Proyecto y Scrum Master) para compensar el incremento de la carga horaria.</w:t>
+      </w:r>
+    </w:p>
+    <w:p>
+      <w:pPr>
+        <w:pStyle w:val="Listaconvietas"/>
+        <w:numPr>
+          <w:ilvl w:val="0"/>
+          <w:numId w:val="0"/>
+        </w:numPr>
+        <w:spacing w:line="360" w:lineRule="auto"/>
+        <w:ind w:left="360" w:hanging="360"/>
+        <w:rPr>
+          <w:rFonts w:ascii="Arial" w:hAnsi="Arial" w:cs="Arial"/>
+          <w:color w:val="000000" w:themeColor="text1"/>
+        </w:rPr>
+      </w:pPr>
+    </w:p>
+    <w:p>
+      <w:pPr>
+        <w:pStyle w:val="Ttulo2"/>
+        <w:spacing w:line="360" w:lineRule="auto"/>
+        <w:rPr>
+          <w:rFonts w:ascii="Arial" w:hAnsi="Arial" w:cs="Arial"/>
+          <w:color w:val="000000" w:themeColor="text1"/>
+        </w:rPr>
+      </w:pPr>
+      <w:r>
+        <w:rPr>
+          <w:rFonts w:ascii="Arial" w:hAnsi="Arial" w:cs="Arial"/>
+          <w:color w:val="000000" w:themeColor="text1"/>
+        </w:rPr>
+        <w:t>Tabla de Distribución de Personal Reestructurado</w:t>
+      </w:r>
+    </w:p>
+    <w:p/>
+    <w:tbl>
+      <w:tblPr>
+        <w:tblStyle w:val="Tablaconcuadrcula"/>
+        <w:tblW w:w="0" w:type="auto"/>
+        <w:tblLook w:val="04A0" w:firstRow="1" w:lastRow="0" w:firstColumn="1" w:lastColumn="0" w:noHBand="0" w:noVBand="1"/>
+      </w:tblPr>
+      <w:tblGrid>
+        <w:gridCol w:w="2183"/>
+        <w:gridCol w:w="2100"/>
+        <w:gridCol w:w="2056"/>
+        <w:gridCol w:w="2291"/>
+      </w:tblGrid>
+      <w:tr>
+        <w:tc>
+          <w:tcPr>
+            <w:tcW w:w="2340" w:type="dxa"/>
+          </w:tcPr>
+          <w:p>
+            <w:pPr>
+              <w:spacing w:line="360" w:lineRule="auto"/>
+              <w:rPr>
+                <w:rFonts w:ascii="Arial" w:hAnsi="Arial" w:cs="Arial"/>
+                <w:color w:val="000000" w:themeColor="text1"/>
+              </w:rPr>
+            </w:pPr>
+            <w:r>
+              <w:rPr>
+                <w:rFonts w:ascii="Arial" w:hAnsi="Arial" w:cs="Arial"/>
+                <w:color w:val="000000" w:themeColor="text1"/>
+              </w:rPr>
+              <w:t>Rol / Recurso</w:t>
+            </w:r>
+          </w:p>
+        </w:tc>
+        <w:tc>
+          <w:tcPr>
+            <w:tcW w:w="2340" w:type="dxa"/>
+          </w:tcPr>
+          <w:p>
+            <w:pPr>
+              <w:spacing w:line="360" w:lineRule="auto"/>
+              <w:rPr>
+                <w:rFonts w:ascii="Arial" w:hAnsi="Arial" w:cs="Arial"/>
+                <w:color w:val="000000" w:themeColor="text1"/>
+              </w:rPr>
+            </w:pPr>
+            <w:r>
+              <w:rPr>
+                <w:rFonts w:ascii="Arial" w:hAnsi="Arial" w:cs="Arial"/>
+                <w:color w:val="000000" w:themeColor="text1"/>
+              </w:rPr>
+              <w:t>Ajuste de Carga de Trabajo</w:t>
+            </w:r>
+          </w:p>
+        </w:tc>
+        <w:tc>
+          <w:tcPr>
+            <w:tcW w:w="2340" w:type="dxa"/>
+          </w:tcPr>
+          <w:p>
+            <w:pPr>
+              <w:spacing w:line="360" w:lineRule="auto"/>
+              <w:rPr>
+                <w:rFonts w:ascii="Arial" w:hAnsi="Arial" w:cs="Arial"/>
+                <w:color w:val="000000" w:themeColor="text1"/>
+              </w:rPr>
+            </w:pPr>
+            <w:r>
+              <w:rPr>
+                <w:rFonts w:ascii="Arial" w:hAnsi="Arial" w:cs="Arial"/>
+                <w:color w:val="000000" w:themeColor="text1"/>
+              </w:rPr>
+              <w:t>Dedicación Ajustada</w:t>
+            </w:r>
+          </w:p>
+        </w:tc>
+        <w:tc>
+          <w:tcPr>
+            <w:tcW w:w="2340" w:type="dxa"/>
+          </w:tcPr>
+          <w:p>
+            <w:pPr>
+              <w:spacing w:line="360" w:lineRule="auto"/>
+              <w:rPr>
+                <w:rFonts w:ascii="Arial" w:hAnsi="Arial" w:cs="Arial"/>
+                <w:color w:val="000000" w:themeColor="text1"/>
+              </w:rPr>
+            </w:pPr>
+            <w:r>
+              <w:rPr>
+                <w:rFonts w:ascii="Arial" w:hAnsi="Arial" w:cs="Arial"/>
+                <w:color w:val="000000" w:themeColor="text1"/>
+              </w:rPr>
+              <w:t>Total (Meses 4-6)</w:t>
+            </w:r>
+          </w:p>
+        </w:tc>
+      </w:tr>
+      <w:tr>
+        <w:tc>
+          <w:tcPr>
+            <w:tcW w:w="2340" w:type="dxa"/>
+          </w:tcPr>
+          <w:p>
+            <w:pPr>
+              <w:spacing w:line="360" w:lineRule="auto"/>
+              <w:rPr>
+                <w:rFonts w:ascii="Arial" w:hAnsi="Arial" w:cs="Arial"/>
+                <w:color w:val="000000" w:themeColor="text1"/>
+              </w:rPr>
+            </w:pPr>
+            <w:r>
+              <w:rPr>
+                <w:rFonts w:ascii="Arial" w:hAnsi="Arial" w:cs="Arial"/>
+                <w:color w:val="000000" w:themeColor="text1"/>
+              </w:rPr>
+              <w:t>Jefe de Proyecto</w:t>
+            </w:r>
+          </w:p>
+        </w:tc>
+        <w:tc>
+          <w:tcPr>
+            <w:tcW w:w="2340" w:type="dxa"/>
+          </w:tcPr>
+          <w:p>
+            <w:pPr>
+              <w:spacing w:line="360" w:lineRule="auto"/>
+              <w:rPr>
+                <w:rFonts w:ascii="Arial" w:hAnsi="Arial" w:cs="Arial"/>
+                <w:color w:val="000000" w:themeColor="text1"/>
+              </w:rPr>
+            </w:pPr>
+            <w:r>
+              <w:rPr>
+                <w:rFonts w:ascii="Arial" w:hAnsi="Arial" w:cs="Arial"/>
+                <w:color w:val="000000" w:themeColor="text1"/>
+              </w:rPr>
+              <w:t>Asume coordinación de QA y revisión de normativa municipal.</w:t>
+            </w:r>
+          </w:p>
+        </w:tc>
+        <w:tc>
+          <w:tcPr>
+            <w:tcW w:w="2340" w:type="dxa"/>
+          </w:tcPr>
+          <w:p>
+            <w:pPr>
+              <w:spacing w:line="360" w:lineRule="auto"/>
+              <w:rPr>
+                <w:rFonts w:ascii="Arial" w:hAnsi="Arial" w:cs="Arial"/>
+                <w:color w:val="000000" w:themeColor="text1"/>
+              </w:rPr>
+            </w:pPr>
+            <w:r>
+              <w:rPr>
+                <w:rFonts w:ascii="Arial" w:hAnsi="Arial" w:cs="Arial"/>
+                <w:color w:val="000000" w:themeColor="text1"/>
+              </w:rPr>
+              <w:t xml:space="preserve">20 </w:t>
+            </w:r>
+            <w:proofErr w:type="spellStart"/>
+            <w:r>
+              <w:rPr>
+                <w:rFonts w:ascii="Arial" w:hAnsi="Arial" w:cs="Arial"/>
+                <w:color w:val="000000" w:themeColor="text1"/>
+              </w:rPr>
+              <w:t>hrs</w:t>
+            </w:r>
+            <w:proofErr w:type="spellEnd"/>
+            <w:r>
+              <w:rPr>
+                <w:rFonts w:ascii="Arial" w:hAnsi="Arial" w:cs="Arial"/>
+                <w:color w:val="000000" w:themeColor="text1"/>
+              </w:rPr>
+              <w:t>/</w:t>
+            </w:r>
+            <w:proofErr w:type="spellStart"/>
+            <w:r>
+              <w:rPr>
+                <w:rFonts w:ascii="Arial" w:hAnsi="Arial" w:cs="Arial"/>
+                <w:color w:val="000000" w:themeColor="text1"/>
+              </w:rPr>
+              <w:t>sem</w:t>
+            </w:r>
+            <w:proofErr w:type="spellEnd"/>
+          </w:p>
+        </w:tc>
+        <w:tc>
+          <w:tcPr>
+            <w:tcW w:w="2340" w:type="dxa"/>
+          </w:tcPr>
+          <w:p>
+            <w:pPr>
+              <w:spacing w:line="360" w:lineRule="auto"/>
+              <w:rPr>
+                <w:rFonts w:ascii="Arial" w:hAnsi="Arial" w:cs="Arial"/>
+                <w:color w:val="000000" w:themeColor="text1"/>
+              </w:rPr>
+            </w:pPr>
+            <w:r>
+              <w:rPr>
+                <w:rFonts w:ascii="Arial" w:hAnsi="Arial" w:cs="Arial"/>
+                <w:color w:val="000000" w:themeColor="text1"/>
+              </w:rPr>
+              <w:t>5,250 Bs. (Incluye bonificación)</w:t>
+            </w:r>
+          </w:p>
+        </w:tc>
+      </w:tr>
+      <w:tr>
+        <w:tc>
+          <w:tcPr>
+            <w:tcW w:w="2340" w:type="dxa"/>
+          </w:tcPr>
+          <w:p>
+            <w:pPr>
+              <w:spacing w:line="360" w:lineRule="auto"/>
+              <w:rPr>
+                <w:rFonts w:ascii="Arial" w:hAnsi="Arial" w:cs="Arial"/>
+                <w:color w:val="000000" w:themeColor="text1"/>
+              </w:rPr>
+            </w:pPr>
+            <w:r>
+              <w:rPr>
+                <w:rFonts w:ascii="Arial" w:hAnsi="Arial" w:cs="Arial"/>
+                <w:color w:val="000000" w:themeColor="text1"/>
+              </w:rPr>
+              <w:t xml:space="preserve">Scrum Master / </w:t>
+            </w:r>
+            <w:proofErr w:type="spellStart"/>
+            <w:r>
+              <w:rPr>
+                <w:rFonts w:ascii="Arial" w:hAnsi="Arial" w:cs="Arial"/>
+                <w:color w:val="000000" w:themeColor="text1"/>
+              </w:rPr>
+              <w:t>Frontend</w:t>
+            </w:r>
+            <w:proofErr w:type="spellEnd"/>
+          </w:p>
+        </w:tc>
+        <w:tc>
+          <w:tcPr>
+            <w:tcW w:w="2340" w:type="dxa"/>
+          </w:tcPr>
+          <w:p>
+            <w:pPr>
+              <w:spacing w:line="360" w:lineRule="auto"/>
+              <w:rPr>
+                <w:rFonts w:ascii="Arial" w:hAnsi="Arial" w:cs="Arial"/>
+                <w:color w:val="000000" w:themeColor="text1"/>
+              </w:rPr>
+            </w:pPr>
+            <w:r>
+              <w:rPr>
+                <w:rFonts w:ascii="Arial" w:hAnsi="Arial" w:cs="Arial"/>
+                <w:color w:val="000000" w:themeColor="text1"/>
+              </w:rPr>
+              <w:t xml:space="preserve">Absorbe desarrollo </w:t>
+            </w:r>
+            <w:proofErr w:type="spellStart"/>
+            <w:r>
+              <w:rPr>
+                <w:rFonts w:ascii="Arial" w:hAnsi="Arial" w:cs="Arial"/>
+                <w:color w:val="000000" w:themeColor="text1"/>
+              </w:rPr>
+              <w:t>backend</w:t>
+            </w:r>
+            <w:proofErr w:type="spellEnd"/>
+            <w:r>
+              <w:rPr>
+                <w:rFonts w:ascii="Arial" w:hAnsi="Arial" w:cs="Arial"/>
+                <w:color w:val="000000" w:themeColor="text1"/>
+              </w:rPr>
+              <w:t xml:space="preserve"> e integración de Leaflet.js.</w:t>
+            </w:r>
+          </w:p>
+        </w:tc>
+        <w:tc>
+          <w:tcPr>
+            <w:tcW w:w="2340" w:type="dxa"/>
+          </w:tcPr>
+          <w:p>
+            <w:pPr>
+              <w:spacing w:line="360" w:lineRule="auto"/>
+              <w:rPr>
+                <w:rFonts w:ascii="Arial" w:hAnsi="Arial" w:cs="Arial"/>
+                <w:color w:val="000000" w:themeColor="text1"/>
+              </w:rPr>
+            </w:pPr>
+            <w:r>
+              <w:rPr>
+                <w:rFonts w:ascii="Arial" w:hAnsi="Arial" w:cs="Arial"/>
+                <w:color w:val="000000" w:themeColor="text1"/>
+              </w:rPr>
+              <w:t xml:space="preserve">40 </w:t>
+            </w:r>
+            <w:proofErr w:type="spellStart"/>
+            <w:r>
+              <w:rPr>
+                <w:rFonts w:ascii="Arial" w:hAnsi="Arial" w:cs="Arial"/>
+                <w:color w:val="000000" w:themeColor="text1"/>
+              </w:rPr>
+              <w:t>hrs</w:t>
+            </w:r>
+            <w:proofErr w:type="spellEnd"/>
+            <w:r>
+              <w:rPr>
+                <w:rFonts w:ascii="Arial" w:hAnsi="Arial" w:cs="Arial"/>
+                <w:color w:val="000000" w:themeColor="text1"/>
+              </w:rPr>
+              <w:t>/</w:t>
+            </w:r>
+            <w:proofErr w:type="spellStart"/>
+            <w:r>
+              <w:rPr>
+                <w:rFonts w:ascii="Arial" w:hAnsi="Arial" w:cs="Arial"/>
+                <w:color w:val="000000" w:themeColor="text1"/>
+              </w:rPr>
+              <w:t>sem</w:t>
+            </w:r>
+            <w:proofErr w:type="spellEnd"/>
+          </w:p>
+        </w:tc>
+        <w:tc>
+          <w:tcPr>
+            <w:tcW w:w="2340" w:type="dxa"/>
+          </w:tcPr>
+          <w:p>
+            <w:pPr>
+              <w:spacing w:line="360" w:lineRule="auto"/>
+              <w:rPr>
+                <w:rFonts w:ascii="Arial" w:hAnsi="Arial" w:cs="Arial"/>
+                <w:color w:val="000000" w:themeColor="text1"/>
+              </w:rPr>
+            </w:pPr>
+            <w:r>
+              <w:rPr>
+                <w:rFonts w:ascii="Arial" w:hAnsi="Arial" w:cs="Arial"/>
+                <w:color w:val="000000" w:themeColor="text1"/>
+              </w:rPr>
+              <w:t>13,750 Bs. (Incluye bonificación)</w:t>
+            </w:r>
+          </w:p>
+        </w:tc>
+      </w:tr>
+      <w:tr>
+        <w:tc>
+          <w:tcPr>
+            <w:tcW w:w="2340" w:type="dxa"/>
+          </w:tcPr>
+          <w:p>
+            <w:pPr>
+              <w:spacing w:line="360" w:lineRule="auto"/>
+              <w:rPr>
+                <w:rFonts w:ascii="Arial" w:hAnsi="Arial" w:cs="Arial"/>
+                <w:color w:val="000000" w:themeColor="text1"/>
+              </w:rPr>
+            </w:pPr>
+            <w:r>
+              <w:rPr>
+                <w:rFonts w:ascii="Arial" w:hAnsi="Arial" w:cs="Arial"/>
+                <w:color w:val="000000" w:themeColor="text1"/>
+              </w:rPr>
+              <w:t>QA Freelance Externo</w:t>
+            </w:r>
+          </w:p>
+        </w:tc>
+        <w:tc>
+          <w:tcPr>
+            <w:tcW w:w="2340" w:type="dxa"/>
+          </w:tcPr>
+          <w:p>
+            <w:pPr>
+              <w:spacing w:line="360" w:lineRule="auto"/>
+              <w:rPr>
+                <w:rFonts w:ascii="Arial" w:hAnsi="Arial" w:cs="Arial"/>
+                <w:color w:val="000000" w:themeColor="text1"/>
+              </w:rPr>
+            </w:pPr>
+            <w:r>
+              <w:rPr>
+                <w:rFonts w:ascii="Arial" w:hAnsi="Arial" w:cs="Arial"/>
+                <w:color w:val="000000" w:themeColor="text1"/>
+              </w:rPr>
+              <w:t>Contratación temporal por horas para pruebas de integración y aceptación.</w:t>
+            </w:r>
+          </w:p>
+        </w:tc>
+        <w:tc>
+          <w:tcPr>
+            <w:tcW w:w="2340" w:type="dxa"/>
+          </w:tcPr>
+          <w:p>
+            <w:pPr>
+              <w:spacing w:line="360" w:lineRule="auto"/>
+              <w:rPr>
+                <w:rFonts w:ascii="Arial" w:hAnsi="Arial" w:cs="Arial"/>
+                <w:color w:val="000000" w:themeColor="text1"/>
+              </w:rPr>
+            </w:pPr>
+            <w:r>
+              <w:rPr>
+                <w:rFonts w:ascii="Arial" w:hAnsi="Arial" w:cs="Arial"/>
+                <w:color w:val="000000" w:themeColor="text1"/>
+              </w:rPr>
+              <w:t>Por entregable</w:t>
+            </w:r>
+          </w:p>
+        </w:tc>
+        <w:tc>
+          <w:tcPr>
+            <w:tcW w:w="2340" w:type="dxa"/>
+          </w:tcPr>
+          <w:p>
+            <w:pPr>
+              <w:spacing w:line="360" w:lineRule="auto"/>
+              <w:rPr>
+                <w:rFonts w:ascii="Arial" w:hAnsi="Arial" w:cs="Arial"/>
+                <w:color w:val="000000" w:themeColor="text1"/>
+              </w:rPr>
+            </w:pPr>
+            <w:r>
+              <w:rPr>
+                <w:rFonts w:ascii="Arial" w:hAnsi="Arial" w:cs="Arial"/>
+                <w:color w:val="000000" w:themeColor="text1"/>
+              </w:rPr>
+              <w:t>3,500 Bs. (Contrato por horas)</w:t>
+            </w:r>
+          </w:p>
+        </w:tc>
+      </w:tr>
+      <w:tr>
+        <w:tc>
+          <w:tcPr>
+            <w:tcW w:w="2340" w:type="dxa"/>
+          </w:tcPr>
+          <w:p>
+            <w:pPr>
+              <w:spacing w:line="360" w:lineRule="auto"/>
+              <w:rPr>
+                <w:rFonts w:ascii="Arial" w:hAnsi="Arial" w:cs="Arial"/>
+                <w:color w:val="000000" w:themeColor="text1"/>
+              </w:rPr>
+            </w:pPr>
+            <w:r>
+              <w:rPr>
+                <w:rFonts w:ascii="Arial" w:hAnsi="Arial" w:cs="Arial"/>
+                <w:color w:val="000000" w:themeColor="text1"/>
+              </w:rPr>
+              <w:t>Desarrolladores Salientes</w:t>
+            </w:r>
+          </w:p>
+        </w:tc>
+        <w:tc>
+          <w:tcPr>
+            <w:tcW w:w="2340" w:type="dxa"/>
+          </w:tcPr>
+          <w:p>
+            <w:pPr>
+              <w:spacing w:line="360" w:lineRule="auto"/>
+              <w:rPr>
+                <w:rFonts w:ascii="Arial" w:hAnsi="Arial" w:cs="Arial"/>
+                <w:color w:val="000000" w:themeColor="text1"/>
+              </w:rPr>
+            </w:pPr>
+            <w:r>
+              <w:rPr>
+                <w:rFonts w:ascii="Arial" w:hAnsi="Arial" w:cs="Arial"/>
+                <w:color w:val="000000" w:themeColor="text1"/>
+              </w:rPr>
+              <w:t>Liberación de presupuesto no devengado tras renuncia.</w:t>
+            </w:r>
+          </w:p>
+        </w:tc>
+        <w:tc>
+          <w:tcPr>
+            <w:tcW w:w="2340" w:type="dxa"/>
+          </w:tcPr>
+          <w:p>
+            <w:pPr>
+              <w:spacing w:line="360" w:lineRule="auto"/>
+              <w:rPr>
+                <w:rFonts w:ascii="Arial" w:hAnsi="Arial" w:cs="Arial"/>
+                <w:color w:val="000000" w:themeColor="text1"/>
+              </w:rPr>
+            </w:pPr>
+            <w:r>
+              <w:rPr>
+                <w:rFonts w:ascii="Arial" w:hAnsi="Arial" w:cs="Arial"/>
+                <w:color w:val="000000" w:themeColor="text1"/>
+              </w:rPr>
+              <w:t xml:space="preserve">0 </w:t>
+            </w:r>
+            <w:proofErr w:type="spellStart"/>
+            <w:r>
+              <w:rPr>
+                <w:rFonts w:ascii="Arial" w:hAnsi="Arial" w:cs="Arial"/>
+                <w:color w:val="000000" w:themeColor="text1"/>
+              </w:rPr>
+              <w:t>hrs</w:t>
+            </w:r>
+            <w:proofErr w:type="spellEnd"/>
+            <w:r>
+              <w:rPr>
+                <w:rFonts w:ascii="Arial" w:hAnsi="Arial" w:cs="Arial"/>
+                <w:color w:val="000000" w:themeColor="text1"/>
+              </w:rPr>
+              <w:t>/</w:t>
+            </w:r>
+            <w:proofErr w:type="spellStart"/>
+            <w:r>
+              <w:rPr>
+                <w:rFonts w:ascii="Arial" w:hAnsi="Arial" w:cs="Arial"/>
+                <w:color w:val="000000" w:themeColor="text1"/>
+              </w:rPr>
+              <w:t>sem</w:t>
+            </w:r>
+            <w:proofErr w:type="spellEnd"/>
+          </w:p>
+        </w:tc>
+        <w:tc>
+          <w:tcPr>
+            <w:tcW w:w="2340" w:type="dxa"/>
+          </w:tcPr>
+          <w:p>
+            <w:pPr>
+              <w:spacing w:line="360" w:lineRule="auto"/>
+              <w:rPr>
+                <w:rFonts w:ascii="Arial" w:hAnsi="Arial" w:cs="Arial"/>
+                <w:color w:val="000000" w:themeColor="text1"/>
+              </w:rPr>
+            </w:pPr>
+            <w:r>
+              <w:rPr>
+                <w:rFonts w:ascii="Arial" w:hAnsi="Arial" w:cs="Arial"/>
+                <w:color w:val="000000" w:themeColor="text1"/>
+              </w:rPr>
+              <w:t>2,000 Bs. (Saldo retenido/congelado)</w:t>
+            </w:r>
+          </w:p>
+        </w:tc>
+      </w:tr>
+      <w:tr>
+        <w:tc>
+          <w:tcPr>
+            <w:tcW w:w="2340" w:type="dxa"/>
+          </w:tcPr>
+          <w:p>
+            <w:pPr>
+              <w:spacing w:line="360" w:lineRule="auto"/>
+              <w:rPr>
+                <w:rFonts w:ascii="Arial" w:hAnsi="Arial" w:cs="Arial"/>
+                <w:color w:val="000000" w:themeColor="text1"/>
+              </w:rPr>
+            </w:pPr>
+            <w:proofErr w:type="gramStart"/>
+            <w:r>
+              <w:rPr>
+                <w:rFonts w:ascii="Arial" w:hAnsi="Arial" w:cs="Arial"/>
+                <w:color w:val="000000" w:themeColor="text1"/>
+              </w:rPr>
+              <w:t>TOTAL</w:t>
+            </w:r>
+            <w:proofErr w:type="gramEnd"/>
+            <w:r>
+              <w:rPr>
+                <w:rFonts w:ascii="Arial" w:hAnsi="Arial" w:cs="Arial"/>
+                <w:color w:val="000000" w:themeColor="text1"/>
+              </w:rPr>
+              <w:t xml:space="preserve"> PERSONAL</w:t>
+            </w:r>
+          </w:p>
+        </w:tc>
+        <w:tc>
+          <w:tcPr>
+            <w:tcW w:w="2340" w:type="dxa"/>
+          </w:tcPr>
+          <w:p>
+            <w:pPr>
+              <w:spacing w:line="360" w:lineRule="auto"/>
+              <w:rPr>
+                <w:rFonts w:ascii="Arial" w:hAnsi="Arial" w:cs="Arial"/>
+                <w:color w:val="000000" w:themeColor="text1"/>
+              </w:rPr>
+            </w:pPr>
+            <w:proofErr w:type="gramStart"/>
+            <w:r>
+              <w:rPr>
+                <w:rFonts w:ascii="Arial" w:hAnsi="Arial" w:cs="Arial"/>
+                <w:color w:val="000000" w:themeColor="text1"/>
+              </w:rPr>
+              <w:t>Total</w:t>
+            </w:r>
+            <w:proofErr w:type="gramEnd"/>
+            <w:r>
+              <w:rPr>
+                <w:rFonts w:ascii="Arial" w:hAnsi="Arial" w:cs="Arial"/>
+                <w:color w:val="000000" w:themeColor="text1"/>
+              </w:rPr>
+              <w:t xml:space="preserve"> acumulado de personal técnico para la segunda mitad del proyecto.</w:t>
+            </w:r>
+          </w:p>
+        </w:tc>
+        <w:tc>
+          <w:tcPr>
+            <w:tcW w:w="2340" w:type="dxa"/>
+          </w:tcPr>
+          <w:p>
+            <w:pPr>
+              <w:spacing w:line="360" w:lineRule="auto"/>
+              <w:rPr>
+                <w:rFonts w:ascii="Arial" w:hAnsi="Arial" w:cs="Arial"/>
+                <w:color w:val="000000" w:themeColor="text1"/>
+              </w:rPr>
+            </w:pPr>
+            <w:r>
+              <w:rPr>
+                <w:rFonts w:ascii="Arial" w:hAnsi="Arial" w:cs="Arial"/>
+                <w:color w:val="000000" w:themeColor="text1"/>
+              </w:rPr>
+              <w:t xml:space="preserve">60 </w:t>
+            </w:r>
+            <w:proofErr w:type="spellStart"/>
+            <w:r>
+              <w:rPr>
+                <w:rFonts w:ascii="Arial" w:hAnsi="Arial" w:cs="Arial"/>
+                <w:color w:val="000000" w:themeColor="text1"/>
+              </w:rPr>
+              <w:t>hrs</w:t>
+            </w:r>
+            <w:proofErr w:type="spellEnd"/>
+            <w:r>
+              <w:rPr>
+                <w:rFonts w:ascii="Arial" w:hAnsi="Arial" w:cs="Arial"/>
+                <w:color w:val="000000" w:themeColor="text1"/>
+              </w:rPr>
+              <w:t>/</w:t>
+            </w:r>
+            <w:proofErr w:type="spellStart"/>
+            <w:r>
+              <w:rPr>
+                <w:rFonts w:ascii="Arial" w:hAnsi="Arial" w:cs="Arial"/>
+                <w:color w:val="000000" w:themeColor="text1"/>
+              </w:rPr>
+              <w:t>sem</w:t>
+            </w:r>
+            <w:proofErr w:type="spellEnd"/>
+          </w:p>
+        </w:tc>
+        <w:tc>
+          <w:tcPr>
+            <w:tcW w:w="2340" w:type="dxa"/>
+          </w:tcPr>
+          <w:p>
+            <w:pPr>
+              <w:spacing w:line="360" w:lineRule="auto"/>
+              <w:rPr>
+                <w:rFonts w:ascii="Arial" w:hAnsi="Arial" w:cs="Arial"/>
+                <w:color w:val="000000" w:themeColor="text1"/>
+              </w:rPr>
+            </w:pPr>
+            <w:r>
+              <w:rPr>
+                <w:rFonts w:ascii="Arial" w:hAnsi="Arial" w:cs="Arial"/>
+                <w:color w:val="000000" w:themeColor="text1"/>
+              </w:rPr>
+              <w:t>24,500 Bs.</w:t>
+            </w:r>
+          </w:p>
+        </w:tc>
+      </w:tr>
+    </w:tbl>
+    <w:p>
+      <w:pPr>
+        <w:pStyle w:val="Ttulo2"/>
+        <w:numPr>
+          <w:ilvl w:val="0"/>
+          <w:numId w:val="0"/>
+        </w:numPr>
+        <w:spacing w:line="360" w:lineRule="auto"/>
+        <w:ind w:left="576" w:hanging="576"/>
+        <w:rPr>
+          <w:rFonts w:ascii="Arial" w:hAnsi="Arial" w:cs="Arial"/>
+          <w:color w:val="000000" w:themeColor="text1"/>
+        </w:rPr>
+      </w:pPr>
+    </w:p>
+    <w:p/>
+    <w:p/>
+    <w:p/>
+    <w:p>
+      <w:pPr>
+        <w:pStyle w:val="Ttulo2"/>
+        <w:spacing w:line="360" w:lineRule="auto"/>
+        <w:rPr>
+          <w:rFonts w:ascii="Arial" w:hAnsi="Arial" w:cs="Arial"/>
+          <w:color w:val="000000" w:themeColor="text1"/>
+        </w:rPr>
+      </w:pPr>
+      <w:r>
+        <w:rPr>
+          <w:rFonts w:ascii="Arial" w:hAnsi="Arial" w:cs="Arial"/>
+          <w:color w:val="000000" w:themeColor="text1"/>
+        </w:rPr>
+        <w:t>Recursos Físicos e Infraestructura</w:t>
+      </w:r>
+    </w:p>
+    <w:p/>
+    <w:p>
+      <w:pPr>
+        <w:spacing w:line="360" w:lineRule="auto"/>
+        <w:rPr>
+          <w:rFonts w:ascii="Arial" w:hAnsi="Arial" w:cs="Arial"/>
+          <w:color w:val="000000" w:themeColor="text1"/>
+        </w:rPr>
+      </w:pPr>
+      <w:r>
+        <w:rPr>
+          <w:rFonts w:ascii="Arial" w:hAnsi="Arial" w:cs="Arial"/>
+          <w:color w:val="000000" w:themeColor="text1"/>
+        </w:rPr>
+        <w:t>Recursos de hardware, software y servicios requeridos para el soporte de la plataforma:</w:t>
+      </w:r>
+    </w:p>
+    <w:p>
+      <w:pPr>
+        <w:pStyle w:val="Listaconvietas"/>
+        <w:spacing w:line="360" w:lineRule="auto"/>
+        <w:rPr>
+          <w:rFonts w:ascii="Arial" w:hAnsi="Arial" w:cs="Arial"/>
+          <w:color w:val="000000" w:themeColor="text1"/>
+        </w:rPr>
+      </w:pPr>
+      <w:r>
+        <w:rPr>
+          <w:rFonts w:ascii="Arial" w:hAnsi="Arial" w:cs="Arial"/>
+          <w:color w:val="000000" w:themeColor="text1"/>
+        </w:rPr>
+        <w:t xml:space="preserve">Infraestructura Cloud: Servidor VPS virtual de 2 </w:t>
+      </w:r>
+      <w:proofErr w:type="spellStart"/>
+      <w:r>
+        <w:rPr>
+          <w:rFonts w:ascii="Arial" w:hAnsi="Arial" w:cs="Arial"/>
+          <w:color w:val="000000" w:themeColor="text1"/>
+        </w:rPr>
+        <w:t>cores</w:t>
+      </w:r>
+      <w:proofErr w:type="spellEnd"/>
+      <w:r>
+        <w:rPr>
+          <w:rFonts w:ascii="Arial" w:hAnsi="Arial" w:cs="Arial"/>
+          <w:color w:val="000000" w:themeColor="text1"/>
+        </w:rPr>
+        <w:t xml:space="preserve"> y 4GB de RAM con sistema operativo Linux para el despliegue del MVP.</w:t>
+      </w:r>
+    </w:p>
+    <w:p>
+      <w:pPr>
+        <w:pStyle w:val="Listaconvietas"/>
+        <w:spacing w:line="360" w:lineRule="auto"/>
+        <w:rPr>
+          <w:rFonts w:ascii="Arial" w:hAnsi="Arial" w:cs="Arial"/>
+          <w:color w:val="000000" w:themeColor="text1"/>
+        </w:rPr>
+      </w:pPr>
+      <w:r>
+        <w:rPr>
+          <w:rFonts w:ascii="Arial" w:hAnsi="Arial" w:cs="Arial"/>
+          <w:color w:val="000000" w:themeColor="text1"/>
+        </w:rPr>
+        <w:t>Base de Datos: Motor de base de datos relacional para el control transaccional de recaudaciones.</w:t>
+      </w:r>
+    </w:p>
+    <w:p>
+      <w:pPr>
+        <w:pStyle w:val="Listaconvietas"/>
+        <w:spacing w:line="360" w:lineRule="auto"/>
+        <w:rPr>
+          <w:rFonts w:ascii="Arial" w:hAnsi="Arial" w:cs="Arial"/>
+          <w:color w:val="000000" w:themeColor="text1"/>
+        </w:rPr>
+      </w:pPr>
+      <w:r>
+        <w:rPr>
+          <w:rFonts w:ascii="Arial" w:hAnsi="Arial" w:cs="Arial"/>
+          <w:color w:val="000000" w:themeColor="text1"/>
+        </w:rPr>
+        <w:t xml:space="preserve">Dominio y SSL: Dominio oficial `.gob.bo` gestionado con la Alcaldía y certificados de encriptación SSL </w:t>
+      </w:r>
+      <w:proofErr w:type="spellStart"/>
+      <w:r>
+        <w:rPr>
+          <w:rFonts w:ascii="Arial" w:hAnsi="Arial" w:cs="Arial"/>
+          <w:color w:val="000000" w:themeColor="text1"/>
+        </w:rPr>
+        <w:t>Let's</w:t>
+      </w:r>
+      <w:proofErr w:type="spellEnd"/>
+      <w:r>
+        <w:rPr>
+          <w:rFonts w:ascii="Arial" w:hAnsi="Arial" w:cs="Arial"/>
+          <w:color w:val="000000" w:themeColor="text1"/>
+        </w:rPr>
+        <w:t xml:space="preserve"> </w:t>
+      </w:r>
+      <w:proofErr w:type="spellStart"/>
+      <w:r>
+        <w:rPr>
+          <w:rFonts w:ascii="Arial" w:hAnsi="Arial" w:cs="Arial"/>
+          <w:color w:val="000000" w:themeColor="text1"/>
+        </w:rPr>
+        <w:t>Encrypt</w:t>
+      </w:r>
+      <w:proofErr w:type="spellEnd"/>
+      <w:r>
+        <w:rPr>
+          <w:rFonts w:ascii="Arial" w:hAnsi="Arial" w:cs="Arial"/>
+          <w:color w:val="000000" w:themeColor="text1"/>
+        </w:rPr>
+        <w:t xml:space="preserve"> (gratuitos).</w:t>
+      </w:r>
+    </w:p>
+    <w:p>
+      <w:pPr>
+        <w:pStyle w:val="Listaconvietas"/>
+        <w:spacing w:line="360" w:lineRule="auto"/>
+        <w:rPr>
+          <w:rFonts w:ascii="Arial" w:hAnsi="Arial" w:cs="Arial"/>
+          <w:color w:val="000000" w:themeColor="text1"/>
+        </w:rPr>
+      </w:pPr>
+      <w:r>
+        <w:rPr>
+          <w:rFonts w:ascii="Arial" w:hAnsi="Arial" w:cs="Arial"/>
+          <w:color w:val="000000" w:themeColor="text1"/>
+        </w:rPr>
+        <w:t>Herramientas de Desarrollo: Cuentas gratuitas en Jira y GitHub para la colaboración de los recursos restantes.</w:t>
+      </w:r>
+    </w:p>
+    <w:p>
+      <w:pPr>
+        <w:spacing w:line="360" w:lineRule="auto"/>
+        <w:jc w:val="both"/>
+        <w:rPr>
+          <w:rFonts w:ascii="Arial" w:hAnsi="Arial" w:cs="Arial"/>
+          <w:color w:val="000000" w:themeColor="text1"/>
+          <w:sz w:val="24"/>
+          <w:szCs w:val="24"/>
+        </w:rPr>
+      </w:pPr>
     </w:p>
     <w:sectPr>
       <w:pgSz w:w="12240" w:h="15840"/>

</xml_diff>

<commit_message>
12.Tablero de Seguimiento KPI
</commit_message>
<xml_diff>
--- a/gestion de proyecto de software.docx
+++ b/gestion de proyecto de software.docx
@@ -15389,6 +15389,9 @@
         <w:gridCol w:w="4331"/>
       </w:tblGrid>
       <w:tr>
+        <w:trPr>
+          <w:trHeight w:val="646"/>
+        </w:trPr>
         <w:tc>
           <w:tcPr>
             <w:tcW w:w="4680" w:type="dxa"/>
@@ -15462,6 +15465,9 @@
         </w:tc>
       </w:tr>
       <w:tr>
+        <w:trPr>
+          <w:trHeight w:val="698"/>
+        </w:trPr>
         <w:tc>
           <w:tcPr>
             <w:tcW w:w="4680" w:type="dxa"/>
@@ -15515,6 +15521,9 @@
         </w:tc>
       </w:tr>
       <w:tr>
+        <w:trPr>
+          <w:trHeight w:val="848"/>
+        </w:trPr>
         <w:tc>
           <w:tcPr>
             <w:tcW w:w="4680" w:type="dxa"/>
@@ -15568,6 +15577,9 @@
         </w:tc>
       </w:tr>
       <w:tr>
+        <w:trPr>
+          <w:trHeight w:val="1118"/>
+        </w:trPr>
         <w:tc>
           <w:tcPr>
             <w:tcW w:w="4680" w:type="dxa"/>
@@ -15621,6 +15633,9 @@
         </w:tc>
       </w:tr>
       <w:tr>
+        <w:trPr>
+          <w:trHeight w:val="836"/>
+        </w:trPr>
         <w:tc>
           <w:tcPr>
             <w:tcW w:w="4680" w:type="dxa"/>
@@ -15721,7 +15736,17 @@
                 <w:sz w:val="24"/>
                 <w:szCs w:val="24"/>
               </w:rPr>
-              <w:t xml:space="preserve">Incidencia: La Alcaldía de Sucre solicita agregar el módulo de geolocalización de puestos (RF-GEO). Acción: Se inicia el proceso formal de gestión de cambios (Control de Cambios #01). Se elabora el análisis de impacto técnico y financiero, recomendando una solución de bajo esfuerzo (Leaflet.js + </w:t>
+              <w:t xml:space="preserve">Incidencia: La Alcaldía de Sucre solicita agregar el módulo de geolocalización de puestos (RF-GEO). Acción: Se inicia el proceso formal de gestión de cambios (Control de Cambios #01). Se elabora el análisis de impacto técnico y financiero, recomendando una solución de bajo </w:t>
+            </w:r>
+            <w:r>
+              <w:rPr>
+                <w:rFonts w:ascii="Arial" w:hAnsi="Arial" w:cs="Arial"/>
+                <w:color w:val="000000" w:themeColor="text1"/>
+                <w:sz w:val="24"/>
+                <w:szCs w:val="24"/>
+              </w:rPr>
+              <w:lastRenderedPageBreak/>
+              <w:t xml:space="preserve">esfuerzo (Leaflet.js + </w:t>
             </w:r>
             <w:proofErr w:type="spellStart"/>
             <w:r>
@@ -15777,7 +15802,6 @@
           <w:sz w:val="24"/>
           <w:szCs w:val="24"/>
         </w:rPr>
-        <w:lastRenderedPageBreak/>
         <w:t xml:space="preserve">Informe de Avance </w:t>
       </w:r>
       <w:proofErr w:type="spellStart"/>
@@ -15817,6 +15841,9 @@
         <w:gridCol w:w="4347"/>
       </w:tblGrid>
       <w:tr>
+        <w:trPr>
+          <w:trHeight w:val="740"/>
+        </w:trPr>
         <w:tc>
           <w:tcPr>
             <w:tcW w:w="4680" w:type="dxa"/>
@@ -15890,6 +15917,9 @@
         </w:tc>
       </w:tr>
       <w:tr>
+        <w:trPr>
+          <w:trHeight w:val="709"/>
+        </w:trPr>
         <w:tc>
           <w:tcPr>
             <w:tcW w:w="4680" w:type="dxa"/>
@@ -15943,6 +15973,9 @@
         </w:tc>
       </w:tr>
       <w:tr>
+        <w:trPr>
+          <w:trHeight w:val="690"/>
+        </w:trPr>
         <w:tc>
           <w:tcPr>
             <w:tcW w:w="4680" w:type="dxa"/>
@@ -15996,6 +16029,9 @@
         </w:tc>
       </w:tr>
       <w:tr>
+        <w:trPr>
+          <w:trHeight w:val="1267"/>
+        </w:trPr>
         <w:tc>
           <w:tcPr>
             <w:tcW w:w="4680" w:type="dxa"/>
@@ -16049,6 +16085,9 @@
         </w:tc>
       </w:tr>
       <w:tr>
+        <w:trPr>
+          <w:trHeight w:val="973"/>
+        </w:trPr>
         <w:tc>
           <w:tcPr>
             <w:tcW w:w="4680" w:type="dxa"/>
@@ -16237,6 +16276,2410 @@
     </w:tbl>
     <w:p>
       <w:pPr>
+        <w:jc w:val="both"/>
+        <w:rPr>
+          <w:rFonts w:ascii="Arial" w:hAnsi="Arial" w:cs="Arial"/>
+          <w:color w:val="000000" w:themeColor="text1"/>
+          <w:sz w:val="24"/>
+          <w:szCs w:val="24"/>
+        </w:rPr>
+      </w:pPr>
+    </w:p>
+    <w:p>
+      <w:pPr>
+        <w:spacing w:line="360" w:lineRule="auto"/>
+        <w:jc w:val="both"/>
+        <w:rPr>
+          <w:rFonts w:ascii="Arial" w:hAnsi="Arial" w:cs="Arial"/>
+          <w:color w:val="000000" w:themeColor="text1"/>
+          <w:sz w:val="24"/>
+          <w:szCs w:val="24"/>
+        </w:rPr>
+      </w:pPr>
+    </w:p>
+    <w:p>
+      <w:pPr>
+        <w:spacing w:line="360" w:lineRule="auto"/>
+        <w:jc w:val="both"/>
+        <w:rPr>
+          <w:rFonts w:ascii="Arial" w:hAnsi="Arial" w:cs="Arial"/>
+          <w:color w:val="000000" w:themeColor="text1"/>
+          <w:sz w:val="24"/>
+          <w:szCs w:val="24"/>
+        </w:rPr>
+      </w:pPr>
+    </w:p>
+    <w:p>
+      <w:pPr>
+        <w:spacing w:line="360" w:lineRule="auto"/>
+        <w:jc w:val="both"/>
+        <w:rPr>
+          <w:rFonts w:ascii="Arial" w:hAnsi="Arial" w:cs="Arial"/>
+          <w:color w:val="000000" w:themeColor="text1"/>
+          <w:sz w:val="24"/>
+          <w:szCs w:val="24"/>
+        </w:rPr>
+      </w:pPr>
+    </w:p>
+    <w:p>
+      <w:pPr>
+        <w:spacing w:line="360" w:lineRule="auto"/>
+        <w:jc w:val="both"/>
+        <w:rPr>
+          <w:rFonts w:ascii="Arial" w:hAnsi="Arial" w:cs="Arial"/>
+          <w:color w:val="000000" w:themeColor="text1"/>
+          <w:sz w:val="24"/>
+          <w:szCs w:val="24"/>
+        </w:rPr>
+      </w:pPr>
+    </w:p>
+    <w:p>
+      <w:pPr>
+        <w:pStyle w:val="Ttulo1"/>
+      </w:pPr>
+      <w:r>
+        <w:rPr>
+          <w:color w:val="000000" w:themeColor="text1"/>
+        </w:rPr>
+        <w:lastRenderedPageBreak/>
+        <w:t>TABLERO DE SEGUIMIENTO KPI</w:t>
+      </w:r>
+    </w:p>
+    <w:p>
+      <w:pPr>
+        <w:pStyle w:val="Ttulo2"/>
+        <w:rPr>
+          <w:color w:val="000000" w:themeColor="text1"/>
+        </w:rPr>
+      </w:pPr>
+      <w:r>
+        <w:rPr>
+          <w:color w:val="000000" w:themeColor="text1"/>
+        </w:rPr>
+        <w:t xml:space="preserve">Introducción y Propósito del Tablero de </w:t>
+      </w:r>
+      <w:proofErr w:type="spellStart"/>
+      <w:r>
+        <w:rPr>
+          <w:color w:val="000000" w:themeColor="text1"/>
+        </w:rPr>
+        <w:t>KPIs</w:t>
+      </w:r>
+      <w:proofErr w:type="spellEnd"/>
+    </w:p>
+    <w:p>
+      <w:pPr>
+        <w:spacing w:after="120" w:line="360" w:lineRule="auto"/>
+        <w:jc w:val="both"/>
+        <w:rPr>
+          <w:rFonts w:ascii="Arial" w:hAnsi="Arial" w:cs="Arial"/>
+          <w:color w:val="000000" w:themeColor="text1"/>
+          <w:sz w:val="24"/>
+          <w:szCs w:val="24"/>
+        </w:rPr>
+      </w:pPr>
+      <w:r>
+        <w:rPr>
+          <w:rFonts w:ascii="Arial" w:hAnsi="Arial" w:cs="Arial"/>
+          <w:color w:val="000000" w:themeColor="text1"/>
+          <w:sz w:val="24"/>
+          <w:szCs w:val="24"/>
+        </w:rPr>
+        <w:t xml:space="preserve">El Tablero de Seguimiento KPI es la herramienta diseñada para monitorear el desempeño del proyecto del </w:t>
+      </w:r>
+      <w:r>
+        <w:rPr>
+          <w:rFonts w:ascii="Arial" w:hAnsi="Arial" w:cs="Arial"/>
+          <w:b/>
+          <w:color w:val="000000" w:themeColor="text1"/>
+          <w:sz w:val="24"/>
+          <w:szCs w:val="24"/>
+        </w:rPr>
+        <w:t xml:space="preserve">Sistema de Gestión para Mercados Municipales </w:t>
+      </w:r>
+      <w:r>
+        <w:rPr>
+          <w:rFonts w:ascii="Arial" w:hAnsi="Arial" w:cs="Arial"/>
+          <w:color w:val="000000" w:themeColor="text1"/>
+          <w:sz w:val="24"/>
+          <w:szCs w:val="24"/>
+        </w:rPr>
+        <w:t>(Mercado Central, Mercado Campesino y Mercado Negro). Permite unificar el control del desarrollo de software (Scrum) con la gobernanza financiera e institucional (PMBOK), proporcionando visibilidad a la Dirección de Ingresos de la Alcaldía de Sucre.</w:t>
+      </w:r>
+    </w:p>
+    <w:p>
+      <w:pPr>
+        <w:pStyle w:val="Ttulo2"/>
+        <w:rPr>
+          <w:color w:val="000000" w:themeColor="text1"/>
+        </w:rPr>
+      </w:pPr>
+      <w:r>
+        <w:rPr>
+          <w:color w:val="000000" w:themeColor="text1"/>
+        </w:rPr>
+        <w:t>Fichas Técnicas de Indicadores Clave</w:t>
+      </w:r>
+    </w:p>
+    <w:p/>
+    <w:tbl>
+      <w:tblPr>
+        <w:tblStyle w:val="Tablaconcuadrcula"/>
+        <w:tblW w:w="0" w:type="auto"/>
+        <w:jc w:val="center"/>
+        <w:tblLook w:val="04A0" w:firstRow="1" w:lastRow="0" w:firstColumn="1" w:lastColumn="0" w:noHBand="0" w:noVBand="1"/>
+      </w:tblPr>
+      <w:tblGrid>
+        <w:gridCol w:w="1084"/>
+        <w:gridCol w:w="1271"/>
+        <w:gridCol w:w="1271"/>
+        <w:gridCol w:w="1309"/>
+        <w:gridCol w:w="1162"/>
+        <w:gridCol w:w="1240"/>
+        <w:gridCol w:w="1293"/>
+      </w:tblGrid>
+      <w:tr>
+        <w:trPr>
+          <w:jc w:val="center"/>
+        </w:trPr>
+        <w:tc>
+          <w:tcPr>
+            <w:tcW w:w="1337" w:type="dxa"/>
+          </w:tcPr>
+          <w:p>
+            <w:pPr>
+              <w:spacing w:line="360" w:lineRule="auto"/>
+              <w:jc w:val="both"/>
+              <w:rPr>
+                <w:rFonts w:ascii="Arial" w:hAnsi="Arial" w:cs="Arial"/>
+                <w:color w:val="000000" w:themeColor="text1"/>
+                <w:sz w:val="16"/>
+                <w:szCs w:val="16"/>
+              </w:rPr>
+            </w:pPr>
+            <w:r>
+              <w:rPr>
+                <w:rFonts w:ascii="Arial" w:hAnsi="Arial" w:cs="Arial"/>
+                <w:b/>
+                <w:color w:val="000000" w:themeColor="text1"/>
+                <w:sz w:val="16"/>
+                <w:szCs w:val="16"/>
+              </w:rPr>
+              <w:t>ID</w:t>
+            </w:r>
+          </w:p>
+        </w:tc>
+        <w:tc>
+          <w:tcPr>
+            <w:tcW w:w="1337" w:type="dxa"/>
+          </w:tcPr>
+          <w:p>
+            <w:pPr>
+              <w:spacing w:line="360" w:lineRule="auto"/>
+              <w:jc w:val="both"/>
+              <w:rPr>
+                <w:rFonts w:ascii="Arial" w:hAnsi="Arial" w:cs="Arial"/>
+                <w:color w:val="000000" w:themeColor="text1"/>
+                <w:sz w:val="16"/>
+                <w:szCs w:val="16"/>
+              </w:rPr>
+            </w:pPr>
+            <w:r>
+              <w:rPr>
+                <w:rFonts w:ascii="Arial" w:hAnsi="Arial" w:cs="Arial"/>
+                <w:b/>
+                <w:color w:val="000000" w:themeColor="text1"/>
+                <w:sz w:val="16"/>
+                <w:szCs w:val="16"/>
+              </w:rPr>
+              <w:t>Nombre de KPI</w:t>
+            </w:r>
+          </w:p>
+        </w:tc>
+        <w:tc>
+          <w:tcPr>
+            <w:tcW w:w="1337" w:type="dxa"/>
+          </w:tcPr>
+          <w:p>
+            <w:pPr>
+              <w:spacing w:line="360" w:lineRule="auto"/>
+              <w:jc w:val="both"/>
+              <w:rPr>
+                <w:rFonts w:ascii="Arial" w:hAnsi="Arial" w:cs="Arial"/>
+                <w:color w:val="000000" w:themeColor="text1"/>
+                <w:sz w:val="16"/>
+                <w:szCs w:val="16"/>
+              </w:rPr>
+            </w:pPr>
+            <w:r>
+              <w:rPr>
+                <w:rFonts w:ascii="Arial" w:hAnsi="Arial" w:cs="Arial"/>
+                <w:b/>
+                <w:color w:val="000000" w:themeColor="text1"/>
+                <w:sz w:val="16"/>
+                <w:szCs w:val="16"/>
+              </w:rPr>
+              <w:t>Área</w:t>
+            </w:r>
+          </w:p>
+        </w:tc>
+        <w:tc>
+          <w:tcPr>
+            <w:tcW w:w="1337" w:type="dxa"/>
+          </w:tcPr>
+          <w:p>
+            <w:pPr>
+              <w:spacing w:line="360" w:lineRule="auto"/>
+              <w:jc w:val="both"/>
+              <w:rPr>
+                <w:rFonts w:ascii="Arial" w:hAnsi="Arial" w:cs="Arial"/>
+                <w:color w:val="000000" w:themeColor="text1"/>
+                <w:sz w:val="16"/>
+                <w:szCs w:val="16"/>
+              </w:rPr>
+            </w:pPr>
+            <w:r>
+              <w:rPr>
+                <w:rFonts w:ascii="Arial" w:hAnsi="Arial" w:cs="Arial"/>
+                <w:b/>
+                <w:color w:val="000000" w:themeColor="text1"/>
+                <w:sz w:val="16"/>
+                <w:szCs w:val="16"/>
+              </w:rPr>
+              <w:t>Fórmula de Métrica</w:t>
+            </w:r>
+          </w:p>
+        </w:tc>
+        <w:tc>
+          <w:tcPr>
+            <w:tcW w:w="1337" w:type="dxa"/>
+          </w:tcPr>
+          <w:p>
+            <w:pPr>
+              <w:spacing w:line="360" w:lineRule="auto"/>
+              <w:jc w:val="both"/>
+              <w:rPr>
+                <w:rFonts w:ascii="Arial" w:hAnsi="Arial" w:cs="Arial"/>
+                <w:color w:val="000000" w:themeColor="text1"/>
+                <w:sz w:val="16"/>
+                <w:szCs w:val="16"/>
+              </w:rPr>
+            </w:pPr>
+            <w:r>
+              <w:rPr>
+                <w:rFonts w:ascii="Arial" w:hAnsi="Arial" w:cs="Arial"/>
+                <w:b/>
+                <w:color w:val="000000" w:themeColor="text1"/>
+                <w:sz w:val="16"/>
+                <w:szCs w:val="16"/>
+              </w:rPr>
+              <w:t>Meta</w:t>
+            </w:r>
+          </w:p>
+        </w:tc>
+        <w:tc>
+          <w:tcPr>
+            <w:tcW w:w="1337" w:type="dxa"/>
+          </w:tcPr>
+          <w:p>
+            <w:pPr>
+              <w:spacing w:line="360" w:lineRule="auto"/>
+              <w:jc w:val="both"/>
+              <w:rPr>
+                <w:rFonts w:ascii="Arial" w:hAnsi="Arial" w:cs="Arial"/>
+                <w:color w:val="000000" w:themeColor="text1"/>
+                <w:sz w:val="16"/>
+                <w:szCs w:val="16"/>
+              </w:rPr>
+            </w:pPr>
+            <w:r>
+              <w:rPr>
+                <w:rFonts w:ascii="Arial" w:hAnsi="Arial" w:cs="Arial"/>
+                <w:b/>
+                <w:color w:val="000000" w:themeColor="text1"/>
+                <w:sz w:val="16"/>
+                <w:szCs w:val="16"/>
+              </w:rPr>
+              <w:t>Frecuencia</w:t>
+            </w:r>
+          </w:p>
+        </w:tc>
+        <w:tc>
+          <w:tcPr>
+            <w:tcW w:w="1337" w:type="dxa"/>
+          </w:tcPr>
+          <w:p>
+            <w:pPr>
+              <w:spacing w:line="360" w:lineRule="auto"/>
+              <w:jc w:val="both"/>
+              <w:rPr>
+                <w:rFonts w:ascii="Arial" w:hAnsi="Arial" w:cs="Arial"/>
+                <w:color w:val="000000" w:themeColor="text1"/>
+                <w:sz w:val="16"/>
+                <w:szCs w:val="16"/>
+              </w:rPr>
+            </w:pPr>
+            <w:r>
+              <w:rPr>
+                <w:rFonts w:ascii="Arial" w:hAnsi="Arial" w:cs="Arial"/>
+                <w:b/>
+                <w:color w:val="000000" w:themeColor="text1"/>
+                <w:sz w:val="16"/>
+                <w:szCs w:val="16"/>
+              </w:rPr>
+              <w:t>Responsable</w:t>
+            </w:r>
+          </w:p>
+        </w:tc>
+      </w:tr>
+      <w:tr>
+        <w:trPr>
+          <w:jc w:val="center"/>
+        </w:trPr>
+        <w:tc>
+          <w:tcPr>
+            <w:tcW w:w="1337" w:type="dxa"/>
+          </w:tcPr>
+          <w:p>
+            <w:pPr>
+              <w:spacing w:line="360" w:lineRule="auto"/>
+              <w:jc w:val="both"/>
+              <w:rPr>
+                <w:rFonts w:ascii="Arial" w:hAnsi="Arial" w:cs="Arial"/>
+                <w:color w:val="000000" w:themeColor="text1"/>
+                <w:sz w:val="16"/>
+                <w:szCs w:val="16"/>
+              </w:rPr>
+            </w:pPr>
+            <w:r>
+              <w:rPr>
+                <w:rFonts w:ascii="Arial" w:hAnsi="Arial" w:cs="Arial"/>
+                <w:b/>
+                <w:color w:val="000000" w:themeColor="text1"/>
+                <w:sz w:val="16"/>
+                <w:szCs w:val="16"/>
+              </w:rPr>
+              <w:t>PM-REC</w:t>
+            </w:r>
+          </w:p>
+        </w:tc>
+        <w:tc>
+          <w:tcPr>
+            <w:tcW w:w="1337" w:type="dxa"/>
+          </w:tcPr>
+          <w:p>
+            <w:pPr>
+              <w:spacing w:line="360" w:lineRule="auto"/>
+              <w:jc w:val="both"/>
+              <w:rPr>
+                <w:rFonts w:ascii="Arial" w:hAnsi="Arial" w:cs="Arial"/>
+                <w:color w:val="000000" w:themeColor="text1"/>
+                <w:sz w:val="16"/>
+                <w:szCs w:val="16"/>
+              </w:rPr>
+            </w:pPr>
+            <w:r>
+              <w:rPr>
+                <w:rFonts w:ascii="Arial" w:hAnsi="Arial" w:cs="Arial"/>
+                <w:color w:val="000000" w:themeColor="text1"/>
+                <w:sz w:val="16"/>
+                <w:szCs w:val="16"/>
+              </w:rPr>
+              <w:t>Porcentaje de Morosidad</w:t>
+            </w:r>
+          </w:p>
+        </w:tc>
+        <w:tc>
+          <w:tcPr>
+            <w:tcW w:w="1337" w:type="dxa"/>
+          </w:tcPr>
+          <w:p>
+            <w:pPr>
+              <w:spacing w:line="360" w:lineRule="auto"/>
+              <w:jc w:val="both"/>
+              <w:rPr>
+                <w:rFonts w:ascii="Arial" w:hAnsi="Arial" w:cs="Arial"/>
+                <w:color w:val="000000" w:themeColor="text1"/>
+                <w:sz w:val="16"/>
+                <w:szCs w:val="16"/>
+              </w:rPr>
+            </w:pPr>
+            <w:r>
+              <w:rPr>
+                <w:rFonts w:ascii="Arial" w:hAnsi="Arial" w:cs="Arial"/>
+                <w:color w:val="000000" w:themeColor="text1"/>
+                <w:sz w:val="16"/>
+                <w:szCs w:val="16"/>
+              </w:rPr>
+              <w:t>Recaudación</w:t>
+            </w:r>
+          </w:p>
+        </w:tc>
+        <w:tc>
+          <w:tcPr>
+            <w:tcW w:w="1337" w:type="dxa"/>
+          </w:tcPr>
+          <w:p>
+            <w:pPr>
+              <w:spacing w:line="360" w:lineRule="auto"/>
+              <w:jc w:val="both"/>
+              <w:rPr>
+                <w:rFonts w:ascii="Arial" w:hAnsi="Arial" w:cs="Arial"/>
+                <w:color w:val="000000" w:themeColor="text1"/>
+                <w:sz w:val="16"/>
+                <w:szCs w:val="16"/>
+              </w:rPr>
+            </w:pPr>
+            <w:r>
+              <w:rPr>
+                <w:rFonts w:ascii="Arial" w:hAnsi="Arial" w:cs="Arial"/>
+                <w:color w:val="000000" w:themeColor="text1"/>
+                <w:sz w:val="16"/>
+                <w:szCs w:val="16"/>
+              </w:rPr>
+              <w:t>(Comerciantes con deuda / Total comerciantes) * 100</w:t>
+            </w:r>
+          </w:p>
+        </w:tc>
+        <w:tc>
+          <w:tcPr>
+            <w:tcW w:w="1337" w:type="dxa"/>
+          </w:tcPr>
+          <w:p>
+            <w:pPr>
+              <w:spacing w:line="360" w:lineRule="auto"/>
+              <w:jc w:val="both"/>
+              <w:rPr>
+                <w:rFonts w:ascii="Arial" w:hAnsi="Arial" w:cs="Arial"/>
+                <w:color w:val="000000" w:themeColor="text1"/>
+                <w:sz w:val="16"/>
+                <w:szCs w:val="16"/>
+              </w:rPr>
+            </w:pPr>
+            <w:r>
+              <w:rPr>
+                <w:rFonts w:ascii="Arial" w:hAnsi="Arial" w:cs="Arial"/>
+                <w:color w:val="000000" w:themeColor="text1"/>
+                <w:sz w:val="16"/>
+                <w:szCs w:val="16"/>
+              </w:rPr>
+              <w:t>&lt; 15%</w:t>
+            </w:r>
+          </w:p>
+        </w:tc>
+        <w:tc>
+          <w:tcPr>
+            <w:tcW w:w="1337" w:type="dxa"/>
+          </w:tcPr>
+          <w:p>
+            <w:pPr>
+              <w:spacing w:line="360" w:lineRule="auto"/>
+              <w:jc w:val="both"/>
+              <w:rPr>
+                <w:rFonts w:ascii="Arial" w:hAnsi="Arial" w:cs="Arial"/>
+                <w:color w:val="000000" w:themeColor="text1"/>
+                <w:sz w:val="16"/>
+                <w:szCs w:val="16"/>
+              </w:rPr>
+            </w:pPr>
+            <w:r>
+              <w:rPr>
+                <w:rFonts w:ascii="Arial" w:hAnsi="Arial" w:cs="Arial"/>
+                <w:color w:val="000000" w:themeColor="text1"/>
+                <w:sz w:val="16"/>
+                <w:szCs w:val="16"/>
+              </w:rPr>
+              <w:t>Mensual</w:t>
+            </w:r>
+          </w:p>
+        </w:tc>
+        <w:tc>
+          <w:tcPr>
+            <w:tcW w:w="1337" w:type="dxa"/>
+          </w:tcPr>
+          <w:p>
+            <w:pPr>
+              <w:spacing w:line="360" w:lineRule="auto"/>
+              <w:jc w:val="both"/>
+              <w:rPr>
+                <w:rFonts w:ascii="Arial" w:hAnsi="Arial" w:cs="Arial"/>
+                <w:color w:val="000000" w:themeColor="text1"/>
+                <w:sz w:val="16"/>
+                <w:szCs w:val="16"/>
+              </w:rPr>
+            </w:pPr>
+            <w:r>
+              <w:rPr>
+                <w:rFonts w:ascii="Arial" w:hAnsi="Arial" w:cs="Arial"/>
+                <w:color w:val="000000" w:themeColor="text1"/>
+                <w:sz w:val="16"/>
+                <w:szCs w:val="16"/>
+              </w:rPr>
+              <w:t>Cobradores / Ingresos</w:t>
+            </w:r>
+          </w:p>
+        </w:tc>
+      </w:tr>
+      <w:tr>
+        <w:trPr>
+          <w:jc w:val="center"/>
+        </w:trPr>
+        <w:tc>
+          <w:tcPr>
+            <w:tcW w:w="1337" w:type="dxa"/>
+          </w:tcPr>
+          <w:p>
+            <w:pPr>
+              <w:spacing w:line="360" w:lineRule="auto"/>
+              <w:jc w:val="both"/>
+              <w:rPr>
+                <w:rFonts w:ascii="Arial" w:hAnsi="Arial" w:cs="Arial"/>
+                <w:color w:val="000000" w:themeColor="text1"/>
+                <w:sz w:val="16"/>
+                <w:szCs w:val="16"/>
+              </w:rPr>
+            </w:pPr>
+            <w:r>
+              <w:rPr>
+                <w:rFonts w:ascii="Arial" w:hAnsi="Arial" w:cs="Arial"/>
+                <w:b/>
+                <w:color w:val="000000" w:themeColor="text1"/>
+                <w:sz w:val="16"/>
+                <w:szCs w:val="16"/>
+              </w:rPr>
+              <w:t>CDR-REC</w:t>
+            </w:r>
+          </w:p>
+        </w:tc>
+        <w:tc>
+          <w:tcPr>
+            <w:tcW w:w="1337" w:type="dxa"/>
+          </w:tcPr>
+          <w:p>
+            <w:pPr>
+              <w:spacing w:line="360" w:lineRule="auto"/>
+              <w:jc w:val="both"/>
+              <w:rPr>
+                <w:rFonts w:ascii="Arial" w:hAnsi="Arial" w:cs="Arial"/>
+                <w:color w:val="000000" w:themeColor="text1"/>
+                <w:sz w:val="16"/>
+                <w:szCs w:val="16"/>
+              </w:rPr>
+            </w:pPr>
+            <w:r>
+              <w:rPr>
+                <w:rFonts w:ascii="Arial" w:hAnsi="Arial" w:cs="Arial"/>
+                <w:color w:val="000000" w:themeColor="text1"/>
+                <w:sz w:val="16"/>
+                <w:szCs w:val="16"/>
+              </w:rPr>
+              <w:t>Cobros Diarios Registrados</w:t>
+            </w:r>
+          </w:p>
+        </w:tc>
+        <w:tc>
+          <w:tcPr>
+            <w:tcW w:w="1337" w:type="dxa"/>
+          </w:tcPr>
+          <w:p>
+            <w:pPr>
+              <w:spacing w:line="360" w:lineRule="auto"/>
+              <w:jc w:val="both"/>
+              <w:rPr>
+                <w:rFonts w:ascii="Arial" w:hAnsi="Arial" w:cs="Arial"/>
+                <w:color w:val="000000" w:themeColor="text1"/>
+                <w:sz w:val="16"/>
+                <w:szCs w:val="16"/>
+              </w:rPr>
+            </w:pPr>
+            <w:r>
+              <w:rPr>
+                <w:rFonts w:ascii="Arial" w:hAnsi="Arial" w:cs="Arial"/>
+                <w:color w:val="000000" w:themeColor="text1"/>
+                <w:sz w:val="16"/>
+                <w:szCs w:val="16"/>
+              </w:rPr>
+              <w:t>Recaudación</w:t>
+            </w:r>
+          </w:p>
+        </w:tc>
+        <w:tc>
+          <w:tcPr>
+            <w:tcW w:w="1337" w:type="dxa"/>
+          </w:tcPr>
+          <w:p>
+            <w:pPr>
+              <w:spacing w:line="360" w:lineRule="auto"/>
+              <w:jc w:val="both"/>
+              <w:rPr>
+                <w:rFonts w:ascii="Arial" w:hAnsi="Arial" w:cs="Arial"/>
+                <w:color w:val="000000" w:themeColor="text1"/>
+                <w:sz w:val="16"/>
+                <w:szCs w:val="16"/>
+              </w:rPr>
+            </w:pPr>
+            <w:r>
+              <w:rPr>
+                <w:rFonts w:ascii="Arial" w:hAnsi="Arial" w:cs="Arial"/>
+                <w:color w:val="000000" w:themeColor="text1"/>
+                <w:sz w:val="16"/>
+                <w:szCs w:val="16"/>
+              </w:rPr>
+              <w:t>(Cobros en sistema / Puestos activos a cobrar) * 100</w:t>
+            </w:r>
+          </w:p>
+        </w:tc>
+        <w:tc>
+          <w:tcPr>
+            <w:tcW w:w="1337" w:type="dxa"/>
+          </w:tcPr>
+          <w:p>
+            <w:pPr>
+              <w:spacing w:line="360" w:lineRule="auto"/>
+              <w:jc w:val="both"/>
+              <w:rPr>
+                <w:rFonts w:ascii="Arial" w:hAnsi="Arial" w:cs="Arial"/>
+                <w:color w:val="000000" w:themeColor="text1"/>
+                <w:sz w:val="16"/>
+                <w:szCs w:val="16"/>
+              </w:rPr>
+            </w:pPr>
+            <w:r>
+              <w:rPr>
+                <w:rFonts w:ascii="Arial" w:hAnsi="Arial" w:cs="Arial"/>
+                <w:color w:val="000000" w:themeColor="text1"/>
+                <w:sz w:val="16"/>
+                <w:szCs w:val="16"/>
+              </w:rPr>
+              <w:t>&gt; 95%</w:t>
+            </w:r>
+          </w:p>
+        </w:tc>
+        <w:tc>
+          <w:tcPr>
+            <w:tcW w:w="1337" w:type="dxa"/>
+          </w:tcPr>
+          <w:p>
+            <w:pPr>
+              <w:spacing w:line="360" w:lineRule="auto"/>
+              <w:jc w:val="both"/>
+              <w:rPr>
+                <w:rFonts w:ascii="Arial" w:hAnsi="Arial" w:cs="Arial"/>
+                <w:color w:val="000000" w:themeColor="text1"/>
+                <w:sz w:val="16"/>
+                <w:szCs w:val="16"/>
+              </w:rPr>
+            </w:pPr>
+            <w:r>
+              <w:rPr>
+                <w:rFonts w:ascii="Arial" w:hAnsi="Arial" w:cs="Arial"/>
+                <w:color w:val="000000" w:themeColor="text1"/>
+                <w:sz w:val="16"/>
+                <w:szCs w:val="16"/>
+              </w:rPr>
+              <w:t>Diario</w:t>
+            </w:r>
+          </w:p>
+        </w:tc>
+        <w:tc>
+          <w:tcPr>
+            <w:tcW w:w="1337" w:type="dxa"/>
+          </w:tcPr>
+          <w:p>
+            <w:pPr>
+              <w:spacing w:line="360" w:lineRule="auto"/>
+              <w:jc w:val="both"/>
+              <w:rPr>
+                <w:rFonts w:ascii="Arial" w:hAnsi="Arial" w:cs="Arial"/>
+                <w:color w:val="000000" w:themeColor="text1"/>
+                <w:sz w:val="16"/>
+                <w:szCs w:val="16"/>
+              </w:rPr>
+            </w:pPr>
+            <w:r>
+              <w:rPr>
+                <w:rFonts w:ascii="Arial" w:hAnsi="Arial" w:cs="Arial"/>
+                <w:color w:val="000000" w:themeColor="text1"/>
+                <w:sz w:val="16"/>
+                <w:szCs w:val="16"/>
+              </w:rPr>
+              <w:t>Cobradores de Campo</w:t>
+            </w:r>
+          </w:p>
+        </w:tc>
+      </w:tr>
+      <w:tr>
+        <w:trPr>
+          <w:jc w:val="center"/>
+        </w:trPr>
+        <w:tc>
+          <w:tcPr>
+            <w:tcW w:w="1337" w:type="dxa"/>
+          </w:tcPr>
+          <w:p>
+            <w:pPr>
+              <w:spacing w:line="360" w:lineRule="auto"/>
+              <w:jc w:val="both"/>
+              <w:rPr>
+                <w:rFonts w:ascii="Arial" w:hAnsi="Arial" w:cs="Arial"/>
+                <w:color w:val="000000" w:themeColor="text1"/>
+                <w:sz w:val="16"/>
+                <w:szCs w:val="16"/>
+              </w:rPr>
+            </w:pPr>
+            <w:r>
+              <w:rPr>
+                <w:rFonts w:ascii="Arial" w:hAnsi="Arial" w:cs="Arial"/>
+                <w:b/>
+                <w:color w:val="000000" w:themeColor="text1"/>
+                <w:sz w:val="16"/>
+                <w:szCs w:val="16"/>
+              </w:rPr>
+              <w:t>VS-DEV</w:t>
+            </w:r>
+          </w:p>
+        </w:tc>
+        <w:tc>
+          <w:tcPr>
+            <w:tcW w:w="1337" w:type="dxa"/>
+          </w:tcPr>
+          <w:p>
+            <w:pPr>
+              <w:spacing w:line="360" w:lineRule="auto"/>
+              <w:jc w:val="both"/>
+              <w:rPr>
+                <w:rFonts w:ascii="Arial" w:hAnsi="Arial" w:cs="Arial"/>
+                <w:color w:val="000000" w:themeColor="text1"/>
+                <w:sz w:val="16"/>
+                <w:szCs w:val="16"/>
+              </w:rPr>
+            </w:pPr>
+            <w:r>
+              <w:rPr>
+                <w:rFonts w:ascii="Arial" w:hAnsi="Arial" w:cs="Arial"/>
+                <w:color w:val="000000" w:themeColor="text1"/>
+                <w:sz w:val="16"/>
+                <w:szCs w:val="16"/>
+              </w:rPr>
+              <w:t>Velocidad de Sprint</w:t>
+            </w:r>
+          </w:p>
+        </w:tc>
+        <w:tc>
+          <w:tcPr>
+            <w:tcW w:w="1337" w:type="dxa"/>
+          </w:tcPr>
+          <w:p>
+            <w:pPr>
+              <w:spacing w:line="360" w:lineRule="auto"/>
+              <w:jc w:val="both"/>
+              <w:rPr>
+                <w:rFonts w:ascii="Arial" w:hAnsi="Arial" w:cs="Arial"/>
+                <w:color w:val="000000" w:themeColor="text1"/>
+                <w:sz w:val="16"/>
+                <w:szCs w:val="16"/>
+              </w:rPr>
+            </w:pPr>
+            <w:r>
+              <w:rPr>
+                <w:rFonts w:ascii="Arial" w:hAnsi="Arial" w:cs="Arial"/>
+                <w:color w:val="000000" w:themeColor="text1"/>
+                <w:sz w:val="16"/>
+                <w:szCs w:val="16"/>
+              </w:rPr>
+              <w:t>Desarrollo</w:t>
+            </w:r>
+          </w:p>
+        </w:tc>
+        <w:tc>
+          <w:tcPr>
+            <w:tcW w:w="1337" w:type="dxa"/>
+          </w:tcPr>
+          <w:p>
+            <w:pPr>
+              <w:spacing w:line="360" w:lineRule="auto"/>
+              <w:jc w:val="both"/>
+              <w:rPr>
+                <w:rFonts w:ascii="Arial" w:hAnsi="Arial" w:cs="Arial"/>
+                <w:color w:val="000000" w:themeColor="text1"/>
+                <w:sz w:val="16"/>
+                <w:szCs w:val="16"/>
+              </w:rPr>
+            </w:pPr>
+            <w:proofErr w:type="spellStart"/>
+            <w:r>
+              <w:rPr>
+                <w:rFonts w:ascii="Arial" w:hAnsi="Arial" w:cs="Arial"/>
+                <w:color w:val="000000" w:themeColor="text1"/>
+                <w:sz w:val="16"/>
+                <w:szCs w:val="16"/>
+              </w:rPr>
+              <w:t>Story</w:t>
+            </w:r>
+            <w:proofErr w:type="spellEnd"/>
+            <w:r>
+              <w:rPr>
+                <w:rFonts w:ascii="Arial" w:hAnsi="Arial" w:cs="Arial"/>
+                <w:color w:val="000000" w:themeColor="text1"/>
+                <w:sz w:val="16"/>
+                <w:szCs w:val="16"/>
+              </w:rPr>
+              <w:t xml:space="preserve"> </w:t>
+            </w:r>
+            <w:proofErr w:type="spellStart"/>
+            <w:r>
+              <w:rPr>
+                <w:rFonts w:ascii="Arial" w:hAnsi="Arial" w:cs="Arial"/>
+                <w:color w:val="000000" w:themeColor="text1"/>
+                <w:sz w:val="16"/>
+                <w:szCs w:val="16"/>
+              </w:rPr>
+              <w:t>Points</w:t>
+            </w:r>
+            <w:proofErr w:type="spellEnd"/>
+            <w:r>
+              <w:rPr>
+                <w:rFonts w:ascii="Arial" w:hAnsi="Arial" w:cs="Arial"/>
+                <w:color w:val="000000" w:themeColor="text1"/>
+                <w:sz w:val="16"/>
+                <w:szCs w:val="16"/>
+              </w:rPr>
+              <w:t xml:space="preserve"> completados / </w:t>
+            </w:r>
+            <w:proofErr w:type="spellStart"/>
+            <w:r>
+              <w:rPr>
+                <w:rFonts w:ascii="Arial" w:hAnsi="Arial" w:cs="Arial"/>
+                <w:color w:val="000000" w:themeColor="text1"/>
+                <w:sz w:val="16"/>
+                <w:szCs w:val="16"/>
+              </w:rPr>
+              <w:t>Story</w:t>
+            </w:r>
+            <w:proofErr w:type="spellEnd"/>
+            <w:r>
+              <w:rPr>
+                <w:rFonts w:ascii="Arial" w:hAnsi="Arial" w:cs="Arial"/>
+                <w:color w:val="000000" w:themeColor="text1"/>
+                <w:sz w:val="16"/>
+                <w:szCs w:val="16"/>
+              </w:rPr>
+              <w:t xml:space="preserve"> </w:t>
+            </w:r>
+            <w:proofErr w:type="spellStart"/>
+            <w:r>
+              <w:rPr>
+                <w:rFonts w:ascii="Arial" w:hAnsi="Arial" w:cs="Arial"/>
+                <w:color w:val="000000" w:themeColor="text1"/>
+                <w:sz w:val="16"/>
+                <w:szCs w:val="16"/>
+              </w:rPr>
+              <w:t>Points</w:t>
+            </w:r>
+            <w:proofErr w:type="spellEnd"/>
+            <w:r>
+              <w:rPr>
+                <w:rFonts w:ascii="Arial" w:hAnsi="Arial" w:cs="Arial"/>
+                <w:color w:val="000000" w:themeColor="text1"/>
+                <w:sz w:val="16"/>
+                <w:szCs w:val="16"/>
+              </w:rPr>
+              <w:t xml:space="preserve"> planificados</w:t>
+            </w:r>
+          </w:p>
+        </w:tc>
+        <w:tc>
+          <w:tcPr>
+            <w:tcW w:w="1337" w:type="dxa"/>
+          </w:tcPr>
+          <w:p>
+            <w:pPr>
+              <w:spacing w:line="360" w:lineRule="auto"/>
+              <w:jc w:val="both"/>
+              <w:rPr>
+                <w:rFonts w:ascii="Arial" w:hAnsi="Arial" w:cs="Arial"/>
+                <w:color w:val="000000" w:themeColor="text1"/>
+                <w:sz w:val="16"/>
+                <w:szCs w:val="16"/>
+              </w:rPr>
+            </w:pPr>
+            <w:r>
+              <w:rPr>
+                <w:rFonts w:ascii="Arial" w:hAnsi="Arial" w:cs="Arial"/>
+                <w:color w:val="000000" w:themeColor="text1"/>
+                <w:sz w:val="16"/>
+                <w:szCs w:val="16"/>
+              </w:rPr>
+              <w:t>&gt;= 85%</w:t>
+            </w:r>
+          </w:p>
+        </w:tc>
+        <w:tc>
+          <w:tcPr>
+            <w:tcW w:w="1337" w:type="dxa"/>
+          </w:tcPr>
+          <w:p>
+            <w:pPr>
+              <w:spacing w:line="360" w:lineRule="auto"/>
+              <w:jc w:val="both"/>
+              <w:rPr>
+                <w:rFonts w:ascii="Arial" w:hAnsi="Arial" w:cs="Arial"/>
+                <w:color w:val="000000" w:themeColor="text1"/>
+                <w:sz w:val="16"/>
+                <w:szCs w:val="16"/>
+              </w:rPr>
+            </w:pPr>
+            <w:r>
+              <w:rPr>
+                <w:rFonts w:ascii="Arial" w:hAnsi="Arial" w:cs="Arial"/>
+                <w:color w:val="000000" w:themeColor="text1"/>
+                <w:sz w:val="16"/>
+                <w:szCs w:val="16"/>
+              </w:rPr>
+              <w:t>Sprint</w:t>
+            </w:r>
+          </w:p>
+        </w:tc>
+        <w:tc>
+          <w:tcPr>
+            <w:tcW w:w="1337" w:type="dxa"/>
+          </w:tcPr>
+          <w:p>
+            <w:pPr>
+              <w:spacing w:line="360" w:lineRule="auto"/>
+              <w:jc w:val="both"/>
+              <w:rPr>
+                <w:rFonts w:ascii="Arial" w:hAnsi="Arial" w:cs="Arial"/>
+                <w:color w:val="000000" w:themeColor="text1"/>
+                <w:sz w:val="16"/>
+                <w:szCs w:val="16"/>
+              </w:rPr>
+            </w:pPr>
+            <w:r>
+              <w:rPr>
+                <w:rFonts w:ascii="Arial" w:hAnsi="Arial" w:cs="Arial"/>
+                <w:color w:val="000000" w:themeColor="text1"/>
+                <w:sz w:val="16"/>
+                <w:szCs w:val="16"/>
+              </w:rPr>
+              <w:t>Scrum Master</w:t>
+            </w:r>
+          </w:p>
+        </w:tc>
+      </w:tr>
+      <w:tr>
+        <w:trPr>
+          <w:jc w:val="center"/>
+        </w:trPr>
+        <w:tc>
+          <w:tcPr>
+            <w:tcW w:w="1337" w:type="dxa"/>
+          </w:tcPr>
+          <w:p>
+            <w:pPr>
+              <w:spacing w:line="360" w:lineRule="auto"/>
+              <w:jc w:val="both"/>
+              <w:rPr>
+                <w:rFonts w:ascii="Arial" w:hAnsi="Arial" w:cs="Arial"/>
+                <w:color w:val="000000" w:themeColor="text1"/>
+                <w:sz w:val="16"/>
+                <w:szCs w:val="16"/>
+              </w:rPr>
+            </w:pPr>
+            <w:r>
+              <w:rPr>
+                <w:rFonts w:ascii="Arial" w:hAnsi="Arial" w:cs="Arial"/>
+                <w:b/>
+                <w:color w:val="000000" w:themeColor="text1"/>
+                <w:sz w:val="16"/>
+                <w:szCs w:val="16"/>
+              </w:rPr>
+              <w:t>PBD-DEV</w:t>
+            </w:r>
+          </w:p>
+        </w:tc>
+        <w:tc>
+          <w:tcPr>
+            <w:tcW w:w="1337" w:type="dxa"/>
+          </w:tcPr>
+          <w:p>
+            <w:pPr>
+              <w:spacing w:line="360" w:lineRule="auto"/>
+              <w:jc w:val="both"/>
+              <w:rPr>
+                <w:rFonts w:ascii="Arial" w:hAnsi="Arial" w:cs="Arial"/>
+                <w:color w:val="000000" w:themeColor="text1"/>
+                <w:sz w:val="16"/>
+                <w:szCs w:val="16"/>
+              </w:rPr>
+            </w:pPr>
+            <w:r>
+              <w:rPr>
+                <w:rFonts w:ascii="Arial" w:hAnsi="Arial" w:cs="Arial"/>
+                <w:color w:val="000000" w:themeColor="text1"/>
+                <w:sz w:val="16"/>
+                <w:szCs w:val="16"/>
+              </w:rPr>
+              <w:t xml:space="preserve">Progreso de </w:t>
+            </w:r>
+            <w:proofErr w:type="spellStart"/>
+            <w:r>
+              <w:rPr>
+                <w:rFonts w:ascii="Arial" w:hAnsi="Arial" w:cs="Arial"/>
+                <w:color w:val="000000" w:themeColor="text1"/>
+                <w:sz w:val="16"/>
+                <w:szCs w:val="16"/>
+              </w:rPr>
+              <w:t>Burn-down</w:t>
+            </w:r>
+            <w:proofErr w:type="spellEnd"/>
+          </w:p>
+        </w:tc>
+        <w:tc>
+          <w:tcPr>
+            <w:tcW w:w="1337" w:type="dxa"/>
+          </w:tcPr>
+          <w:p>
+            <w:pPr>
+              <w:spacing w:line="360" w:lineRule="auto"/>
+              <w:jc w:val="both"/>
+              <w:rPr>
+                <w:rFonts w:ascii="Arial" w:hAnsi="Arial" w:cs="Arial"/>
+                <w:color w:val="000000" w:themeColor="text1"/>
+                <w:sz w:val="16"/>
+                <w:szCs w:val="16"/>
+              </w:rPr>
+            </w:pPr>
+            <w:r>
+              <w:rPr>
+                <w:rFonts w:ascii="Arial" w:hAnsi="Arial" w:cs="Arial"/>
+                <w:color w:val="000000" w:themeColor="text1"/>
+                <w:sz w:val="16"/>
+                <w:szCs w:val="16"/>
+              </w:rPr>
+              <w:t>Desarrollo</w:t>
+            </w:r>
+          </w:p>
+        </w:tc>
+        <w:tc>
+          <w:tcPr>
+            <w:tcW w:w="1337" w:type="dxa"/>
+          </w:tcPr>
+          <w:p>
+            <w:pPr>
+              <w:spacing w:line="360" w:lineRule="auto"/>
+              <w:jc w:val="both"/>
+              <w:rPr>
+                <w:rFonts w:ascii="Arial" w:hAnsi="Arial" w:cs="Arial"/>
+                <w:color w:val="000000" w:themeColor="text1"/>
+                <w:sz w:val="16"/>
+                <w:szCs w:val="16"/>
+              </w:rPr>
+            </w:pPr>
+            <w:r>
+              <w:rPr>
+                <w:rFonts w:ascii="Arial" w:hAnsi="Arial" w:cs="Arial"/>
+                <w:color w:val="000000" w:themeColor="text1"/>
+                <w:sz w:val="16"/>
+                <w:szCs w:val="16"/>
+              </w:rPr>
+              <w:t>Esfuerzo diario pendiente vs. Capacidad ideal</w:t>
+            </w:r>
+          </w:p>
+        </w:tc>
+        <w:tc>
+          <w:tcPr>
+            <w:tcW w:w="1337" w:type="dxa"/>
+          </w:tcPr>
+          <w:p>
+            <w:pPr>
+              <w:spacing w:line="360" w:lineRule="auto"/>
+              <w:jc w:val="both"/>
+              <w:rPr>
+                <w:rFonts w:ascii="Arial" w:hAnsi="Arial" w:cs="Arial"/>
+                <w:color w:val="000000" w:themeColor="text1"/>
+                <w:sz w:val="16"/>
+                <w:szCs w:val="16"/>
+              </w:rPr>
+            </w:pPr>
+            <w:proofErr w:type="spellStart"/>
+            <w:r>
+              <w:rPr>
+                <w:rFonts w:ascii="Arial" w:hAnsi="Arial" w:cs="Arial"/>
+                <w:color w:val="000000" w:themeColor="text1"/>
+                <w:sz w:val="16"/>
+                <w:szCs w:val="16"/>
+              </w:rPr>
+              <w:t>Desv</w:t>
+            </w:r>
+            <w:proofErr w:type="spellEnd"/>
+            <w:r>
+              <w:rPr>
+                <w:rFonts w:ascii="Arial" w:hAnsi="Arial" w:cs="Arial"/>
+                <w:color w:val="000000" w:themeColor="text1"/>
+                <w:sz w:val="16"/>
+                <w:szCs w:val="16"/>
+              </w:rPr>
+              <w:t>. &lt; 10%</w:t>
+            </w:r>
+          </w:p>
+        </w:tc>
+        <w:tc>
+          <w:tcPr>
+            <w:tcW w:w="1337" w:type="dxa"/>
+          </w:tcPr>
+          <w:p>
+            <w:pPr>
+              <w:spacing w:line="360" w:lineRule="auto"/>
+              <w:jc w:val="both"/>
+              <w:rPr>
+                <w:rFonts w:ascii="Arial" w:hAnsi="Arial" w:cs="Arial"/>
+                <w:color w:val="000000" w:themeColor="text1"/>
+                <w:sz w:val="16"/>
+                <w:szCs w:val="16"/>
+              </w:rPr>
+            </w:pPr>
+            <w:r>
+              <w:rPr>
+                <w:rFonts w:ascii="Arial" w:hAnsi="Arial" w:cs="Arial"/>
+                <w:color w:val="000000" w:themeColor="text1"/>
+                <w:sz w:val="16"/>
+                <w:szCs w:val="16"/>
+              </w:rPr>
+              <w:t>Diario</w:t>
+            </w:r>
+          </w:p>
+        </w:tc>
+        <w:tc>
+          <w:tcPr>
+            <w:tcW w:w="1337" w:type="dxa"/>
+          </w:tcPr>
+          <w:p>
+            <w:pPr>
+              <w:spacing w:line="360" w:lineRule="auto"/>
+              <w:jc w:val="both"/>
+              <w:rPr>
+                <w:rFonts w:ascii="Arial" w:hAnsi="Arial" w:cs="Arial"/>
+                <w:color w:val="000000" w:themeColor="text1"/>
+                <w:sz w:val="16"/>
+                <w:szCs w:val="16"/>
+              </w:rPr>
+            </w:pPr>
+            <w:r>
+              <w:rPr>
+                <w:rFonts w:ascii="Arial" w:hAnsi="Arial" w:cs="Arial"/>
+                <w:color w:val="000000" w:themeColor="text1"/>
+                <w:sz w:val="16"/>
+                <w:szCs w:val="16"/>
+              </w:rPr>
+              <w:t>Equipo Técnico</w:t>
+            </w:r>
+          </w:p>
+        </w:tc>
+      </w:tr>
+      <w:tr>
+        <w:trPr>
+          <w:jc w:val="center"/>
+        </w:trPr>
+        <w:tc>
+          <w:tcPr>
+            <w:tcW w:w="1337" w:type="dxa"/>
+          </w:tcPr>
+          <w:p>
+            <w:pPr>
+              <w:spacing w:line="360" w:lineRule="auto"/>
+              <w:jc w:val="both"/>
+              <w:rPr>
+                <w:rFonts w:ascii="Arial" w:hAnsi="Arial" w:cs="Arial"/>
+                <w:color w:val="000000" w:themeColor="text1"/>
+                <w:sz w:val="16"/>
+                <w:szCs w:val="16"/>
+              </w:rPr>
+            </w:pPr>
+            <w:r>
+              <w:rPr>
+                <w:rFonts w:ascii="Arial" w:hAnsi="Arial" w:cs="Arial"/>
+                <w:b/>
+                <w:color w:val="000000" w:themeColor="text1"/>
+                <w:sz w:val="16"/>
+                <w:szCs w:val="16"/>
+              </w:rPr>
+              <w:t>LVV-SAN</w:t>
+            </w:r>
+          </w:p>
+        </w:tc>
+        <w:tc>
+          <w:tcPr>
+            <w:tcW w:w="1337" w:type="dxa"/>
+          </w:tcPr>
+          <w:p>
+            <w:pPr>
+              <w:spacing w:line="360" w:lineRule="auto"/>
+              <w:jc w:val="both"/>
+              <w:rPr>
+                <w:rFonts w:ascii="Arial" w:hAnsi="Arial" w:cs="Arial"/>
+                <w:color w:val="000000" w:themeColor="text1"/>
+                <w:sz w:val="16"/>
+                <w:szCs w:val="16"/>
+              </w:rPr>
+            </w:pPr>
+            <w:r>
+              <w:rPr>
+                <w:rFonts w:ascii="Arial" w:hAnsi="Arial" w:cs="Arial"/>
+                <w:color w:val="000000" w:themeColor="text1"/>
+                <w:sz w:val="16"/>
+                <w:szCs w:val="16"/>
+              </w:rPr>
+              <w:t>Licencias Sanitarias Vigentes</w:t>
+            </w:r>
+          </w:p>
+        </w:tc>
+        <w:tc>
+          <w:tcPr>
+            <w:tcW w:w="1337" w:type="dxa"/>
+          </w:tcPr>
+          <w:p>
+            <w:pPr>
+              <w:spacing w:line="360" w:lineRule="auto"/>
+              <w:jc w:val="both"/>
+              <w:rPr>
+                <w:rFonts w:ascii="Arial" w:hAnsi="Arial" w:cs="Arial"/>
+                <w:color w:val="000000" w:themeColor="text1"/>
+                <w:sz w:val="16"/>
+                <w:szCs w:val="16"/>
+              </w:rPr>
+            </w:pPr>
+            <w:r>
+              <w:rPr>
+                <w:rFonts w:ascii="Arial" w:hAnsi="Arial" w:cs="Arial"/>
+                <w:color w:val="000000" w:themeColor="text1"/>
+                <w:sz w:val="16"/>
+                <w:szCs w:val="16"/>
+              </w:rPr>
+              <w:t>Control Sanitario</w:t>
+            </w:r>
+          </w:p>
+        </w:tc>
+        <w:tc>
+          <w:tcPr>
+            <w:tcW w:w="1337" w:type="dxa"/>
+          </w:tcPr>
+          <w:p>
+            <w:pPr>
+              <w:spacing w:line="360" w:lineRule="auto"/>
+              <w:jc w:val="both"/>
+              <w:rPr>
+                <w:rFonts w:ascii="Arial" w:hAnsi="Arial" w:cs="Arial"/>
+                <w:color w:val="000000" w:themeColor="text1"/>
+                <w:sz w:val="16"/>
+                <w:szCs w:val="16"/>
+              </w:rPr>
+            </w:pPr>
+            <w:r>
+              <w:rPr>
+                <w:rFonts w:ascii="Arial" w:hAnsi="Arial" w:cs="Arial"/>
+                <w:color w:val="000000" w:themeColor="text1"/>
+                <w:sz w:val="16"/>
+                <w:szCs w:val="16"/>
+              </w:rPr>
+              <w:t>(Licencias vigentes / Total puestos alimentos) * 100</w:t>
+            </w:r>
+          </w:p>
+        </w:tc>
+        <w:tc>
+          <w:tcPr>
+            <w:tcW w:w="1337" w:type="dxa"/>
+          </w:tcPr>
+          <w:p>
+            <w:pPr>
+              <w:spacing w:line="360" w:lineRule="auto"/>
+              <w:jc w:val="both"/>
+              <w:rPr>
+                <w:rFonts w:ascii="Arial" w:hAnsi="Arial" w:cs="Arial"/>
+                <w:color w:val="000000" w:themeColor="text1"/>
+                <w:sz w:val="16"/>
+                <w:szCs w:val="16"/>
+              </w:rPr>
+            </w:pPr>
+            <w:r>
+              <w:rPr>
+                <w:rFonts w:ascii="Arial" w:hAnsi="Arial" w:cs="Arial"/>
+                <w:color w:val="000000" w:themeColor="text1"/>
+                <w:sz w:val="16"/>
+                <w:szCs w:val="16"/>
+              </w:rPr>
+              <w:t>&gt;= 90%</w:t>
+            </w:r>
+          </w:p>
+        </w:tc>
+        <w:tc>
+          <w:tcPr>
+            <w:tcW w:w="1337" w:type="dxa"/>
+          </w:tcPr>
+          <w:p>
+            <w:pPr>
+              <w:spacing w:line="360" w:lineRule="auto"/>
+              <w:jc w:val="both"/>
+              <w:rPr>
+                <w:rFonts w:ascii="Arial" w:hAnsi="Arial" w:cs="Arial"/>
+                <w:color w:val="000000" w:themeColor="text1"/>
+                <w:sz w:val="16"/>
+                <w:szCs w:val="16"/>
+              </w:rPr>
+            </w:pPr>
+            <w:r>
+              <w:rPr>
+                <w:rFonts w:ascii="Arial" w:hAnsi="Arial" w:cs="Arial"/>
+                <w:color w:val="000000" w:themeColor="text1"/>
+                <w:sz w:val="16"/>
+                <w:szCs w:val="16"/>
+              </w:rPr>
+              <w:t>Quincenal</w:t>
+            </w:r>
+          </w:p>
+        </w:tc>
+        <w:tc>
+          <w:tcPr>
+            <w:tcW w:w="1337" w:type="dxa"/>
+          </w:tcPr>
+          <w:p>
+            <w:pPr>
+              <w:spacing w:line="360" w:lineRule="auto"/>
+              <w:jc w:val="both"/>
+              <w:rPr>
+                <w:rFonts w:ascii="Arial" w:hAnsi="Arial" w:cs="Arial"/>
+                <w:color w:val="000000" w:themeColor="text1"/>
+                <w:sz w:val="16"/>
+                <w:szCs w:val="16"/>
+              </w:rPr>
+            </w:pPr>
+            <w:r>
+              <w:rPr>
+                <w:rFonts w:ascii="Arial" w:hAnsi="Arial" w:cs="Arial"/>
+                <w:color w:val="000000" w:themeColor="text1"/>
+                <w:sz w:val="16"/>
+                <w:szCs w:val="16"/>
+              </w:rPr>
+              <w:t>Inspector Sanitario</w:t>
+            </w:r>
+          </w:p>
+        </w:tc>
+      </w:tr>
+      <w:tr>
+        <w:trPr>
+          <w:jc w:val="center"/>
+        </w:trPr>
+        <w:tc>
+          <w:tcPr>
+            <w:tcW w:w="1337" w:type="dxa"/>
+          </w:tcPr>
+          <w:p>
+            <w:pPr>
+              <w:spacing w:line="360" w:lineRule="auto"/>
+              <w:jc w:val="both"/>
+              <w:rPr>
+                <w:rFonts w:ascii="Arial" w:hAnsi="Arial" w:cs="Arial"/>
+                <w:color w:val="000000" w:themeColor="text1"/>
+                <w:sz w:val="16"/>
+                <w:szCs w:val="16"/>
+              </w:rPr>
+            </w:pPr>
+            <w:r>
+              <w:rPr>
+                <w:rFonts w:ascii="Arial" w:hAnsi="Arial" w:cs="Arial"/>
+                <w:b/>
+                <w:color w:val="000000" w:themeColor="text1"/>
+                <w:sz w:val="16"/>
+                <w:szCs w:val="16"/>
+              </w:rPr>
+              <w:t>ISR-SAN</w:t>
+            </w:r>
+          </w:p>
+        </w:tc>
+        <w:tc>
+          <w:tcPr>
+            <w:tcW w:w="1337" w:type="dxa"/>
+          </w:tcPr>
+          <w:p>
+            <w:pPr>
+              <w:spacing w:line="360" w:lineRule="auto"/>
+              <w:jc w:val="both"/>
+              <w:rPr>
+                <w:rFonts w:ascii="Arial" w:hAnsi="Arial" w:cs="Arial"/>
+                <w:color w:val="000000" w:themeColor="text1"/>
+                <w:sz w:val="16"/>
+                <w:szCs w:val="16"/>
+              </w:rPr>
+            </w:pPr>
+            <w:r>
+              <w:rPr>
+                <w:rFonts w:ascii="Arial" w:hAnsi="Arial" w:cs="Arial"/>
+                <w:color w:val="000000" w:themeColor="text1"/>
+                <w:sz w:val="16"/>
+                <w:szCs w:val="16"/>
+              </w:rPr>
+              <w:t>Inspecciones Semanales</w:t>
+            </w:r>
+          </w:p>
+        </w:tc>
+        <w:tc>
+          <w:tcPr>
+            <w:tcW w:w="1337" w:type="dxa"/>
+          </w:tcPr>
+          <w:p>
+            <w:pPr>
+              <w:spacing w:line="360" w:lineRule="auto"/>
+              <w:jc w:val="both"/>
+              <w:rPr>
+                <w:rFonts w:ascii="Arial" w:hAnsi="Arial" w:cs="Arial"/>
+                <w:color w:val="000000" w:themeColor="text1"/>
+                <w:sz w:val="16"/>
+                <w:szCs w:val="16"/>
+              </w:rPr>
+            </w:pPr>
+            <w:r>
+              <w:rPr>
+                <w:rFonts w:ascii="Arial" w:hAnsi="Arial" w:cs="Arial"/>
+                <w:color w:val="000000" w:themeColor="text1"/>
+                <w:sz w:val="16"/>
+                <w:szCs w:val="16"/>
+              </w:rPr>
+              <w:t>Control Sanitario</w:t>
+            </w:r>
+          </w:p>
+        </w:tc>
+        <w:tc>
+          <w:tcPr>
+            <w:tcW w:w="1337" w:type="dxa"/>
+          </w:tcPr>
+          <w:p>
+            <w:pPr>
+              <w:spacing w:line="360" w:lineRule="auto"/>
+              <w:jc w:val="both"/>
+              <w:rPr>
+                <w:rFonts w:ascii="Arial" w:hAnsi="Arial" w:cs="Arial"/>
+                <w:color w:val="000000" w:themeColor="text1"/>
+                <w:sz w:val="16"/>
+                <w:szCs w:val="16"/>
+              </w:rPr>
+            </w:pPr>
+            <w:r>
+              <w:rPr>
+                <w:rFonts w:ascii="Arial" w:hAnsi="Arial" w:cs="Arial"/>
+                <w:color w:val="000000" w:themeColor="text1"/>
+                <w:sz w:val="16"/>
+                <w:szCs w:val="16"/>
+              </w:rPr>
+              <w:t>Cantidad de inspecciones sanitarias en sistema</w:t>
+            </w:r>
+          </w:p>
+        </w:tc>
+        <w:tc>
+          <w:tcPr>
+            <w:tcW w:w="1337" w:type="dxa"/>
+          </w:tcPr>
+          <w:p>
+            <w:pPr>
+              <w:spacing w:line="360" w:lineRule="auto"/>
+              <w:jc w:val="both"/>
+              <w:rPr>
+                <w:rFonts w:ascii="Arial" w:hAnsi="Arial" w:cs="Arial"/>
+                <w:color w:val="000000" w:themeColor="text1"/>
+                <w:sz w:val="16"/>
+                <w:szCs w:val="16"/>
+              </w:rPr>
+            </w:pPr>
+            <w:r>
+              <w:rPr>
+                <w:rFonts w:ascii="Arial" w:hAnsi="Arial" w:cs="Arial"/>
+                <w:color w:val="000000" w:themeColor="text1"/>
+                <w:sz w:val="16"/>
+                <w:szCs w:val="16"/>
+              </w:rPr>
+              <w:t xml:space="preserve">&gt;= 30 </w:t>
+            </w:r>
+            <w:proofErr w:type="spellStart"/>
+            <w:r>
+              <w:rPr>
+                <w:rFonts w:ascii="Arial" w:hAnsi="Arial" w:cs="Arial"/>
+                <w:color w:val="000000" w:themeColor="text1"/>
+                <w:sz w:val="16"/>
+                <w:szCs w:val="16"/>
+              </w:rPr>
+              <w:t>ins</w:t>
+            </w:r>
+            <w:proofErr w:type="spellEnd"/>
+            <w:r>
+              <w:rPr>
+                <w:rFonts w:ascii="Arial" w:hAnsi="Arial" w:cs="Arial"/>
+                <w:color w:val="000000" w:themeColor="text1"/>
+                <w:sz w:val="16"/>
+                <w:szCs w:val="16"/>
+              </w:rPr>
+              <w:t>.</w:t>
+            </w:r>
+          </w:p>
+        </w:tc>
+        <w:tc>
+          <w:tcPr>
+            <w:tcW w:w="1337" w:type="dxa"/>
+          </w:tcPr>
+          <w:p>
+            <w:pPr>
+              <w:spacing w:line="360" w:lineRule="auto"/>
+              <w:jc w:val="both"/>
+              <w:rPr>
+                <w:rFonts w:ascii="Arial" w:hAnsi="Arial" w:cs="Arial"/>
+                <w:color w:val="000000" w:themeColor="text1"/>
+                <w:sz w:val="16"/>
+                <w:szCs w:val="16"/>
+              </w:rPr>
+            </w:pPr>
+            <w:r>
+              <w:rPr>
+                <w:rFonts w:ascii="Arial" w:hAnsi="Arial" w:cs="Arial"/>
+                <w:color w:val="000000" w:themeColor="text1"/>
+                <w:sz w:val="16"/>
+                <w:szCs w:val="16"/>
+              </w:rPr>
+              <w:t>Semanal</w:t>
+            </w:r>
+          </w:p>
+        </w:tc>
+        <w:tc>
+          <w:tcPr>
+            <w:tcW w:w="1337" w:type="dxa"/>
+          </w:tcPr>
+          <w:p>
+            <w:pPr>
+              <w:spacing w:line="360" w:lineRule="auto"/>
+              <w:jc w:val="both"/>
+              <w:rPr>
+                <w:rFonts w:ascii="Arial" w:hAnsi="Arial" w:cs="Arial"/>
+                <w:color w:val="000000" w:themeColor="text1"/>
+                <w:sz w:val="16"/>
+                <w:szCs w:val="16"/>
+              </w:rPr>
+            </w:pPr>
+            <w:r>
+              <w:rPr>
+                <w:rFonts w:ascii="Arial" w:hAnsi="Arial" w:cs="Arial"/>
+                <w:color w:val="000000" w:themeColor="text1"/>
+                <w:sz w:val="16"/>
+                <w:szCs w:val="16"/>
+              </w:rPr>
+              <w:t>Inspector Sanitario</w:t>
+            </w:r>
+          </w:p>
+        </w:tc>
+      </w:tr>
+      <w:tr>
+        <w:trPr>
+          <w:jc w:val="center"/>
+        </w:trPr>
+        <w:tc>
+          <w:tcPr>
+            <w:tcW w:w="1337" w:type="dxa"/>
+          </w:tcPr>
+          <w:p>
+            <w:pPr>
+              <w:spacing w:line="360" w:lineRule="auto"/>
+              <w:jc w:val="both"/>
+              <w:rPr>
+                <w:rFonts w:ascii="Arial" w:hAnsi="Arial" w:cs="Arial"/>
+                <w:color w:val="000000" w:themeColor="text1"/>
+                <w:sz w:val="16"/>
+                <w:szCs w:val="16"/>
+              </w:rPr>
+            </w:pPr>
+            <w:r>
+              <w:rPr>
+                <w:rFonts w:ascii="Arial" w:hAnsi="Arial" w:cs="Arial"/>
+                <w:b/>
+                <w:color w:val="000000" w:themeColor="text1"/>
+                <w:sz w:val="16"/>
+                <w:szCs w:val="16"/>
+              </w:rPr>
+              <w:lastRenderedPageBreak/>
+              <w:t>EV-GOB</w:t>
+            </w:r>
+          </w:p>
+        </w:tc>
+        <w:tc>
+          <w:tcPr>
+            <w:tcW w:w="1337" w:type="dxa"/>
+          </w:tcPr>
+          <w:p>
+            <w:pPr>
+              <w:spacing w:line="360" w:lineRule="auto"/>
+              <w:jc w:val="both"/>
+              <w:rPr>
+                <w:rFonts w:ascii="Arial" w:hAnsi="Arial" w:cs="Arial"/>
+                <w:color w:val="000000" w:themeColor="text1"/>
+                <w:sz w:val="16"/>
+                <w:szCs w:val="16"/>
+              </w:rPr>
+            </w:pPr>
+            <w:r>
+              <w:rPr>
+                <w:rFonts w:ascii="Arial" w:hAnsi="Arial" w:cs="Arial"/>
+                <w:color w:val="000000" w:themeColor="text1"/>
+                <w:sz w:val="16"/>
+                <w:szCs w:val="16"/>
+              </w:rPr>
+              <w:t>Valor Ganado (EVM)</w:t>
+            </w:r>
+          </w:p>
+        </w:tc>
+        <w:tc>
+          <w:tcPr>
+            <w:tcW w:w="1337" w:type="dxa"/>
+          </w:tcPr>
+          <w:p>
+            <w:pPr>
+              <w:spacing w:line="360" w:lineRule="auto"/>
+              <w:jc w:val="both"/>
+              <w:rPr>
+                <w:rFonts w:ascii="Arial" w:hAnsi="Arial" w:cs="Arial"/>
+                <w:color w:val="000000" w:themeColor="text1"/>
+                <w:sz w:val="16"/>
+                <w:szCs w:val="16"/>
+              </w:rPr>
+            </w:pPr>
+            <w:r>
+              <w:rPr>
+                <w:rFonts w:ascii="Arial" w:hAnsi="Arial" w:cs="Arial"/>
+                <w:color w:val="000000" w:themeColor="text1"/>
+                <w:sz w:val="16"/>
+                <w:szCs w:val="16"/>
+              </w:rPr>
+              <w:t>Gobernanza</w:t>
+            </w:r>
+          </w:p>
+        </w:tc>
+        <w:tc>
+          <w:tcPr>
+            <w:tcW w:w="1337" w:type="dxa"/>
+          </w:tcPr>
+          <w:p>
+            <w:pPr>
+              <w:spacing w:line="360" w:lineRule="auto"/>
+              <w:jc w:val="both"/>
+              <w:rPr>
+                <w:rFonts w:ascii="Arial" w:hAnsi="Arial" w:cs="Arial"/>
+                <w:color w:val="000000" w:themeColor="text1"/>
+                <w:sz w:val="16"/>
+                <w:szCs w:val="16"/>
+              </w:rPr>
+            </w:pPr>
+            <w:r>
+              <w:rPr>
+                <w:rFonts w:ascii="Arial" w:hAnsi="Arial" w:cs="Arial"/>
+                <w:color w:val="000000" w:themeColor="text1"/>
+                <w:sz w:val="16"/>
+                <w:szCs w:val="16"/>
+              </w:rPr>
+              <w:t>Porcentaje de avance físico * Presupuesto BAC</w:t>
+            </w:r>
+          </w:p>
+        </w:tc>
+        <w:tc>
+          <w:tcPr>
+            <w:tcW w:w="1337" w:type="dxa"/>
+          </w:tcPr>
+          <w:p>
+            <w:pPr>
+              <w:spacing w:line="360" w:lineRule="auto"/>
+              <w:jc w:val="both"/>
+              <w:rPr>
+                <w:rFonts w:ascii="Arial" w:hAnsi="Arial" w:cs="Arial"/>
+                <w:color w:val="000000" w:themeColor="text1"/>
+                <w:sz w:val="16"/>
+                <w:szCs w:val="16"/>
+              </w:rPr>
+            </w:pPr>
+            <w:r>
+              <w:rPr>
+                <w:rFonts w:ascii="Arial" w:hAnsi="Arial" w:cs="Arial"/>
+                <w:color w:val="000000" w:themeColor="text1"/>
+                <w:sz w:val="16"/>
+                <w:szCs w:val="16"/>
+              </w:rPr>
+              <w:t>Alineado a Hitos</w:t>
+            </w:r>
+          </w:p>
+        </w:tc>
+        <w:tc>
+          <w:tcPr>
+            <w:tcW w:w="1337" w:type="dxa"/>
+          </w:tcPr>
+          <w:p>
+            <w:pPr>
+              <w:spacing w:line="360" w:lineRule="auto"/>
+              <w:jc w:val="both"/>
+              <w:rPr>
+                <w:rFonts w:ascii="Arial" w:hAnsi="Arial" w:cs="Arial"/>
+                <w:color w:val="000000" w:themeColor="text1"/>
+                <w:sz w:val="16"/>
+                <w:szCs w:val="16"/>
+              </w:rPr>
+            </w:pPr>
+            <w:r>
+              <w:rPr>
+                <w:rFonts w:ascii="Arial" w:hAnsi="Arial" w:cs="Arial"/>
+                <w:color w:val="000000" w:themeColor="text1"/>
+                <w:sz w:val="16"/>
+                <w:szCs w:val="16"/>
+              </w:rPr>
+              <w:t>Mensual</w:t>
+            </w:r>
+          </w:p>
+        </w:tc>
+        <w:tc>
+          <w:tcPr>
+            <w:tcW w:w="1337" w:type="dxa"/>
+          </w:tcPr>
+          <w:p>
+            <w:pPr>
+              <w:spacing w:line="360" w:lineRule="auto"/>
+              <w:jc w:val="both"/>
+              <w:rPr>
+                <w:rFonts w:ascii="Arial" w:hAnsi="Arial" w:cs="Arial"/>
+                <w:color w:val="000000" w:themeColor="text1"/>
+                <w:sz w:val="16"/>
+                <w:szCs w:val="16"/>
+              </w:rPr>
+            </w:pPr>
+            <w:r>
+              <w:rPr>
+                <w:rFonts w:ascii="Arial" w:hAnsi="Arial" w:cs="Arial"/>
+                <w:color w:val="000000" w:themeColor="text1"/>
+                <w:sz w:val="16"/>
+                <w:szCs w:val="16"/>
+              </w:rPr>
+              <w:t>Jefe de Proyecto (PM)</w:t>
+            </w:r>
+          </w:p>
+        </w:tc>
+      </w:tr>
+      <w:tr>
+        <w:trPr>
+          <w:jc w:val="center"/>
+        </w:trPr>
+        <w:tc>
+          <w:tcPr>
+            <w:tcW w:w="1337" w:type="dxa"/>
+          </w:tcPr>
+          <w:p>
+            <w:pPr>
+              <w:spacing w:line="360" w:lineRule="auto"/>
+              <w:jc w:val="both"/>
+              <w:rPr>
+                <w:rFonts w:ascii="Arial" w:hAnsi="Arial" w:cs="Arial"/>
+                <w:color w:val="000000" w:themeColor="text1"/>
+                <w:sz w:val="16"/>
+                <w:szCs w:val="16"/>
+              </w:rPr>
+            </w:pPr>
+            <w:r>
+              <w:rPr>
+                <w:rFonts w:ascii="Arial" w:hAnsi="Arial" w:cs="Arial"/>
+                <w:b/>
+                <w:color w:val="000000" w:themeColor="text1"/>
+                <w:sz w:val="16"/>
+                <w:szCs w:val="16"/>
+              </w:rPr>
+              <w:t>CPI-GOB</w:t>
+            </w:r>
+          </w:p>
+        </w:tc>
+        <w:tc>
+          <w:tcPr>
+            <w:tcW w:w="1337" w:type="dxa"/>
+          </w:tcPr>
+          <w:p>
+            <w:pPr>
+              <w:spacing w:line="360" w:lineRule="auto"/>
+              <w:jc w:val="both"/>
+              <w:rPr>
+                <w:rFonts w:ascii="Arial" w:hAnsi="Arial" w:cs="Arial"/>
+                <w:color w:val="000000" w:themeColor="text1"/>
+                <w:sz w:val="16"/>
+                <w:szCs w:val="16"/>
+              </w:rPr>
+            </w:pPr>
+            <w:r>
+              <w:rPr>
+                <w:rFonts w:ascii="Arial" w:hAnsi="Arial" w:cs="Arial"/>
+                <w:color w:val="000000" w:themeColor="text1"/>
+                <w:sz w:val="16"/>
+                <w:szCs w:val="16"/>
+              </w:rPr>
+              <w:t>Índice de Costos (CPI)</w:t>
+            </w:r>
+          </w:p>
+        </w:tc>
+        <w:tc>
+          <w:tcPr>
+            <w:tcW w:w="1337" w:type="dxa"/>
+          </w:tcPr>
+          <w:p>
+            <w:pPr>
+              <w:spacing w:line="360" w:lineRule="auto"/>
+              <w:jc w:val="both"/>
+              <w:rPr>
+                <w:rFonts w:ascii="Arial" w:hAnsi="Arial" w:cs="Arial"/>
+                <w:color w:val="000000" w:themeColor="text1"/>
+                <w:sz w:val="16"/>
+                <w:szCs w:val="16"/>
+              </w:rPr>
+            </w:pPr>
+            <w:r>
+              <w:rPr>
+                <w:rFonts w:ascii="Arial" w:hAnsi="Arial" w:cs="Arial"/>
+                <w:color w:val="000000" w:themeColor="text1"/>
+                <w:sz w:val="16"/>
+                <w:szCs w:val="16"/>
+              </w:rPr>
+              <w:t>Gobernanza</w:t>
+            </w:r>
+          </w:p>
+        </w:tc>
+        <w:tc>
+          <w:tcPr>
+            <w:tcW w:w="1337" w:type="dxa"/>
+          </w:tcPr>
+          <w:p>
+            <w:pPr>
+              <w:spacing w:line="360" w:lineRule="auto"/>
+              <w:jc w:val="both"/>
+              <w:rPr>
+                <w:rFonts w:ascii="Arial" w:hAnsi="Arial" w:cs="Arial"/>
+                <w:color w:val="000000" w:themeColor="text1"/>
+                <w:sz w:val="16"/>
+                <w:szCs w:val="16"/>
+              </w:rPr>
+            </w:pPr>
+            <w:r>
+              <w:rPr>
+                <w:rFonts w:ascii="Arial" w:hAnsi="Arial" w:cs="Arial"/>
+                <w:color w:val="000000" w:themeColor="text1"/>
+                <w:sz w:val="16"/>
+                <w:szCs w:val="16"/>
+              </w:rPr>
+              <w:t>Valor Ganado (EV) / Costo Real (AC)</w:t>
+            </w:r>
+          </w:p>
+        </w:tc>
+        <w:tc>
+          <w:tcPr>
+            <w:tcW w:w="1337" w:type="dxa"/>
+          </w:tcPr>
+          <w:p>
+            <w:pPr>
+              <w:spacing w:line="360" w:lineRule="auto"/>
+              <w:jc w:val="both"/>
+              <w:rPr>
+                <w:rFonts w:ascii="Arial" w:hAnsi="Arial" w:cs="Arial"/>
+                <w:color w:val="000000" w:themeColor="text1"/>
+                <w:sz w:val="16"/>
+                <w:szCs w:val="16"/>
+              </w:rPr>
+            </w:pPr>
+            <w:r>
+              <w:rPr>
+                <w:rFonts w:ascii="Arial" w:hAnsi="Arial" w:cs="Arial"/>
+                <w:color w:val="000000" w:themeColor="text1"/>
+                <w:sz w:val="16"/>
+                <w:szCs w:val="16"/>
+              </w:rPr>
+              <w:t>&gt;= 0.95</w:t>
+            </w:r>
+          </w:p>
+        </w:tc>
+        <w:tc>
+          <w:tcPr>
+            <w:tcW w:w="1337" w:type="dxa"/>
+          </w:tcPr>
+          <w:p>
+            <w:pPr>
+              <w:spacing w:line="360" w:lineRule="auto"/>
+              <w:jc w:val="both"/>
+              <w:rPr>
+                <w:rFonts w:ascii="Arial" w:hAnsi="Arial" w:cs="Arial"/>
+                <w:color w:val="000000" w:themeColor="text1"/>
+                <w:sz w:val="16"/>
+                <w:szCs w:val="16"/>
+              </w:rPr>
+            </w:pPr>
+            <w:r>
+              <w:rPr>
+                <w:rFonts w:ascii="Arial" w:hAnsi="Arial" w:cs="Arial"/>
+                <w:color w:val="000000" w:themeColor="text1"/>
+                <w:sz w:val="16"/>
+                <w:szCs w:val="16"/>
+              </w:rPr>
+              <w:t>Mensual</w:t>
+            </w:r>
+          </w:p>
+        </w:tc>
+        <w:tc>
+          <w:tcPr>
+            <w:tcW w:w="1337" w:type="dxa"/>
+          </w:tcPr>
+          <w:p>
+            <w:pPr>
+              <w:spacing w:line="360" w:lineRule="auto"/>
+              <w:jc w:val="both"/>
+              <w:rPr>
+                <w:rFonts w:ascii="Arial" w:hAnsi="Arial" w:cs="Arial"/>
+                <w:color w:val="000000" w:themeColor="text1"/>
+                <w:sz w:val="16"/>
+                <w:szCs w:val="16"/>
+              </w:rPr>
+            </w:pPr>
+            <w:r>
+              <w:rPr>
+                <w:rFonts w:ascii="Arial" w:hAnsi="Arial" w:cs="Arial"/>
+                <w:color w:val="000000" w:themeColor="text1"/>
+                <w:sz w:val="16"/>
+                <w:szCs w:val="16"/>
+              </w:rPr>
+              <w:t>Jefe de Proyecto (PM)</w:t>
+            </w:r>
+          </w:p>
+        </w:tc>
+      </w:tr>
+      <w:tr>
+        <w:trPr>
+          <w:jc w:val="center"/>
+        </w:trPr>
+        <w:tc>
+          <w:tcPr>
+            <w:tcW w:w="1337" w:type="dxa"/>
+          </w:tcPr>
+          <w:p>
+            <w:pPr>
+              <w:spacing w:line="360" w:lineRule="auto"/>
+              <w:jc w:val="both"/>
+              <w:rPr>
+                <w:rFonts w:ascii="Arial" w:hAnsi="Arial" w:cs="Arial"/>
+                <w:color w:val="000000" w:themeColor="text1"/>
+                <w:sz w:val="16"/>
+                <w:szCs w:val="16"/>
+              </w:rPr>
+            </w:pPr>
+            <w:r>
+              <w:rPr>
+                <w:rFonts w:ascii="Arial" w:hAnsi="Arial" w:cs="Arial"/>
+                <w:b/>
+                <w:color w:val="000000" w:themeColor="text1"/>
+                <w:sz w:val="16"/>
+                <w:szCs w:val="16"/>
+              </w:rPr>
+              <w:t>SPI-GOB</w:t>
+            </w:r>
+          </w:p>
+        </w:tc>
+        <w:tc>
+          <w:tcPr>
+            <w:tcW w:w="1337" w:type="dxa"/>
+          </w:tcPr>
+          <w:p>
+            <w:pPr>
+              <w:spacing w:line="360" w:lineRule="auto"/>
+              <w:jc w:val="both"/>
+              <w:rPr>
+                <w:rFonts w:ascii="Arial" w:hAnsi="Arial" w:cs="Arial"/>
+                <w:color w:val="000000" w:themeColor="text1"/>
+                <w:sz w:val="16"/>
+                <w:szCs w:val="16"/>
+              </w:rPr>
+            </w:pPr>
+            <w:r>
+              <w:rPr>
+                <w:rFonts w:ascii="Arial" w:hAnsi="Arial" w:cs="Arial"/>
+                <w:color w:val="000000" w:themeColor="text1"/>
+                <w:sz w:val="16"/>
+                <w:szCs w:val="16"/>
+              </w:rPr>
+              <w:t>Índice del Cronograma (SPI)</w:t>
+            </w:r>
+          </w:p>
+        </w:tc>
+        <w:tc>
+          <w:tcPr>
+            <w:tcW w:w="1337" w:type="dxa"/>
+          </w:tcPr>
+          <w:p>
+            <w:pPr>
+              <w:spacing w:line="360" w:lineRule="auto"/>
+              <w:jc w:val="both"/>
+              <w:rPr>
+                <w:rFonts w:ascii="Arial" w:hAnsi="Arial" w:cs="Arial"/>
+                <w:color w:val="000000" w:themeColor="text1"/>
+                <w:sz w:val="16"/>
+                <w:szCs w:val="16"/>
+              </w:rPr>
+            </w:pPr>
+            <w:r>
+              <w:rPr>
+                <w:rFonts w:ascii="Arial" w:hAnsi="Arial" w:cs="Arial"/>
+                <w:color w:val="000000" w:themeColor="text1"/>
+                <w:sz w:val="16"/>
+                <w:szCs w:val="16"/>
+              </w:rPr>
+              <w:t>Gobernanza</w:t>
+            </w:r>
+          </w:p>
+        </w:tc>
+        <w:tc>
+          <w:tcPr>
+            <w:tcW w:w="1337" w:type="dxa"/>
+          </w:tcPr>
+          <w:p>
+            <w:pPr>
+              <w:spacing w:line="360" w:lineRule="auto"/>
+              <w:jc w:val="both"/>
+              <w:rPr>
+                <w:rFonts w:ascii="Arial" w:hAnsi="Arial" w:cs="Arial"/>
+                <w:color w:val="000000" w:themeColor="text1"/>
+                <w:sz w:val="16"/>
+                <w:szCs w:val="16"/>
+              </w:rPr>
+            </w:pPr>
+            <w:r>
+              <w:rPr>
+                <w:rFonts w:ascii="Arial" w:hAnsi="Arial" w:cs="Arial"/>
+                <w:color w:val="000000" w:themeColor="text1"/>
+                <w:sz w:val="16"/>
+                <w:szCs w:val="16"/>
+              </w:rPr>
+              <w:t>Valor Ganado (EV) / Valor Planificado (PV)</w:t>
+            </w:r>
+          </w:p>
+        </w:tc>
+        <w:tc>
+          <w:tcPr>
+            <w:tcW w:w="1337" w:type="dxa"/>
+          </w:tcPr>
+          <w:p>
+            <w:pPr>
+              <w:spacing w:line="360" w:lineRule="auto"/>
+              <w:jc w:val="both"/>
+              <w:rPr>
+                <w:rFonts w:ascii="Arial" w:hAnsi="Arial" w:cs="Arial"/>
+                <w:color w:val="000000" w:themeColor="text1"/>
+                <w:sz w:val="16"/>
+                <w:szCs w:val="16"/>
+              </w:rPr>
+            </w:pPr>
+            <w:r>
+              <w:rPr>
+                <w:rFonts w:ascii="Arial" w:hAnsi="Arial" w:cs="Arial"/>
+                <w:color w:val="000000" w:themeColor="text1"/>
+                <w:sz w:val="16"/>
+                <w:szCs w:val="16"/>
+              </w:rPr>
+              <w:t>&gt;= 0.90</w:t>
+            </w:r>
+          </w:p>
+        </w:tc>
+        <w:tc>
+          <w:tcPr>
+            <w:tcW w:w="1337" w:type="dxa"/>
+          </w:tcPr>
+          <w:p>
+            <w:pPr>
+              <w:spacing w:line="360" w:lineRule="auto"/>
+              <w:jc w:val="both"/>
+              <w:rPr>
+                <w:rFonts w:ascii="Arial" w:hAnsi="Arial" w:cs="Arial"/>
+                <w:color w:val="000000" w:themeColor="text1"/>
+                <w:sz w:val="16"/>
+                <w:szCs w:val="16"/>
+              </w:rPr>
+            </w:pPr>
+            <w:r>
+              <w:rPr>
+                <w:rFonts w:ascii="Arial" w:hAnsi="Arial" w:cs="Arial"/>
+                <w:color w:val="000000" w:themeColor="text1"/>
+                <w:sz w:val="16"/>
+                <w:szCs w:val="16"/>
+              </w:rPr>
+              <w:t>Mensual</w:t>
+            </w:r>
+          </w:p>
+        </w:tc>
+        <w:tc>
+          <w:tcPr>
+            <w:tcW w:w="1337" w:type="dxa"/>
+          </w:tcPr>
+          <w:p>
+            <w:pPr>
+              <w:spacing w:line="360" w:lineRule="auto"/>
+              <w:jc w:val="both"/>
+              <w:rPr>
+                <w:rFonts w:ascii="Arial" w:hAnsi="Arial" w:cs="Arial"/>
+                <w:color w:val="000000" w:themeColor="text1"/>
+                <w:sz w:val="16"/>
+                <w:szCs w:val="16"/>
+              </w:rPr>
+            </w:pPr>
+            <w:r>
+              <w:rPr>
+                <w:rFonts w:ascii="Arial" w:hAnsi="Arial" w:cs="Arial"/>
+                <w:color w:val="000000" w:themeColor="text1"/>
+                <w:sz w:val="16"/>
+                <w:szCs w:val="16"/>
+              </w:rPr>
+              <w:t>Jefe de Proyecto (PM)</w:t>
+            </w:r>
+          </w:p>
+        </w:tc>
+      </w:tr>
+    </w:tbl>
+    <w:p>
+      <w:pPr>
+        <w:spacing w:after="240" w:line="360" w:lineRule="auto"/>
+        <w:jc w:val="both"/>
+        <w:rPr>
+          <w:rFonts w:ascii="Arial" w:hAnsi="Arial" w:cs="Arial"/>
+          <w:color w:val="000000" w:themeColor="text1"/>
+          <w:sz w:val="24"/>
+          <w:szCs w:val="24"/>
+        </w:rPr>
+      </w:pPr>
+    </w:p>
+    <w:p>
+      <w:pPr>
+        <w:pStyle w:val="Ttulo2"/>
+        <w:rPr>
+          <w:color w:val="000000" w:themeColor="text1"/>
+        </w:rPr>
+      </w:pPr>
+      <w:r>
+        <w:rPr>
+          <w:color w:val="000000" w:themeColor="text1"/>
+        </w:rPr>
+        <w:t>Descripción Operativa de Indicadores</w:t>
+      </w:r>
+    </w:p>
+    <w:p>
+      <w:pPr>
+        <w:spacing w:after="120" w:line="360" w:lineRule="auto"/>
+        <w:jc w:val="both"/>
+        <w:rPr>
+          <w:rFonts w:ascii="Arial" w:hAnsi="Arial" w:cs="Arial"/>
+          <w:color w:val="000000" w:themeColor="text1"/>
+          <w:sz w:val="24"/>
+          <w:szCs w:val="24"/>
+        </w:rPr>
+      </w:pPr>
+      <w:r>
+        <w:rPr>
+          <w:rFonts w:ascii="Arial" w:hAnsi="Arial" w:cs="Arial"/>
+          <w:b/>
+          <w:color w:val="000000" w:themeColor="text1"/>
+          <w:sz w:val="24"/>
+          <w:szCs w:val="24"/>
+        </w:rPr>
+        <w:t xml:space="preserve">- Módulo de Recaudación: </w:t>
+      </w:r>
+      <w:r>
+        <w:rPr>
+          <w:rFonts w:ascii="Arial" w:hAnsi="Arial" w:cs="Arial"/>
+          <w:color w:val="000000" w:themeColor="text1"/>
+          <w:sz w:val="24"/>
+          <w:szCs w:val="24"/>
+        </w:rPr>
+        <w:t>El Porcentaje de Morosidad (PM-REC) y los Cobros Diarios (CDR-REC) evalúan la eficiencia del cobro digital frente al control manual original. Buscan reducir la morosidad al &lt; 15% y asegurar que el 95% de los cobros programados se registren diariamente.</w:t>
+      </w:r>
+    </w:p>
+    <w:p>
+      <w:pPr>
+        <w:spacing w:after="120" w:line="360" w:lineRule="auto"/>
+        <w:jc w:val="both"/>
+        <w:rPr>
+          <w:rFonts w:ascii="Arial" w:hAnsi="Arial" w:cs="Arial"/>
+          <w:color w:val="000000" w:themeColor="text1"/>
+          <w:sz w:val="24"/>
+          <w:szCs w:val="24"/>
+        </w:rPr>
+      </w:pPr>
+      <w:r>
+        <w:rPr>
+          <w:rFonts w:ascii="Arial" w:hAnsi="Arial" w:cs="Arial"/>
+          <w:b/>
+          <w:color w:val="000000" w:themeColor="text1"/>
+          <w:sz w:val="24"/>
+          <w:szCs w:val="24"/>
+        </w:rPr>
+        <w:t xml:space="preserve">- Módulo de Desarrollo: </w:t>
+      </w:r>
+      <w:r>
+        <w:rPr>
+          <w:rFonts w:ascii="Arial" w:hAnsi="Arial" w:cs="Arial"/>
+          <w:color w:val="000000" w:themeColor="text1"/>
+          <w:sz w:val="24"/>
+          <w:szCs w:val="24"/>
+        </w:rPr>
+        <w:t xml:space="preserve">La Velocidad de Sprint (VS-DEV) mide la entrega real de </w:t>
+      </w:r>
+      <w:proofErr w:type="spellStart"/>
+      <w:r>
+        <w:rPr>
+          <w:rFonts w:ascii="Arial" w:hAnsi="Arial" w:cs="Arial"/>
+          <w:color w:val="000000" w:themeColor="text1"/>
+          <w:sz w:val="24"/>
+          <w:szCs w:val="24"/>
+        </w:rPr>
+        <w:t>Story</w:t>
+      </w:r>
+      <w:proofErr w:type="spellEnd"/>
+      <w:r>
+        <w:rPr>
+          <w:rFonts w:ascii="Arial" w:hAnsi="Arial" w:cs="Arial"/>
+          <w:color w:val="000000" w:themeColor="text1"/>
+          <w:sz w:val="24"/>
+          <w:szCs w:val="24"/>
+        </w:rPr>
+        <w:t xml:space="preserve"> </w:t>
+      </w:r>
+      <w:proofErr w:type="spellStart"/>
+      <w:r>
+        <w:rPr>
+          <w:rFonts w:ascii="Arial" w:hAnsi="Arial" w:cs="Arial"/>
+          <w:color w:val="000000" w:themeColor="text1"/>
+          <w:sz w:val="24"/>
+          <w:szCs w:val="24"/>
+        </w:rPr>
+        <w:t>Points</w:t>
+      </w:r>
+      <w:proofErr w:type="spellEnd"/>
+      <w:r>
+        <w:rPr>
+          <w:rFonts w:ascii="Arial" w:hAnsi="Arial" w:cs="Arial"/>
+          <w:color w:val="000000" w:themeColor="text1"/>
+          <w:sz w:val="24"/>
+          <w:szCs w:val="24"/>
+        </w:rPr>
+        <w:t xml:space="preserve"> frente a lo planificado. Tras la renuncia de dos desarrolladores en la Semana 12, la velocidad del equipo se reajustó de 35 a 24.5 </w:t>
+      </w:r>
+      <w:proofErr w:type="spellStart"/>
+      <w:r>
+        <w:rPr>
+          <w:rFonts w:ascii="Arial" w:hAnsi="Arial" w:cs="Arial"/>
+          <w:color w:val="000000" w:themeColor="text1"/>
+          <w:sz w:val="24"/>
+          <w:szCs w:val="24"/>
+        </w:rPr>
+        <w:t>Story</w:t>
+      </w:r>
+      <w:proofErr w:type="spellEnd"/>
+      <w:r>
+        <w:rPr>
+          <w:rFonts w:ascii="Arial" w:hAnsi="Arial" w:cs="Arial"/>
+          <w:color w:val="000000" w:themeColor="text1"/>
+          <w:sz w:val="24"/>
+          <w:szCs w:val="24"/>
+        </w:rPr>
+        <w:t xml:space="preserve"> </w:t>
+      </w:r>
+      <w:proofErr w:type="spellStart"/>
+      <w:r>
+        <w:rPr>
+          <w:rFonts w:ascii="Arial" w:hAnsi="Arial" w:cs="Arial"/>
+          <w:color w:val="000000" w:themeColor="text1"/>
+          <w:sz w:val="24"/>
+          <w:szCs w:val="24"/>
+        </w:rPr>
+        <w:t>Points</w:t>
+      </w:r>
+      <w:proofErr w:type="spellEnd"/>
+      <w:r>
+        <w:rPr>
+          <w:rFonts w:ascii="Arial" w:hAnsi="Arial" w:cs="Arial"/>
+          <w:color w:val="000000" w:themeColor="text1"/>
+          <w:sz w:val="24"/>
+          <w:szCs w:val="24"/>
+        </w:rPr>
+        <w:t xml:space="preserve"> quincenales, meta que se monitorea de cerca mediante este KPI.</w:t>
+      </w:r>
+    </w:p>
+    <w:p>
+      <w:pPr>
+        <w:spacing w:after="120" w:line="360" w:lineRule="auto"/>
+        <w:jc w:val="both"/>
+        <w:rPr>
+          <w:rFonts w:ascii="Arial" w:hAnsi="Arial" w:cs="Arial"/>
+          <w:color w:val="000000" w:themeColor="text1"/>
+          <w:sz w:val="24"/>
+          <w:szCs w:val="24"/>
+        </w:rPr>
+      </w:pPr>
+      <w:r>
+        <w:rPr>
+          <w:rFonts w:ascii="Arial" w:hAnsi="Arial" w:cs="Arial"/>
+          <w:b/>
+          <w:color w:val="000000" w:themeColor="text1"/>
+          <w:sz w:val="24"/>
+          <w:szCs w:val="24"/>
+        </w:rPr>
+        <w:t xml:space="preserve">- Módulo Control Sanitario: </w:t>
+      </w:r>
+      <w:r>
+        <w:rPr>
+          <w:rFonts w:ascii="Arial" w:hAnsi="Arial" w:cs="Arial"/>
+          <w:color w:val="000000" w:themeColor="text1"/>
+          <w:sz w:val="24"/>
+          <w:szCs w:val="24"/>
+        </w:rPr>
+        <w:t>Las Licencias Vigentes (LVV-SAN) y las Inspecciones Semanales (ISR-SAN) aseguran la adecuación a las normativas de salubridad de alimentos de los puestos comerciales, alertando de forma automática 30 días antes del vencimiento.</w:t>
+      </w:r>
+    </w:p>
+    <w:p>
+      <w:pPr>
+        <w:spacing w:after="120" w:line="360" w:lineRule="auto"/>
+        <w:jc w:val="both"/>
+        <w:rPr>
+          <w:rFonts w:ascii="Arial" w:hAnsi="Arial" w:cs="Arial"/>
+          <w:color w:val="000000" w:themeColor="text1"/>
+          <w:sz w:val="24"/>
+          <w:szCs w:val="24"/>
+        </w:rPr>
+      </w:pPr>
+      <w:r>
+        <w:rPr>
+          <w:rFonts w:ascii="Arial" w:hAnsi="Arial" w:cs="Arial"/>
+          <w:b/>
+          <w:color w:val="000000" w:themeColor="text1"/>
+          <w:sz w:val="24"/>
+          <w:szCs w:val="24"/>
+        </w:rPr>
+        <w:t xml:space="preserve">- Módulo de Gobernanza (EVM): </w:t>
+      </w:r>
+      <w:r>
+        <w:rPr>
+          <w:rFonts w:ascii="Arial" w:hAnsi="Arial" w:cs="Arial"/>
+          <w:color w:val="000000" w:themeColor="text1"/>
+          <w:sz w:val="24"/>
+          <w:szCs w:val="24"/>
+        </w:rPr>
+        <w:t>La gestión del presupuesto (70,000 Bs) se monitorea mensualmente mediante los índices de desempeño del valor ganado CPI (Costos) y SPI (Cronograma), buscando valores de CPI &gt;= 0.95 y SPI &gt;= 0.90 para detectar a tiempo desviaciones financieras y de plazos.</w:t>
+      </w:r>
+    </w:p>
+    <w:p>
+      <w:pPr>
+        <w:spacing w:after="120"/>
+      </w:pPr>
+      <w:r>
+        <w:t>.</w:t>
+      </w:r>
+    </w:p>
+    <w:p>
+      <w:pPr>
+        <w:spacing w:line="360" w:lineRule="auto"/>
         <w:jc w:val="both"/>
         <w:rPr>
           <w:rFonts w:ascii="Arial" w:hAnsi="Arial" w:cs="Arial"/>
@@ -16783,7 +19226,7 @@
   <w:abstractNum w:abstractNumId="12" w15:restartNumberingAfterBreak="0">
     <w:nsid w:val="19620A18"/>
     <w:multiLevelType w:val="multilevel"/>
-    <w:tmpl w:val="0C0A0025"/>
+    <w:tmpl w:val="7F24228C"/>
     <w:lvl w:ilvl="0">
       <w:start w:val="1"/>
       <w:numFmt w:val="decimal"/>
@@ -16793,6 +19236,9 @@
       <w:pPr>
         <w:ind w:left="432" w:hanging="432"/>
       </w:pPr>
+      <w:rPr>
+        <w:color w:val="000000" w:themeColor="text1"/>
+      </w:rPr>
     </w:lvl>
     <w:lvl w:ilvl="1">
       <w:start w:val="1"/>

</xml_diff>